<commit_message>
Tinh gian tai lieu tham chieu va sua loi ky tu hoa hoc trong docx
</commit_message>
<xml_diff>
--- a/1 SOPs/Final_SOPs_CA.docx
+++ b/1 SOPs/Final_SOPs_CA.docx
@@ -139,7 +139,7 @@
                 <w:color w:val="333333"/>
                 <w:sz w:val="19"/>
               </w:rPr>
-              <w:t>* **Tài liệu tham chiếu chuẩn cốt lõi:** 1. Luận án Tiến sĩ [Nguyễn Trần Xuân Phương 2024](file:///D:/1%20Master's%20Ana%20Chem/1%20Master's%20thesis/Carbon%20Aerogel/1%20Ref%20materials/08_Review_va_Tong_quan/TOM_TAT_NTXPhuong.md) (Quy trình delignification xơ dừa và hệ đối chứng $NaOH$-Urea). 2. Công trình [Fauziyah et al. 2020 (Ind. Eng. Chem. Res.)](file:///D:/1%20Master's%20Ana%20Chem/1%20Master's%20thesis/Carbon%20Aerogel/1%20Ref%20materials/02_Doping_va_Gel_hoa/2%20Nitrogen-Doped%20Carbon%20Aerogels%20Prepared%20by%20Direct%20Pyrolysis%20of.md) (Hệ dung môi $NH_4OH$-Urea chuyển pha Cellulose III). 3. Công trình [Wu et al. 2024 (Sensors)](file:///D:/1%20Master's%20Ana%20Chem/1%20Master's%20thesis/Carbon%20Aerogel/1%20Ref%20materials/02_Doping_va_Gel_hoa/1%20Facile%20Synthesis%20of%20Fe-Doped%20Algae%20Residue-Derived%20Carbon%20Aerogels%20for.md) (Hệ tẩm $Fe$, graphit hóa nhiệt độ cao và chế tạo màng cảm biến GCE).</w:t>
+              <w:t>* **Tài liệu tham chiếu chuẩn cốt lõi:** 1. Luận án Tiến sĩ Nguyễn Trần Xuân Phương 2024 (Tài liệu: `TOM_TAT_NTXPhuong.md` trong thư mục `08_Review_va_Tong_quan`). 2. Công trình Fauziyah et al. 2020 (Ind. Eng. Chem. Res.) (Tài liệu: `2 Nitrogen-Doped Carbon Aerogels Prepared by Direct Pyrolysis of.md` trong thư mục `02_Doping_va_Gel_hoa`). 3. Công trình Wu et al. 2024 (Sensors) (Tài liệu: `1 Facile Synthesis of Fe-Doped Algae Residue-Derived Carbon Aerogels for.md` trong thư mục `02_Doping_va_Gel_hoa`).</w:t>
             </w:r>
           </w:p>
         </w:tc>
@@ -226,7 +226,7 @@
       <w:r>
         <w:rPr>
           <w:rFonts w:ascii="Georgia" w:hAnsi="Georgia"/>
-          <w:i/>
+          <w:i w:val="0"/>
           <w:color w:val="1B365D"/>
         </w:rPr>
         <w:t>Ratio</w:t>
@@ -525,10 +525,26 @@
             <w:r>
               <w:rPr>
                 <w:rFonts w:ascii="Georgia" w:hAnsi="Georgia"/>
-                <w:i/>
+                <w:i w:val="0"/>
                 <w:color w:val="1B365D"/>
               </w:rPr>
-              <w:t>80 \pm 2^\circ\text{C}</w:t>
+              <w:t>80 ± 2</w:t>
+            </w:r>
+            <w:r>
+              <w:rPr>
+                <w:rFonts w:ascii="Georgia" w:hAnsi="Georgia"/>
+                <w:color w:val="1B365D"/>
+                <w:vertAlign w:val="superscript"/>
+              </w:rPr>
+              <w:t>\</w:t>
+            </w:r>
+            <w:r>
+              <w:rPr>
+                <w:rFonts w:ascii="Georgia" w:hAnsi="Georgia"/>
+                <w:i w:val="0"/>
+                <w:color w:val="1B365D"/>
+              </w:rPr>
+              <w:t>circC</w:t>
             </w:r>
             <w:r>
               <w:rPr>
@@ -562,10 +578,10 @@
             <w:r>
               <w:rPr>
                 <w:rFonts w:ascii="Georgia" w:hAnsi="Georgia"/>
-                <w:i/>
+                <w:i w:val="0"/>
                 <w:color w:val="1B365D"/>
               </w:rPr>
-              <w:t>4\text{ giờ}</w:t>
+              <w:t>4 giờ</w:t>
             </w:r>
             <w:r>
               <w:rPr>
@@ -599,10 +615,10 @@
             <w:r>
               <w:rPr>
                 <w:rFonts w:ascii="Georgia" w:hAnsi="Georgia"/>
-                <w:i/>
+                <w:i w:val="0"/>
                 <w:color w:val="1B365D"/>
               </w:rPr>
-              <w:t>6\text{ wt}\%\text{ }NaOH</w:t>
+              <w:t>6 wt\% NaOH</w:t>
             </w:r>
             <w:r>
               <w:rPr>
@@ -636,10 +652,10 @@
             <w:r>
               <w:rPr>
                 <w:rFonts w:ascii="Georgia" w:hAnsi="Georgia"/>
-                <w:i/>
+                <w:i w:val="0"/>
                 <w:color w:val="1B365D"/>
               </w:rPr>
-              <w:t>1\text{g bột} : 20\text{ mL dung dịch}</w:t>
+              <w:t>1g bột : 20 mL dung dịch</w:t>
             </w:r>
             <w:r>
               <w:rPr>
@@ -739,10 +755,26 @@
             <w:r>
               <w:rPr>
                 <w:rFonts w:ascii="Georgia" w:hAnsi="Georgia"/>
-                <w:i/>
+                <w:i w:val="0"/>
                 <w:color w:val="1B365D"/>
               </w:rPr>
-              <w:t>60^\circ\text{C}</w:t>
+              <w:t>60</w:t>
+            </w:r>
+            <w:r>
+              <w:rPr>
+                <w:rFonts w:ascii="Georgia" w:hAnsi="Georgia"/>
+                <w:color w:val="1B365D"/>
+                <w:vertAlign w:val="superscript"/>
+              </w:rPr>
+              <w:t>\</w:t>
+            </w:r>
+            <w:r>
+              <w:rPr>
+                <w:rFonts w:ascii="Georgia" w:hAnsi="Georgia"/>
+                <w:i w:val="0"/>
+                <w:color w:val="1B365D"/>
+              </w:rPr>
+              <w:t>circC</w:t>
             </w:r>
             <w:r>
               <w:rPr>
@@ -776,10 +808,10 @@
             <w:r>
               <w:rPr>
                 <w:rFonts w:ascii="Georgia" w:hAnsi="Georgia"/>
-                <w:i/>
+                <w:i w:val="0"/>
                 <w:color w:val="1B365D"/>
               </w:rPr>
-              <w:t>2\text{ giờ}</w:t>
+              <w:t>2 giờ</w:t>
             </w:r>
             <w:r>
               <w:rPr>
@@ -813,10 +845,34 @@
             <w:r>
               <w:rPr>
                 <w:rFonts w:ascii="Georgia" w:hAnsi="Georgia"/>
-                <w:i/>
+                <w:i w:val="0"/>
                 <w:color w:val="1B365D"/>
               </w:rPr>
-              <w:t>10\text{ wt}\%\text{ }H_2O_2</w:t>
+              <w:t>10 wt\% H</w:t>
+            </w:r>
+            <w:r>
+              <w:rPr>
+                <w:rFonts w:ascii="Georgia" w:hAnsi="Georgia"/>
+                <w:color w:val="1B365D"/>
+                <w:vertAlign w:val="subscript"/>
+              </w:rPr>
+              <w:t>2</w:t>
+            </w:r>
+            <w:r>
+              <w:rPr>
+                <w:rFonts w:ascii="Georgia" w:hAnsi="Georgia"/>
+                <w:i w:val="0"/>
+                <w:color w:val="1B365D"/>
+              </w:rPr>
+              <w:t>O</w:t>
+            </w:r>
+            <w:r>
+              <w:rPr>
+                <w:rFonts w:ascii="Georgia" w:hAnsi="Georgia"/>
+                <w:color w:val="1B365D"/>
+                <w:vertAlign w:val="subscript"/>
+              </w:rPr>
+              <w:t>2</w:t>
             </w:r>
             <w:r>
               <w:rPr>
@@ -850,10 +906,10 @@
             <w:r>
               <w:rPr>
                 <w:rFonts w:ascii="Georgia" w:hAnsi="Georgia"/>
-                <w:i/>
+                <w:i w:val="0"/>
                 <w:color w:val="1B365D"/>
               </w:rPr>
-              <w:t>1\text{g bột} : 20\text{ mL dung dịch}</w:t>
+              <w:t>1g bột : 20 mL dung dịch</w:t>
             </w:r>
             <w:r>
               <w:rPr>
@@ -864,10 +920,10 @@
             <w:r>
               <w:rPr>
                 <w:rFonts w:ascii="Georgia" w:hAnsi="Georgia"/>
-                <w:i/>
+                <w:i w:val="0"/>
                 <w:color w:val="1B365D"/>
               </w:rPr>
-              <w:t>pH \approx 11</w:t>
+              <w:t>pH ≈ 11</w:t>
             </w:r>
             <w:r>
               <w:rPr>
@@ -968,10 +1024,26 @@
             <w:r>
               <w:rPr>
                 <w:rFonts w:ascii="Georgia" w:hAnsi="Georgia"/>
-                <w:i/>
+                <w:i w:val="0"/>
                 <w:color w:val="1B365D"/>
               </w:rPr>
-              <w:t>60^\circ\text{C}</w:t>
+              <w:t>60</w:t>
+            </w:r>
+            <w:r>
+              <w:rPr>
+                <w:rFonts w:ascii="Georgia" w:hAnsi="Georgia"/>
+                <w:color w:val="1B365D"/>
+                <w:vertAlign w:val="superscript"/>
+              </w:rPr>
+              <w:t>\</w:t>
+            </w:r>
+            <w:r>
+              <w:rPr>
+                <w:rFonts w:ascii="Georgia" w:hAnsi="Georgia"/>
+                <w:i w:val="0"/>
+                <w:color w:val="1B365D"/>
+              </w:rPr>
+              <w:t>circC</w:t>
             </w:r>
             <w:r>
               <w:rPr>
@@ -1005,10 +1077,10 @@
             <w:r>
               <w:rPr>
                 <w:rFonts w:ascii="Georgia" w:hAnsi="Georgia"/>
-                <w:i/>
+                <w:i w:val="0"/>
                 <w:color w:val="1B365D"/>
               </w:rPr>
-              <w:t>2\text{ giờ}</w:t>
+              <w:t>2 giờ</w:t>
             </w:r>
             <w:r>
               <w:rPr>
@@ -1042,10 +1114,10 @@
             <w:r>
               <w:rPr>
                 <w:rFonts w:ascii="Georgia" w:hAnsi="Georgia"/>
-                <w:i/>
+                <w:i w:val="0"/>
                 <w:color w:val="1B365D"/>
               </w:rPr>
-              <w:t>2.0\text{ M }HCl</w:t>
+              <w:t>2.0 M HCl</w:t>
             </w:r>
             <w:r>
               <w:rPr>
@@ -1079,10 +1151,10 @@
             <w:r>
               <w:rPr>
                 <w:rFonts w:ascii="Georgia" w:hAnsi="Georgia"/>
-                <w:i/>
+                <w:i w:val="0"/>
                 <w:color w:val="1B365D"/>
               </w:rPr>
-              <w:t>1\text{g bột} : 20\text{ mL dung dịch}</w:t>
+              <w:t>1g bột : 20 mL dung dịch</w:t>
             </w:r>
             <w:r>
               <w:rPr>
@@ -1158,10 +1230,26 @@
             <w:r>
               <w:rPr>
                 <w:rFonts w:ascii="Georgia" w:hAnsi="Georgia"/>
-                <w:i/>
+                <w:i w:val="0"/>
                 <w:color w:val="1B365D"/>
               </w:rPr>
-              <w:t>NH_4OH</w:t>
+              <w:t>NH</w:t>
+            </w:r>
+            <w:r>
+              <w:rPr>
+                <w:rFonts w:ascii="Georgia" w:hAnsi="Georgia"/>
+                <w:color w:val="1B365D"/>
+                <w:vertAlign w:val="subscript"/>
+              </w:rPr>
+              <w:t>4</w:t>
+            </w:r>
+            <w:r>
+              <w:rPr>
+                <w:rFonts w:ascii="Georgia" w:hAnsi="Georgia"/>
+                <w:i w:val="0"/>
+                <w:color w:val="1B365D"/>
+              </w:rPr>
+              <w:t>OH</w:t>
             </w:r>
             <w:r>
               <w:rPr>
@@ -1196,10 +1284,26 @@
             <w:r>
               <w:rPr>
                 <w:rFonts w:ascii="Georgia" w:hAnsi="Georgia"/>
-                <w:i/>
+                <w:i w:val="0"/>
                 <w:color w:val="1B365D"/>
               </w:rPr>
-              <w:t>\le 10^\circ\text{C}</w:t>
+              <w:t>≤ 10</w:t>
+            </w:r>
+            <w:r>
+              <w:rPr>
+                <w:rFonts w:ascii="Georgia" w:hAnsi="Georgia"/>
+                <w:color w:val="1B365D"/>
+                <w:vertAlign w:val="superscript"/>
+              </w:rPr>
+              <w:t>\</w:t>
+            </w:r>
+            <w:r>
+              <w:rPr>
+                <w:rFonts w:ascii="Georgia" w:hAnsi="Georgia"/>
+                <w:i w:val="0"/>
+                <w:color w:val="1B365D"/>
+              </w:rPr>
+              <w:t>circC</w:t>
             </w:r>
             <w:r>
               <w:rPr>
@@ -1233,10 +1337,10 @@
             <w:r>
               <w:rPr>
                 <w:rFonts w:ascii="Georgia" w:hAnsi="Georgia"/>
-                <w:i/>
+                <w:i w:val="0"/>
                 <w:color w:val="1B365D"/>
               </w:rPr>
-              <w:t>30\text{ phút}</w:t>
+              <w:t>30 phút</w:t>
             </w:r>
             <w:r>
               <w:rPr>
@@ -1270,10 +1374,26 @@
             <w:r>
               <w:rPr>
                 <w:rFonts w:ascii="Georgia" w:hAnsi="Georgia"/>
-                <w:i/>
+                <w:i w:val="0"/>
                 <w:color w:val="1B365D"/>
               </w:rPr>
-              <w:t>25\text{ wt}\%\text{ }NH_4OH</w:t>
+              <w:t>25 wt\% NH</w:t>
+            </w:r>
+            <w:r>
+              <w:rPr>
+                <w:rFonts w:ascii="Georgia" w:hAnsi="Georgia"/>
+                <w:color w:val="1B365D"/>
+                <w:vertAlign w:val="subscript"/>
+              </w:rPr>
+              <w:t>4</w:t>
+            </w:r>
+            <w:r>
+              <w:rPr>
+                <w:rFonts w:ascii="Georgia" w:hAnsi="Georgia"/>
+                <w:i w:val="0"/>
+                <w:color w:val="1B365D"/>
+              </w:rPr>
+              <w:t>OH</w:t>
             </w:r>
             <w:r>
               <w:rPr>
@@ -1307,10 +1427,42 @@
             <w:r>
               <w:rPr>
                 <w:rFonts w:ascii="Georgia" w:hAnsi="Georgia"/>
-                <w:i/>
+                <w:i w:val="0"/>
                 <w:color w:val="1B365D"/>
               </w:rPr>
-              <w:t>1.0\text{g BCF} : 11\text{ mL NH}_4\text{OH} : 4.0\text{g Urea} : 5\text{ mL H}_2\text{O}</w:t>
+              <w:t>1.0g BCF : 11 mL NH</w:t>
+            </w:r>
+            <w:r>
+              <w:rPr>
+                <w:rFonts w:ascii="Georgia" w:hAnsi="Georgia"/>
+                <w:color w:val="1B365D"/>
+                <w:vertAlign w:val="subscript"/>
+              </w:rPr>
+              <w:t>4</w:t>
+            </w:r>
+            <w:r>
+              <w:rPr>
+                <w:rFonts w:ascii="Georgia" w:hAnsi="Georgia"/>
+                <w:i w:val="0"/>
+                <w:color w:val="1B365D"/>
+              </w:rPr>
+              <w:t>OH : 4.0g Urea : 5 mL H</w:t>
+            </w:r>
+            <w:r>
+              <w:rPr>
+                <w:rFonts w:ascii="Georgia" w:hAnsi="Georgia"/>
+                <w:color w:val="1B365D"/>
+                <w:vertAlign w:val="subscript"/>
+              </w:rPr>
+              <w:t>2</w:t>
+            </w:r>
+            <w:r>
+              <w:rPr>
+                <w:rFonts w:ascii="Georgia" w:hAnsi="Georgia"/>
+                <w:i w:val="0"/>
+                <w:color w:val="1B365D"/>
+              </w:rPr>
+              <w:t>O</w:t>
             </w:r>
             <w:r>
               <w:rPr>
@@ -1386,7 +1538,7 @@
             <w:r>
               <w:rPr>
                 <w:rFonts w:ascii="Georgia" w:hAnsi="Georgia"/>
-                <w:i/>
+                <w:i w:val="0"/>
                 <w:color w:val="1B365D"/>
               </w:rPr>
               <w:t>NaOH</w:t>
@@ -1424,10 +1576,42 @@
             <w:r>
               <w:rPr>
                 <w:rFonts w:ascii="Georgia" w:hAnsi="Georgia"/>
-                <w:i/>
+                <w:i w:val="0"/>
                 <w:color w:val="1B365D"/>
               </w:rPr>
-              <w:t>-10^\circ\text{C} \text{ đến } -12^\circ\text{C}</w:t>
+              <w:t>-10</w:t>
+            </w:r>
+            <w:r>
+              <w:rPr>
+                <w:rFonts w:ascii="Georgia" w:hAnsi="Georgia"/>
+                <w:color w:val="1B365D"/>
+                <w:vertAlign w:val="superscript"/>
+              </w:rPr>
+              <w:t>\</w:t>
+            </w:r>
+            <w:r>
+              <w:rPr>
+                <w:rFonts w:ascii="Georgia" w:hAnsi="Georgia"/>
+                <w:i w:val="0"/>
+                <w:color w:val="1B365D"/>
+              </w:rPr>
+              <w:t>circC  đến  -12</w:t>
+            </w:r>
+            <w:r>
+              <w:rPr>
+                <w:rFonts w:ascii="Georgia" w:hAnsi="Georgia"/>
+                <w:color w:val="1B365D"/>
+                <w:vertAlign w:val="superscript"/>
+              </w:rPr>
+              <w:t>\</w:t>
+            </w:r>
+            <w:r>
+              <w:rPr>
+                <w:rFonts w:ascii="Georgia" w:hAnsi="Georgia"/>
+                <w:i w:val="0"/>
+                <w:color w:val="1B365D"/>
+              </w:rPr>
+              <w:t>circC</w:t>
             </w:r>
             <w:r>
               <w:rPr>
@@ -1461,10 +1645,10 @@
             <w:r>
               <w:rPr>
                 <w:rFonts w:ascii="Georgia" w:hAnsi="Georgia"/>
-                <w:i/>
+                <w:i w:val="0"/>
                 <w:color w:val="1B365D"/>
               </w:rPr>
-              <w:t>5\text{ phút}</w:t>
+              <w:t>5 phút</w:t>
             </w:r>
             <w:r>
               <w:rPr>
@@ -1498,7 +1682,7 @@
             <w:r>
               <w:rPr>
                 <w:rFonts w:ascii="Georgia" w:hAnsi="Georgia"/>
-                <w:i/>
+                <w:i w:val="0"/>
                 <w:color w:val="1B365D"/>
               </w:rPr>
               <w:t>7\%/12\%/81\%</w:t>
@@ -1535,10 +1719,26 @@
             <w:r>
               <w:rPr>
                 <w:rFonts w:ascii="Georgia" w:hAnsi="Georgia"/>
-                <w:i/>
+                <w:i w:val="0"/>
                 <w:color w:val="1B365D"/>
               </w:rPr>
-              <w:t>7\text{ wt}\% NaOH : 12\text{ wt}\% Urea : 81\text{ wt}\% H_2O</w:t>
+              <w:t>7 wt\% NaOH : 12 wt\% Urea : 81 wt\% H</w:t>
+            </w:r>
+            <w:r>
+              <w:rPr>
+                <w:rFonts w:ascii="Georgia" w:hAnsi="Georgia"/>
+                <w:color w:val="1B365D"/>
+                <w:vertAlign w:val="subscript"/>
+              </w:rPr>
+              <w:t>2</w:t>
+            </w:r>
+            <w:r>
+              <w:rPr>
+                <w:rFonts w:ascii="Georgia" w:hAnsi="Georgia"/>
+                <w:i w:val="0"/>
+                <w:color w:val="1B365D"/>
+              </w:rPr>
+              <w:t>O</w:t>
             </w:r>
             <w:r>
               <w:rPr>
@@ -1614,10 +1814,26 @@
             <w:r>
               <w:rPr>
                 <w:rFonts w:ascii="Georgia" w:hAnsi="Georgia"/>
-                <w:i/>
+                <w:i w:val="0"/>
                 <w:color w:val="1B365D"/>
               </w:rPr>
-              <w:t>NH_4OH</w:t>
+              <w:t>NH</w:t>
+            </w:r>
+            <w:r>
+              <w:rPr>
+                <w:rFonts w:ascii="Georgia" w:hAnsi="Georgia"/>
+                <w:color w:val="1B365D"/>
+                <w:vertAlign w:val="subscript"/>
+              </w:rPr>
+              <w:t>4</w:t>
+            </w:r>
+            <w:r>
+              <w:rPr>
+                <w:rFonts w:ascii="Georgia" w:hAnsi="Georgia"/>
+                <w:i w:val="0"/>
+                <w:color w:val="1B365D"/>
+              </w:rPr>
+              <w:t>OH</w:t>
             </w:r>
             <w:r>
               <w:rPr>
@@ -1652,10 +1868,26 @@
             <w:r>
               <w:rPr>
                 <w:rFonts w:ascii="Georgia" w:hAnsi="Georgia"/>
-                <w:i/>
+                <w:i w:val="0"/>
                 <w:color w:val="1B365D"/>
               </w:rPr>
-              <w:t>80^\circ\text{C}</w:t>
+              <w:t>80</w:t>
+            </w:r>
+            <w:r>
+              <w:rPr>
+                <w:rFonts w:ascii="Georgia" w:hAnsi="Georgia"/>
+                <w:color w:val="1B365D"/>
+                <w:vertAlign w:val="superscript"/>
+              </w:rPr>
+              <w:t>\</w:t>
+            </w:r>
+            <w:r>
+              <w:rPr>
+                <w:rFonts w:ascii="Georgia" w:hAnsi="Georgia"/>
+                <w:i w:val="0"/>
+                <w:color w:val="1B365D"/>
+              </w:rPr>
+              <w:t>circC</w:t>
             </w:r>
             <w:r>
               <w:rPr>
@@ -1689,10 +1921,10 @@
             <w:r>
               <w:rPr>
                 <w:rFonts w:ascii="Georgia" w:hAnsi="Georgia"/>
-                <w:i/>
+                <w:i w:val="0"/>
                 <w:color w:val="1B365D"/>
               </w:rPr>
-              <w:t>2\text{ giờ}</w:t>
+              <w:t>2 giờ</w:t>
             </w:r>
             <w:r>
               <w:rPr>
@@ -1818,7 +2050,7 @@
             <w:r>
               <w:rPr>
                 <w:rFonts w:ascii="Georgia" w:hAnsi="Georgia"/>
-                <w:i/>
+                <w:i w:val="0"/>
                 <w:color w:val="1B365D"/>
               </w:rPr>
               <w:t>NaOH</w:t>
@@ -1856,10 +2088,26 @@
             <w:r>
               <w:rPr>
                 <w:rFonts w:ascii="Georgia" w:hAnsi="Georgia"/>
-                <w:i/>
+                <w:i w:val="0"/>
                 <w:color w:val="1B365D"/>
               </w:rPr>
-              <w:t>50 - 55^\circ\text{C}</w:t>
+              <w:t>50 - 55</w:t>
+            </w:r>
+            <w:r>
+              <w:rPr>
+                <w:rFonts w:ascii="Georgia" w:hAnsi="Georgia"/>
+                <w:color w:val="1B365D"/>
+                <w:vertAlign w:val="superscript"/>
+              </w:rPr>
+              <w:t>\</w:t>
+            </w:r>
+            <w:r>
+              <w:rPr>
+                <w:rFonts w:ascii="Georgia" w:hAnsi="Georgia"/>
+                <w:i w:val="0"/>
+                <w:color w:val="1B365D"/>
+              </w:rPr>
+              <w:t>circC</w:t>
             </w:r>
             <w:r>
               <w:rPr>
@@ -1893,10 +2141,10 @@
             <w:r>
               <w:rPr>
                 <w:rFonts w:ascii="Georgia" w:hAnsi="Georgia"/>
-                <w:i/>
+                <w:i w:val="0"/>
                 <w:color w:val="1B365D"/>
               </w:rPr>
-              <w:t>1.5\text{ giờ}</w:t>
+              <w:t>1.5 giờ</w:t>
             </w:r>
             <w:r>
               <w:rPr>
@@ -2046,10 +2294,26 @@
             <w:r>
               <w:rPr>
                 <w:rFonts w:ascii="Georgia" w:hAnsi="Georgia"/>
-                <w:i/>
+                <w:i w:val="0"/>
                 <w:color w:val="1B365D"/>
               </w:rPr>
-              <w:t>0 - 5^\circ\text{C}</w:t>
+              <w:t>0 - 5</w:t>
+            </w:r>
+            <w:r>
+              <w:rPr>
+                <w:rFonts w:ascii="Georgia" w:hAnsi="Georgia"/>
+                <w:color w:val="1B365D"/>
+                <w:vertAlign w:val="superscript"/>
+              </w:rPr>
+              <w:t>\</w:t>
+            </w:r>
+            <w:r>
+              <w:rPr>
+                <w:rFonts w:ascii="Georgia" w:hAnsi="Georgia"/>
+                <w:i w:val="0"/>
+                <w:color w:val="1B365D"/>
+              </w:rPr>
+              <w:t>circC</w:t>
             </w:r>
             <w:r>
               <w:rPr>
@@ -2083,10 +2347,10 @@
             <w:r>
               <w:rPr>
                 <w:rFonts w:ascii="Georgia" w:hAnsi="Georgia"/>
-                <w:i/>
+                <w:i w:val="0"/>
                 <w:color w:val="1B365D"/>
               </w:rPr>
-              <w:t>24\text{ giờ}</w:t>
+              <w:t>24 giờ</w:t>
             </w:r>
             <w:r>
               <w:rPr>
@@ -2120,10 +2384,10 @@
             <w:r>
               <w:rPr>
                 <w:rFonts w:ascii="Georgia" w:hAnsi="Georgia"/>
-                <w:i/>
+                <w:i w:val="0"/>
                 <w:color w:val="1B365D"/>
               </w:rPr>
-              <w:t>98\text{ vol}\%\text{ Ethanol}</w:t>
+              <w:t>98 vol\% Ethanol</w:t>
             </w:r>
             <w:r>
               <w:rPr>
@@ -2157,10 +2421,10 @@
             <w:r>
               <w:rPr>
                 <w:rFonts w:ascii="Georgia" w:hAnsi="Georgia"/>
-                <w:i/>
+                <w:i w:val="0"/>
                 <w:color w:val="1B365D"/>
               </w:rPr>
-              <w:t>15\text{ mL Ethanol} : 1\text{g cellulose}</w:t>
+              <w:t>15 mL Ethanol : 1g cellulose</w:t>
             </w:r>
             <w:r>
               <w:rPr>
@@ -2237,7 +2501,7 @@
             <w:r>
               <w:rPr>
                 <w:rFonts w:ascii="Georgia" w:hAnsi="Georgia"/>
-                <w:i/>
+                <w:i w:val="0"/>
                 <w:color w:val="1B365D"/>
               </w:rPr>
               <w:t>Fe</w:t>
@@ -2275,10 +2539,26 @@
             <w:r>
               <w:rPr>
                 <w:rFonts w:ascii="Georgia" w:hAnsi="Georgia"/>
-                <w:i/>
+                <w:i w:val="0"/>
                 <w:color w:val="1B365D"/>
               </w:rPr>
-              <w:t>0 - 5^\circ\text{C}</w:t>
+              <w:t>0 - 5</w:t>
+            </w:r>
+            <w:r>
+              <w:rPr>
+                <w:rFonts w:ascii="Georgia" w:hAnsi="Georgia"/>
+                <w:color w:val="1B365D"/>
+                <w:vertAlign w:val="superscript"/>
+              </w:rPr>
+              <w:t>\</w:t>
+            </w:r>
+            <w:r>
+              <w:rPr>
+                <w:rFonts w:ascii="Georgia" w:hAnsi="Georgia"/>
+                <w:i w:val="0"/>
+                <w:color w:val="1B365D"/>
+              </w:rPr>
+              <w:t>circC</w:t>
             </w:r>
             <w:r>
               <w:rPr>
@@ -2312,10 +2592,10 @@
             <w:r>
               <w:rPr>
                 <w:rFonts w:ascii="Georgia" w:hAnsi="Georgia"/>
-                <w:i/>
+                <w:i w:val="0"/>
                 <w:color w:val="1B365D"/>
               </w:rPr>
-              <w:t>24\text{ giờ}</w:t>
+              <w:t>24 giờ</w:t>
             </w:r>
             <w:r>
               <w:rPr>
@@ -2349,10 +2629,10 @@
             <w:r>
               <w:rPr>
                 <w:rFonts w:ascii="Georgia" w:hAnsi="Georgia"/>
-                <w:i/>
+                <w:i w:val="0"/>
                 <w:color w:val="1B365D"/>
               </w:rPr>
-              <w:t>10\text{ wt}\%\text{ }Fe</w:t>
+              <w:t>10 wt\% Fe</w:t>
             </w:r>
             <w:r>
               <w:rPr>
@@ -2386,10 +2666,42 @@
             <w:r>
               <w:rPr>
                 <w:rFonts w:ascii="Georgia" w:hAnsi="Georgia"/>
-                <w:i/>
+                <w:i w:val="0"/>
                 <w:color w:val="1B365D"/>
               </w:rPr>
-              <w:t>1.0\text{g gel} : 0.484\text{g FeCl}_3\cdot6\text{H}_2\text{O} : 1.0\text{g Urea} : 30\text{ mL DI}</w:t>
+              <w:t>1.0g gel : 0.484g FeCl</w:t>
+            </w:r>
+            <w:r>
+              <w:rPr>
+                <w:rFonts w:ascii="Georgia" w:hAnsi="Georgia"/>
+                <w:color w:val="1B365D"/>
+                <w:vertAlign w:val="subscript"/>
+              </w:rPr>
+              <w:t>3</w:t>
+            </w:r>
+            <w:r>
+              <w:rPr>
+                <w:rFonts w:ascii="Georgia" w:hAnsi="Georgia"/>
+                <w:i w:val="0"/>
+                <w:color w:val="1B365D"/>
+              </w:rPr>
+              <w:t>·6H</w:t>
+            </w:r>
+            <w:r>
+              <w:rPr>
+                <w:rFonts w:ascii="Georgia" w:hAnsi="Georgia"/>
+                <w:color w:val="1B365D"/>
+                <w:vertAlign w:val="subscript"/>
+              </w:rPr>
+              <w:t>2</w:t>
+            </w:r>
+            <w:r>
+              <w:rPr>
+                <w:rFonts w:ascii="Georgia" w:hAnsi="Georgia"/>
+                <w:i w:val="0"/>
+                <w:color w:val="1B365D"/>
+              </w:rPr>
+              <w:t>O : 1.0g Urea : 30 mL DI</w:t>
             </w:r>
             <w:r>
               <w:rPr>
@@ -2489,10 +2801,26 @@
             <w:r>
               <w:rPr>
                 <w:rFonts w:ascii="Georgia" w:hAnsi="Georgia"/>
-                <w:i/>
+                <w:i w:val="0"/>
                 <w:color w:val="1B365D"/>
               </w:rPr>
-              <w:t>-80^\circ\text{C}</w:t>
+              <w:t>-80</w:t>
+            </w:r>
+            <w:r>
+              <w:rPr>
+                <w:rFonts w:ascii="Georgia" w:hAnsi="Georgia"/>
+                <w:color w:val="1B365D"/>
+                <w:vertAlign w:val="superscript"/>
+              </w:rPr>
+              <w:t>\</w:t>
+            </w:r>
+            <w:r>
+              <w:rPr>
+                <w:rFonts w:ascii="Georgia" w:hAnsi="Georgia"/>
+                <w:i w:val="0"/>
+                <w:color w:val="1B365D"/>
+              </w:rPr>
+              <w:t>circC</w:t>
             </w:r>
             <w:r>
               <w:rPr>
@@ -2503,10 +2831,26 @@
             <w:r>
               <w:rPr>
                 <w:rFonts w:ascii="Georgia" w:hAnsi="Georgia"/>
-                <w:i/>
+                <w:i w:val="0"/>
                 <w:color w:val="1B365D"/>
               </w:rPr>
-              <w:t>\le -50^\circ\text{C}</w:t>
+              <w:t>≤ -50</w:t>
+            </w:r>
+            <w:r>
+              <w:rPr>
+                <w:rFonts w:ascii="Georgia" w:hAnsi="Georgia"/>
+                <w:color w:val="1B365D"/>
+                <w:vertAlign w:val="superscript"/>
+              </w:rPr>
+              <w:t>\</w:t>
+            </w:r>
+            <w:r>
+              <w:rPr>
+                <w:rFonts w:ascii="Georgia" w:hAnsi="Georgia"/>
+                <w:i w:val="0"/>
+                <w:color w:val="1B365D"/>
+              </w:rPr>
+              <w:t>circC</w:t>
             </w:r>
             <w:r>
               <w:rPr>
@@ -2541,10 +2885,10 @@
             <w:r>
               <w:rPr>
                 <w:rFonts w:ascii="Georgia" w:hAnsi="Georgia"/>
-                <w:i/>
+                <w:i w:val="0"/>
                 <w:color w:val="1B365D"/>
               </w:rPr>
-              <w:t>36 - 48\text{ giờ}</w:t>
+              <w:t>36 - 48 giờ</w:t>
             </w:r>
             <w:r>
               <w:rPr>
@@ -2578,10 +2922,10 @@
             <w:r>
               <w:rPr>
                 <w:rFonts w:ascii="Georgia" w:hAnsi="Georgia"/>
-                <w:i/>
+                <w:i w:val="0"/>
                 <w:color w:val="1B365D"/>
               </w:rPr>
-              <w:t>P &lt; 20\text{ Pa}</w:t>
+              <w:t>P &lt; 20 Pa</w:t>
             </w:r>
             <w:r>
               <w:rPr>
@@ -2720,10 +3064,26 @@
             <w:r>
               <w:rPr>
                 <w:rFonts w:ascii="Georgia" w:hAnsi="Georgia"/>
-                <w:i/>
+                <w:i w:val="0"/>
                 <w:color w:val="1B365D"/>
               </w:rPr>
-              <w:t>700^\circ\text{C}</w:t>
+              <w:t>700</w:t>
+            </w:r>
+            <w:r>
+              <w:rPr>
+                <w:rFonts w:ascii="Georgia" w:hAnsi="Georgia"/>
+                <w:color w:val="1B365D"/>
+                <w:vertAlign w:val="superscript"/>
+              </w:rPr>
+              <w:t>\</w:t>
+            </w:r>
+            <w:r>
+              <w:rPr>
+                <w:rFonts w:ascii="Georgia" w:hAnsi="Georgia"/>
+                <w:i w:val="0"/>
+                <w:color w:val="1B365D"/>
+              </w:rPr>
+              <w:t>circC</w:t>
             </w:r>
             <w:r>
               <w:rPr>
@@ -2757,10 +3117,10 @@
             <w:r>
               <w:rPr>
                 <w:rFonts w:ascii="Georgia" w:hAnsi="Georgia"/>
-                <w:i/>
+                <w:i w:val="0"/>
                 <w:color w:val="1B365D"/>
               </w:rPr>
-              <w:t>2\text{ giờ}</w:t>
+              <w:t>2 giờ</w:t>
             </w:r>
             <w:r>
               <w:rPr>
@@ -2794,10 +3154,26 @@
             <w:r>
               <w:rPr>
                 <w:rFonts w:ascii="Georgia" w:hAnsi="Georgia"/>
-                <w:i/>
+                <w:i w:val="0"/>
                 <w:color w:val="1B365D"/>
               </w:rPr>
-              <w:t>5^\circ\text{C/phút}</w:t>
+              <w:t>5</w:t>
+            </w:r>
+            <w:r>
+              <w:rPr>
+                <w:rFonts w:ascii="Georgia" w:hAnsi="Georgia"/>
+                <w:color w:val="1B365D"/>
+                <w:vertAlign w:val="superscript"/>
+              </w:rPr>
+              <w:t>\</w:t>
+            </w:r>
+            <w:r>
+              <w:rPr>
+                <w:rFonts w:ascii="Georgia" w:hAnsi="Georgia"/>
+                <w:i w:val="0"/>
+                <w:color w:val="1B365D"/>
+              </w:rPr>
+              <w:t>circC/phút</w:t>
             </w:r>
             <w:r>
               <w:rPr>
@@ -2832,10 +3208,26 @@
             <w:r>
               <w:rPr>
                 <w:rFonts w:ascii="Georgia" w:hAnsi="Georgia"/>
-                <w:i/>
+                <w:i w:val="0"/>
                 <w:color w:val="1B365D"/>
               </w:rPr>
-              <w:t>N_2 = 100\text{ mL/phút}</w:t>
+              <w:t>N</w:t>
+            </w:r>
+            <w:r>
+              <w:rPr>
+                <w:rFonts w:ascii="Georgia" w:hAnsi="Georgia"/>
+                <w:color w:val="1B365D"/>
+                <w:vertAlign w:val="subscript"/>
+              </w:rPr>
+              <w:t>2</w:t>
+            </w:r>
+            <w:r>
+              <w:rPr>
+                <w:rFonts w:ascii="Georgia" w:hAnsi="Georgia"/>
+                <w:i w:val="0"/>
+                <w:color w:val="1B365D"/>
+              </w:rPr>
+              <w:t xml:space="preserve"> = 100 mL/phút</w:t>
             </w:r>
             <w:r>
               <w:rPr>
@@ -2911,7 +3303,7 @@
             <w:r>
               <w:rPr>
                 <w:rFonts w:ascii="Georgia" w:hAnsi="Georgia"/>
-                <w:i/>
+                <w:i w:val="0"/>
                 <w:color w:val="1B365D"/>
               </w:rPr>
               <w:t>Fe/N</w:t>
@@ -2949,10 +3341,26 @@
             <w:r>
               <w:rPr>
                 <w:rFonts w:ascii="Georgia" w:hAnsi="Georgia"/>
-                <w:i/>
+                <w:i w:val="0"/>
                 <w:color w:val="1B365D"/>
               </w:rPr>
-              <w:t>800^\circ\text{C}</w:t>
+              <w:t>800</w:t>
+            </w:r>
+            <w:r>
+              <w:rPr>
+                <w:rFonts w:ascii="Georgia" w:hAnsi="Georgia"/>
+                <w:color w:val="1B365D"/>
+                <w:vertAlign w:val="superscript"/>
+              </w:rPr>
+              <w:t>\</w:t>
+            </w:r>
+            <w:r>
+              <w:rPr>
+                <w:rFonts w:ascii="Georgia" w:hAnsi="Georgia"/>
+                <w:i w:val="0"/>
+                <w:color w:val="1B365D"/>
+              </w:rPr>
+              <w:t>circC</w:t>
             </w:r>
             <w:r>
               <w:rPr>
@@ -2986,10 +3394,10 @@
             <w:r>
               <w:rPr>
                 <w:rFonts w:ascii="Georgia" w:hAnsi="Georgia"/>
-                <w:i/>
+                <w:i w:val="0"/>
                 <w:color w:val="1B365D"/>
               </w:rPr>
-              <w:t>2\text{ giờ}</w:t>
+              <w:t>2 giờ</w:t>
             </w:r>
             <w:r>
               <w:rPr>
@@ -3023,10 +3431,26 @@
             <w:r>
               <w:rPr>
                 <w:rFonts w:ascii="Georgia" w:hAnsi="Georgia"/>
-                <w:i/>
+                <w:i w:val="0"/>
                 <w:color w:val="1B365D"/>
               </w:rPr>
-              <w:t>5^\circ\text{C/phút}</w:t>
+              <w:t>5</w:t>
+            </w:r>
+            <w:r>
+              <w:rPr>
+                <w:rFonts w:ascii="Georgia" w:hAnsi="Georgia"/>
+                <w:color w:val="1B365D"/>
+                <w:vertAlign w:val="superscript"/>
+              </w:rPr>
+              <w:t>\</w:t>
+            </w:r>
+            <w:r>
+              <w:rPr>
+                <w:rFonts w:ascii="Georgia" w:hAnsi="Georgia"/>
+                <w:i w:val="0"/>
+                <w:color w:val="1B365D"/>
+              </w:rPr>
+              <w:t>circC/phút</w:t>
             </w:r>
             <w:r>
               <w:rPr>
@@ -3061,10 +3485,26 @@
             <w:r>
               <w:rPr>
                 <w:rFonts w:ascii="Georgia" w:hAnsi="Georgia"/>
-                <w:i/>
+                <w:i w:val="0"/>
                 <w:color w:val="1B365D"/>
               </w:rPr>
-              <w:t>N_2 = 100\text{ mL/phút}</w:t>
+              <w:t>N</w:t>
+            </w:r>
+            <w:r>
+              <w:rPr>
+                <w:rFonts w:ascii="Georgia" w:hAnsi="Georgia"/>
+                <w:color w:val="1B365D"/>
+                <w:vertAlign w:val="subscript"/>
+              </w:rPr>
+              <w:t>2</w:t>
+            </w:r>
+            <w:r>
+              <w:rPr>
+                <w:rFonts w:ascii="Georgia" w:hAnsi="Georgia"/>
+                <w:i w:val="0"/>
+                <w:color w:val="1B365D"/>
+              </w:rPr>
+              <w:t xml:space="preserve"> = 100 mL/phút</w:t>
             </w:r>
             <w:r>
               <w:rPr>
@@ -3164,10 +3604,26 @@
             <w:r>
               <w:rPr>
                 <w:rFonts w:ascii="Georgia" w:hAnsi="Georgia"/>
-                <w:i/>
+                <w:i w:val="0"/>
                 <w:color w:val="1B365D"/>
               </w:rPr>
-              <w:t>80 \pm 2^\circ\text{C}</w:t>
+              <w:t>80 ± 2</w:t>
+            </w:r>
+            <w:r>
+              <w:rPr>
+                <w:rFonts w:ascii="Georgia" w:hAnsi="Georgia"/>
+                <w:color w:val="1B365D"/>
+                <w:vertAlign w:val="superscript"/>
+              </w:rPr>
+              <w:t>\</w:t>
+            </w:r>
+            <w:r>
+              <w:rPr>
+                <w:rFonts w:ascii="Georgia" w:hAnsi="Georgia"/>
+                <w:i w:val="0"/>
+                <w:color w:val="1B365D"/>
+              </w:rPr>
+              <w:t>circC</w:t>
             </w:r>
             <w:r>
               <w:rPr>
@@ -3201,10 +3657,10 @@
             <w:r>
               <w:rPr>
                 <w:rFonts w:ascii="Georgia" w:hAnsi="Georgia"/>
-                <w:i/>
+                <w:i w:val="0"/>
                 <w:color w:val="1B365D"/>
               </w:rPr>
-              <w:t>8\text{ giờ}</w:t>
+              <w:t>8 giờ</w:t>
             </w:r>
             <w:r>
               <w:rPr>
@@ -3238,10 +3694,10 @@
             <w:r>
               <w:rPr>
                 <w:rFonts w:ascii="Georgia" w:hAnsi="Georgia"/>
-                <w:i/>
+                <w:i w:val="0"/>
                 <w:color w:val="1B365D"/>
               </w:rPr>
-              <w:t>0.5\text{ M }HCl</w:t>
+              <w:t>0.5 M HCl</w:t>
             </w:r>
             <w:r>
               <w:rPr>
@@ -3275,10 +3731,10 @@
             <w:r>
               <w:rPr>
                 <w:rFonts w:ascii="Georgia" w:hAnsi="Georgia"/>
-                <w:i/>
+                <w:i w:val="0"/>
                 <w:color w:val="1B365D"/>
               </w:rPr>
-              <w:t>1\text{g bột} : 100\text{ mL dung dịch }HCl</w:t>
+              <w:t>1g bột : 100 mL dung dịch HCl</w:t>
             </w:r>
             <w:r>
               <w:rPr>
@@ -3379,10 +3835,26 @@
             <w:r>
               <w:rPr>
                 <w:rFonts w:ascii="Georgia" w:hAnsi="Georgia"/>
-                <w:i/>
+                <w:i w:val="0"/>
                 <w:color w:val="1B365D"/>
               </w:rPr>
-              <w:t>800^\circ\text{C}</w:t>
+              <w:t>800</w:t>
+            </w:r>
+            <w:r>
+              <w:rPr>
+                <w:rFonts w:ascii="Georgia" w:hAnsi="Georgia"/>
+                <w:color w:val="1B365D"/>
+                <w:vertAlign w:val="superscript"/>
+              </w:rPr>
+              <w:t>\</w:t>
+            </w:r>
+            <w:r>
+              <w:rPr>
+                <w:rFonts w:ascii="Georgia" w:hAnsi="Georgia"/>
+                <w:i w:val="0"/>
+                <w:color w:val="1B365D"/>
+              </w:rPr>
+              <w:t>circC</w:t>
             </w:r>
             <w:r>
               <w:rPr>
@@ -3416,10 +3888,10 @@
             <w:r>
               <w:rPr>
                 <w:rFonts w:ascii="Georgia" w:hAnsi="Georgia"/>
-                <w:i/>
+                <w:i w:val="0"/>
                 <w:color w:val="1B365D"/>
               </w:rPr>
-              <w:t>1\text{ giờ}</w:t>
+              <w:t>1 giờ</w:t>
             </w:r>
             <w:r>
               <w:rPr>
@@ -3453,10 +3925,26 @@
             <w:r>
               <w:rPr>
                 <w:rFonts w:ascii="Georgia" w:hAnsi="Georgia"/>
-                <w:i/>
+                <w:i w:val="0"/>
                 <w:color w:val="1B365D"/>
               </w:rPr>
-              <w:t>5^\circ\text{C/phút}</w:t>
+              <w:t>5</w:t>
+            </w:r>
+            <w:r>
+              <w:rPr>
+                <w:rFonts w:ascii="Georgia" w:hAnsi="Georgia"/>
+                <w:color w:val="1B365D"/>
+                <w:vertAlign w:val="superscript"/>
+              </w:rPr>
+              <w:t>\</w:t>
+            </w:r>
+            <w:r>
+              <w:rPr>
+                <w:rFonts w:ascii="Georgia" w:hAnsi="Georgia"/>
+                <w:i w:val="0"/>
+                <w:color w:val="1B365D"/>
+              </w:rPr>
+              <w:t>circC/phút</w:t>
             </w:r>
             <w:r>
               <w:rPr>
@@ -3491,10 +3979,26 @@
             <w:r>
               <w:rPr>
                 <w:rFonts w:ascii="Georgia" w:hAnsi="Georgia"/>
-                <w:i/>
+                <w:i w:val="0"/>
                 <w:color w:val="1B365D"/>
               </w:rPr>
-              <w:t>N_2 = 100\text{ mL/phút}</w:t>
+              <w:t>N</w:t>
+            </w:r>
+            <w:r>
+              <w:rPr>
+                <w:rFonts w:ascii="Georgia" w:hAnsi="Georgia"/>
+                <w:color w:val="1B365D"/>
+                <w:vertAlign w:val="subscript"/>
+              </w:rPr>
+              <w:t>2</w:t>
+            </w:r>
+            <w:r>
+              <w:rPr>
+                <w:rFonts w:ascii="Georgia" w:hAnsi="Georgia"/>
+                <w:i w:val="0"/>
+                <w:color w:val="1B365D"/>
+              </w:rPr>
+              <w:t xml:space="preserve"> = 100 mL/phút</w:t>
             </w:r>
             <w:r>
               <w:rPr>
@@ -3599,10 +4103,10 @@
       <w:r>
         <w:rPr>
           <w:rFonts w:ascii="Georgia" w:hAnsi="Georgia"/>
-          <w:i/>
+          <w:i w:val="0"/>
           <w:color w:val="1B365D"/>
         </w:rPr>
-        <w:t>50\text{ g}</w:t>
+        <w:t>50 g</w:t>
       </w:r>
       <w:r>
         <w:rPr>
@@ -3613,10 +4117,10 @@
       <w:r>
         <w:rPr>
           <w:rFonts w:ascii="Georgia" w:hAnsi="Georgia"/>
-          <w:i/>
+          <w:i w:val="0"/>
           <w:color w:val="1B365D"/>
         </w:rPr>
-        <w:t>&lt;125\text{ }\mu\text{m}</w:t>
+        <w:t>&lt;125 \mum</w:t>
       </w:r>
       <w:r>
         <w:rPr>
@@ -3627,10 +4131,10 @@
       <w:r>
         <w:rPr>
           <w:rFonts w:ascii="Georgia" w:hAnsi="Georgia"/>
-          <w:i/>
+          <w:i w:val="0"/>
           <w:color w:val="1B365D"/>
         </w:rPr>
-        <w:t>1000\text{ mL}</w:t>
+        <w:t>1000 mL</w:t>
       </w:r>
       <w:r>
         <w:rPr>
@@ -3641,10 +4145,26 @@
       <w:r>
         <w:rPr>
           <w:rFonts w:ascii="Georgia" w:hAnsi="Georgia"/>
-          <w:i/>
+          <w:i w:val="0"/>
           <w:color w:val="1B365D"/>
         </w:rPr>
-        <w:t>80^\circ\text{C}</w:t>
+        <w:t>80</w:t>
+      </w:r>
+      <w:r>
+        <w:rPr>
+          <w:rFonts w:ascii="Georgia" w:hAnsi="Georgia"/>
+          <w:color w:val="1B365D"/>
+          <w:vertAlign w:val="superscript"/>
+        </w:rPr>
+        <w:t>\</w:t>
+      </w:r>
+      <w:r>
+        <w:rPr>
+          <w:rFonts w:ascii="Georgia" w:hAnsi="Georgia"/>
+          <w:i w:val="0"/>
+          <w:color w:val="1B365D"/>
+        </w:rPr>
+        <w:t>circC</w:t>
       </w:r>
       <w:r>
         <w:rPr>
@@ -3655,10 +4175,10 @@
       <w:r>
         <w:rPr>
           <w:rFonts w:ascii="Georgia" w:hAnsi="Georgia"/>
-          <w:i/>
+          <w:i w:val="0"/>
           <w:color w:val="1B365D"/>
         </w:rPr>
-        <w:t>4\text{ giờ}</w:t>
+        <w:t>4 giờ</w:t>
       </w:r>
       <w:r>
         <w:rPr>
@@ -3681,10 +4201,10 @@
       <w:r>
         <w:rPr>
           <w:rFonts w:ascii="Georgia" w:hAnsi="Georgia"/>
-          <w:i/>
+          <w:i w:val="0"/>
           <w:color w:val="1B365D"/>
         </w:rPr>
-        <w:t>1000\text{ mL}</w:t>
+        <w:t>1000 mL</w:t>
       </w:r>
       <w:r>
         <w:rPr>
@@ -3695,7 +4215,7 @@
       <w:r>
         <w:rPr>
           <w:rFonts w:ascii="Georgia" w:hAnsi="Georgia"/>
-          <w:i/>
+          <w:i w:val="0"/>
           <w:color w:val="1B365D"/>
         </w:rPr>
         <w:t>NaOH</w:t>
@@ -3709,10 +4229,10 @@
       <w:r>
         <w:rPr>
           <w:rFonts w:ascii="Georgia" w:hAnsi="Georgia"/>
-          <w:i/>
+          <w:i w:val="0"/>
           <w:color w:val="1B365D"/>
         </w:rPr>
-        <w:t>6\text{ wt}\%</w:t>
+        <w:t>6 wt\%</w:t>
       </w:r>
       <w:r>
         <w:rPr>
@@ -3723,10 +4243,10 @@
       <w:r>
         <w:rPr>
           <w:rFonts w:ascii="Georgia" w:hAnsi="Georgia"/>
-          <w:i/>
+          <w:i w:val="0"/>
           <w:color w:val="1B365D"/>
         </w:rPr>
-        <w:t>1:20\text{ w/v}</w:t>
+        <w:t>1:20 w/v</w:t>
       </w:r>
       <w:r>
         <w:rPr>
@@ -3749,10 +4269,26 @@
       <w:r>
         <w:rPr>
           <w:rFonts w:ascii="Georgia" w:hAnsi="Georgia"/>
-          <w:i/>
+          <w:i w:val="0"/>
           <w:color w:val="1B365D"/>
         </w:rPr>
-        <w:t>80 \pm 2^\circ\text{C}</w:t>
+        <w:t>80 ± 2</w:t>
+      </w:r>
+      <w:r>
+        <w:rPr>
+          <w:rFonts w:ascii="Georgia" w:hAnsi="Georgia"/>
+          <w:color w:val="1B365D"/>
+          <w:vertAlign w:val="superscript"/>
+        </w:rPr>
+        <w:t>\</w:t>
+      </w:r>
+      <w:r>
+        <w:rPr>
+          <w:rFonts w:ascii="Georgia" w:hAnsi="Georgia"/>
+          <w:i w:val="0"/>
+          <w:color w:val="1B365D"/>
+        </w:rPr>
+        <w:t>circC</w:t>
       </w:r>
       <w:r>
         <w:rPr>
@@ -3763,10 +4299,10 @@
       <w:r>
         <w:rPr>
           <w:rFonts w:ascii="Georgia" w:hAnsi="Georgia"/>
-          <w:i/>
+          <w:i w:val="0"/>
           <w:color w:val="1B365D"/>
         </w:rPr>
-        <w:t>4\text{ giờ}</w:t>
+        <w:t>4 giờ</w:t>
       </w:r>
       <w:r>
         <w:rPr>
@@ -3777,10 +4313,10 @@
       <w:r>
         <w:rPr>
           <w:rFonts w:ascii="Georgia" w:hAnsi="Georgia"/>
-          <w:i/>
+          <w:i w:val="0"/>
           <w:color w:val="1B365D"/>
         </w:rPr>
-        <w:t>600\text{ rpm}</w:t>
+        <w:t>600 rpm</w:t>
       </w:r>
       <w:r>
         <w:rPr>
@@ -3817,10 +4353,26 @@
       <w:r>
         <w:rPr>
           <w:rFonts w:ascii="Georgia" w:hAnsi="Georgia"/>
-          <w:i/>
+          <w:i w:val="0"/>
           <w:color w:val="1B365D"/>
         </w:rPr>
-        <w:t>80^\circ\text{C}</w:t>
+        <w:t>80</w:t>
+      </w:r>
+      <w:r>
+        <w:rPr>
+          <w:rFonts w:ascii="Georgia" w:hAnsi="Georgia"/>
+          <w:color w:val="1B365D"/>
+          <w:vertAlign w:val="superscript"/>
+        </w:rPr>
+        <w:t>\</w:t>
+      </w:r>
+      <w:r>
+        <w:rPr>
+          <w:rFonts w:ascii="Georgia" w:hAnsi="Georgia"/>
+          <w:i w:val="0"/>
+          <w:color w:val="1B365D"/>
+        </w:rPr>
+        <w:t>circC</w:t>
       </w:r>
       <w:r>
         <w:rPr>
@@ -3831,10 +4383,10 @@
       <w:r>
         <w:rPr>
           <w:rFonts w:ascii="Georgia" w:hAnsi="Georgia"/>
-          <w:i/>
+          <w:i w:val="0"/>
           <w:color w:val="1B365D"/>
         </w:rPr>
-        <w:t>8\text{ giờ}</w:t>
+        <w:t>8 giờ</w:t>
       </w:r>
       <w:r>
         <w:rPr>
@@ -3880,10 +4432,10 @@
       <w:r>
         <w:rPr>
           <w:rFonts w:ascii="Georgia" w:hAnsi="Georgia"/>
-          <w:i/>
+          <w:i w:val="0"/>
           <w:color w:val="1B365D"/>
         </w:rPr>
-        <w:t>30\text{ g}</w:t>
+        <w:t>30 g</w:t>
       </w:r>
       <w:r>
         <w:rPr>
@@ -3894,10 +4446,10 @@
       <w:r>
         <w:rPr>
           <w:rFonts w:ascii="Georgia" w:hAnsi="Georgia"/>
-          <w:i/>
+          <w:i w:val="0"/>
           <w:color w:val="1B365D"/>
         </w:rPr>
-        <w:t>600\text{ mL}</w:t>
+        <w:t>600 mL</w:t>
       </w:r>
       <w:r>
         <w:rPr>
@@ -3908,10 +4460,34 @@
       <w:r>
         <w:rPr>
           <w:rFonts w:ascii="Georgia" w:hAnsi="Georgia"/>
-          <w:i/>
+          <w:i w:val="0"/>
           <w:color w:val="1B365D"/>
         </w:rPr>
-        <w:t>H_2O_2</w:t>
+        <w:t>H</w:t>
+      </w:r>
+      <w:r>
+        <w:rPr>
+          <w:rFonts w:ascii="Georgia" w:hAnsi="Georgia"/>
+          <w:color w:val="1B365D"/>
+          <w:vertAlign w:val="subscript"/>
+        </w:rPr>
+        <w:t>2</w:t>
+      </w:r>
+      <w:r>
+        <w:rPr>
+          <w:rFonts w:ascii="Georgia" w:hAnsi="Georgia"/>
+          <w:i w:val="0"/>
+          <w:color w:val="1B365D"/>
+        </w:rPr>
+        <w:t>O</w:t>
+      </w:r>
+      <w:r>
+        <w:rPr>
+          <w:rFonts w:ascii="Georgia" w:hAnsi="Georgia"/>
+          <w:color w:val="1B365D"/>
+          <w:vertAlign w:val="subscript"/>
+        </w:rPr>
+        <w:t>2</w:t>
       </w:r>
       <w:r>
         <w:rPr>
@@ -3922,10 +4498,10 @@
       <w:r>
         <w:rPr>
           <w:rFonts w:ascii="Georgia" w:hAnsi="Georgia"/>
-          <w:i/>
+          <w:i w:val="0"/>
           <w:color w:val="1B365D"/>
         </w:rPr>
-        <w:t>10\text{ wt}\%</w:t>
+        <w:t>10 wt\%</w:t>
       </w:r>
       <w:r>
         <w:rPr>
@@ -3936,10 +4512,10 @@
       <w:r>
         <w:rPr>
           <w:rFonts w:ascii="Georgia" w:hAnsi="Georgia"/>
-          <w:i/>
+          <w:i w:val="0"/>
           <w:color w:val="1B365D"/>
         </w:rPr>
-        <w:t>1:20\text{ w/v}</w:t>
+        <w:t>1:20 w/v</w:t>
       </w:r>
       <w:r>
         <w:rPr>
@@ -3962,7 +4538,7 @@
       <w:r>
         <w:rPr>
           <w:rFonts w:ascii="Georgia" w:hAnsi="Georgia"/>
-          <w:i/>
+          <w:i w:val="0"/>
           <w:color w:val="1B365D"/>
         </w:rPr>
         <w:t>NaOH</w:t>
@@ -3976,10 +4552,10 @@
       <w:r>
         <w:rPr>
           <w:rFonts w:ascii="Georgia" w:hAnsi="Georgia"/>
-          <w:i/>
+          <w:i w:val="0"/>
           <w:color w:val="1B365D"/>
         </w:rPr>
-        <w:t>pH \approx 11</w:t>
+        <w:t>pH ≈ 11</w:t>
       </w:r>
       <w:r>
         <w:rPr>
@@ -4002,10 +4578,26 @@
       <w:r>
         <w:rPr>
           <w:rFonts w:ascii="Georgia" w:hAnsi="Georgia"/>
-          <w:i/>
+          <w:i w:val="0"/>
           <w:color w:val="1B365D"/>
         </w:rPr>
-        <w:t>60^\circ\text{C}</w:t>
+        <w:t>60</w:t>
+      </w:r>
+      <w:r>
+        <w:rPr>
+          <w:rFonts w:ascii="Georgia" w:hAnsi="Georgia"/>
+          <w:color w:val="1B365D"/>
+          <w:vertAlign w:val="superscript"/>
+        </w:rPr>
+        <w:t>\</w:t>
+      </w:r>
+      <w:r>
+        <w:rPr>
+          <w:rFonts w:ascii="Georgia" w:hAnsi="Georgia"/>
+          <w:i w:val="0"/>
+          <w:color w:val="1B365D"/>
+        </w:rPr>
+        <w:t>circC</w:t>
       </w:r>
       <w:r>
         <w:rPr>
@@ -4016,10 +4608,10 @@
       <w:r>
         <w:rPr>
           <w:rFonts w:ascii="Georgia" w:hAnsi="Georgia"/>
-          <w:i/>
+          <w:i w:val="0"/>
           <w:color w:val="1B365D"/>
         </w:rPr>
-        <w:t>2\text{ giờ}</w:t>
+        <w:t>2 giờ</w:t>
       </w:r>
       <w:r>
         <w:rPr>
@@ -4030,10 +4622,10 @@
       <w:r>
         <w:rPr>
           <w:rFonts w:ascii="Georgia" w:hAnsi="Georgia"/>
-          <w:i/>
+          <w:i w:val="0"/>
           <w:color w:val="1B365D"/>
         </w:rPr>
-        <w:t>300\text{ rpm}</w:t>
+        <w:t>300 rpm</w:t>
       </w:r>
       <w:r>
         <w:rPr>
@@ -4105,10 +4697,10 @@
       <w:r>
         <w:rPr>
           <w:rFonts w:ascii="Georgia" w:hAnsi="Georgia"/>
-          <w:i/>
+          <w:i w:val="0"/>
           <w:color w:val="1B365D"/>
         </w:rPr>
-        <w:t>600\text{ mL}</w:t>
+        <w:t>600 mL</w:t>
       </w:r>
       <w:r>
         <w:rPr>
@@ -4119,7 +4711,7 @@
       <w:r>
         <w:rPr>
           <w:rFonts w:ascii="Georgia" w:hAnsi="Georgia"/>
-          <w:i/>
+          <w:i w:val="0"/>
           <w:color w:val="1B365D"/>
         </w:rPr>
         <w:t>HCl</w:t>
@@ -4133,10 +4725,10 @@
       <w:r>
         <w:rPr>
           <w:rFonts w:ascii="Georgia" w:hAnsi="Georgia"/>
-          <w:i/>
+          <w:i w:val="0"/>
           <w:color w:val="1B365D"/>
         </w:rPr>
-        <w:t>2.0\text{ M}</w:t>
+        <w:t>2.0 M</w:t>
       </w:r>
       <w:r>
         <w:rPr>
@@ -4147,10 +4739,10 @@
       <w:r>
         <w:rPr>
           <w:rFonts w:ascii="Georgia" w:hAnsi="Georgia"/>
-          <w:i/>
+          <w:i w:val="0"/>
           <w:color w:val="1B365D"/>
         </w:rPr>
-        <w:t>1:20\text{ w/v}</w:t>
+        <w:t>1:20 w/v</w:t>
       </w:r>
       <w:r>
         <w:rPr>
@@ -4173,10 +4765,26 @@
       <w:r>
         <w:rPr>
           <w:rFonts w:ascii="Georgia" w:hAnsi="Georgia"/>
-          <w:i/>
+          <w:i w:val="0"/>
           <w:color w:val="1B365D"/>
         </w:rPr>
-        <w:t>60^\circ\text{C}</w:t>
+        <w:t>60</w:t>
+      </w:r>
+      <w:r>
+        <w:rPr>
+          <w:rFonts w:ascii="Georgia" w:hAnsi="Georgia"/>
+          <w:color w:val="1B365D"/>
+          <w:vertAlign w:val="superscript"/>
+        </w:rPr>
+        <w:t>\</w:t>
+      </w:r>
+      <w:r>
+        <w:rPr>
+          <w:rFonts w:ascii="Georgia" w:hAnsi="Georgia"/>
+          <w:i w:val="0"/>
+          <w:color w:val="1B365D"/>
+        </w:rPr>
+        <w:t>circC</w:t>
       </w:r>
       <w:r>
         <w:rPr>
@@ -4187,10 +4795,10 @@
       <w:r>
         <w:rPr>
           <w:rFonts w:ascii="Georgia" w:hAnsi="Georgia"/>
-          <w:i/>
+          <w:i w:val="0"/>
           <w:color w:val="1B365D"/>
         </w:rPr>
-        <w:t>2\text{ giờ}</w:t>
+        <w:t>2 giờ</w:t>
       </w:r>
       <w:r>
         <w:rPr>
@@ -4201,10 +4809,10 @@
       <w:r>
         <w:rPr>
           <w:rFonts w:ascii="Georgia" w:hAnsi="Georgia"/>
-          <w:i/>
+          <w:i w:val="0"/>
           <w:color w:val="1B365D"/>
         </w:rPr>
-        <w:t>400\text{ rpm}</w:t>
+        <w:t>400 rpm</w:t>
       </w:r>
       <w:r>
         <w:rPr>
@@ -4253,10 +4861,26 @@
       <w:r>
         <w:rPr>
           <w:rFonts w:ascii="Georgia" w:hAnsi="Georgia"/>
-          <w:i/>
+          <w:i w:val="0"/>
           <w:color w:val="1B365D"/>
         </w:rPr>
-        <w:t>80^\circ\text{C}</w:t>
+        <w:t>80</w:t>
+      </w:r>
+      <w:r>
+        <w:rPr>
+          <w:rFonts w:ascii="Georgia" w:hAnsi="Georgia"/>
+          <w:color w:val="1B365D"/>
+          <w:vertAlign w:val="superscript"/>
+        </w:rPr>
+        <w:t>\</w:t>
+      </w:r>
+      <w:r>
+        <w:rPr>
+          <w:rFonts w:ascii="Georgia" w:hAnsi="Georgia"/>
+          <w:i w:val="0"/>
+          <w:color w:val="1B365D"/>
+        </w:rPr>
+        <w:t>circC</w:t>
       </w:r>
       <w:r>
         <w:rPr>
@@ -4267,10 +4891,10 @@
       <w:r>
         <w:rPr>
           <w:rFonts w:ascii="Georgia" w:hAnsi="Georgia"/>
-          <w:i/>
+          <w:i w:val="0"/>
           <w:color w:val="1B365D"/>
         </w:rPr>
-        <w:t>12\text{ giờ}</w:t>
+        <w:t>12 giờ</w:t>
       </w:r>
       <w:r>
         <w:rPr>
@@ -4371,10 +4995,10 @@
       <w:r>
         <w:rPr>
           <w:rFonts w:ascii="Georgia" w:hAnsi="Georgia"/>
-          <w:i/>
+          <w:i w:val="0"/>
           <w:color w:val="1B365D"/>
         </w:rPr>
-        <w:t>80 - 100\text{ }\mu\text{m}</w:t>
+        <w:t>80 - 100 \mum</w:t>
       </w:r>
       <w:r>
         <w:rPr>
@@ -4422,10 +5046,26 @@
       <w:r>
         <w:rPr>
           <w:rFonts w:ascii="Georgia" w:hAnsi="Georgia"/>
-          <w:i/>
+          <w:i w:val="0"/>
           <w:color w:val="1B365D"/>
         </w:rPr>
-        <w:t>2\theta \approx 16.08^\circ</w:t>
+        <w:t>2\theta ≈ 16.08</w:t>
+      </w:r>
+      <w:r>
+        <w:rPr>
+          <w:rFonts w:ascii="Georgia" w:hAnsi="Georgia"/>
+          <w:color w:val="1B365D"/>
+          <w:vertAlign w:val="superscript"/>
+        </w:rPr>
+        <w:t>\</w:t>
+      </w:r>
+      <w:r>
+        <w:rPr>
+          <w:rFonts w:ascii="Georgia" w:hAnsi="Georgia"/>
+          <w:i w:val="0"/>
+          <w:color w:val="1B365D"/>
+        </w:rPr>
+        <w:t>circ</w:t>
       </w:r>
       <w:r>
         <w:rPr>
@@ -4436,10 +5076,26 @@
       <w:r>
         <w:rPr>
           <w:rFonts w:ascii="Georgia" w:hAnsi="Georgia"/>
-          <w:i/>
+          <w:i w:val="0"/>
           <w:color w:val="1B365D"/>
         </w:rPr>
-        <w:t>22.23^\circ</w:t>
+        <w:t>22.23</w:t>
+      </w:r>
+      <w:r>
+        <w:rPr>
+          <w:rFonts w:ascii="Georgia" w:hAnsi="Georgia"/>
+          <w:color w:val="1B365D"/>
+          <w:vertAlign w:val="superscript"/>
+        </w:rPr>
+        <w:t>\</w:t>
+      </w:r>
+      <w:r>
+        <w:rPr>
+          <w:rFonts w:ascii="Georgia" w:hAnsi="Georgia"/>
+          <w:i w:val="0"/>
+          <w:color w:val="1B365D"/>
+        </w:rPr>
+        <w:t>circ</w:t>
       </w:r>
       <w:r>
         <w:rPr>
@@ -4487,10 +5143,18 @@
       <w:r>
         <w:rPr>
           <w:rFonts w:ascii="Georgia" w:hAnsi="Georgia"/>
-          <w:i/>
+          <w:i w:val="0"/>
           <w:color w:val="1B365D"/>
         </w:rPr>
-        <w:t>1735\text{ cm}^{-1}</w:t>
+        <w:t>1735 cm</w:t>
+      </w:r>
+      <w:r>
+        <w:rPr>
+          <w:rFonts w:ascii="Georgia" w:hAnsi="Georgia"/>
+          <w:color w:val="1B365D"/>
+          <w:vertAlign w:val="superscript"/>
+        </w:rPr>
+        <w:t>-1</w:t>
       </w:r>
       <w:r>
         <w:rPr>
@@ -4578,10 +5242,10 @@
       <w:r>
         <w:rPr>
           <w:rFonts w:ascii="Georgia" w:hAnsi="Georgia"/>
-          <w:i/>
+          <w:i w:val="0"/>
           <w:color w:val="1B365D"/>
         </w:rPr>
-        <w:t>1.0\text{ g}</w:t>
+        <w:t>1.0 g</w:t>
       </w:r>
       <w:r>
         <w:rPr>
@@ -4592,10 +5256,10 @@
       <w:r>
         <w:rPr>
           <w:rFonts w:ascii="Georgia" w:hAnsi="Georgia"/>
-          <w:i/>
+          <w:i w:val="0"/>
           <w:color w:val="1B365D"/>
         </w:rPr>
-        <w:t>4.0\text{ g}</w:t>
+        <w:t>4.0 g</w:t>
       </w:r>
       <w:r>
         <w:rPr>
@@ -4606,10 +5270,26 @@
       <w:r>
         <w:rPr>
           <w:rFonts w:ascii="Georgia" w:hAnsi="Georgia"/>
-          <w:i/>
+          <w:i w:val="0"/>
           <w:color w:val="1B365D"/>
         </w:rPr>
-        <w:t>11.0\text{ mL } NH_4OH</w:t>
+        <w:t>11.0 mL  NH</w:t>
+      </w:r>
+      <w:r>
+        <w:rPr>
+          <w:rFonts w:ascii="Georgia" w:hAnsi="Georgia"/>
+          <w:color w:val="1B365D"/>
+          <w:vertAlign w:val="subscript"/>
+        </w:rPr>
+        <w:t>4</w:t>
+      </w:r>
+      <w:r>
+        <w:rPr>
+          <w:rFonts w:ascii="Georgia" w:hAnsi="Georgia"/>
+          <w:i w:val="0"/>
+          <w:color w:val="1B365D"/>
+        </w:rPr>
+        <w:t>OH</w:t>
       </w:r>
       <w:r>
         <w:rPr>
@@ -4620,10 +5300,10 @@
       <w:r>
         <w:rPr>
           <w:rFonts w:ascii="Georgia" w:hAnsi="Georgia"/>
-          <w:i/>
+          <w:i w:val="0"/>
           <w:color w:val="1B365D"/>
         </w:rPr>
-        <w:t>25\text{ wt}\%</w:t>
+        <w:t>25 wt\%</w:t>
       </w:r>
       <w:r>
         <w:rPr>
@@ -4634,10 +5314,10 @@
       <w:r>
         <w:rPr>
           <w:rFonts w:ascii="Georgia" w:hAnsi="Georgia"/>
-          <w:i/>
+          <w:i w:val="0"/>
           <w:color w:val="1B365D"/>
         </w:rPr>
-        <w:t>5.0\text{ mL}</w:t>
+        <w:t>5.0 mL</w:t>
       </w:r>
       <w:r>
         <w:rPr>
@@ -4660,10 +5340,10 @@
       <w:r>
         <w:rPr>
           <w:rFonts w:ascii="Georgia" w:hAnsi="Georgia"/>
-          <w:i/>
+          <w:i w:val="0"/>
           <w:color w:val="1B365D"/>
         </w:rPr>
-        <w:t>1.0\text{ g}</w:t>
+        <w:t>1.0 g</w:t>
       </w:r>
       <w:r>
         <w:rPr>
@@ -4784,10 +5464,26 @@
       <w:r>
         <w:rPr>
           <w:rFonts w:ascii="Georgia" w:hAnsi="Georgia"/>
-          <w:i/>
+          <w:i w:val="0"/>
           <w:color w:val="1B365D"/>
         </w:rPr>
-        <w:t>7\text{ wt}\% NaOH : 12\text{ wt}\% Urea : 81\text{ wt}\% H_2O</w:t>
+        <w:t>7 wt\% NaOH : 12 wt\% Urea : 81 wt\% H</w:t>
+      </w:r>
+      <w:r>
+        <w:rPr>
+          <w:rFonts w:ascii="Georgia" w:hAnsi="Georgia"/>
+          <w:color w:val="1B365D"/>
+          <w:vertAlign w:val="subscript"/>
+        </w:rPr>
+        <w:t>2</w:t>
+      </w:r>
+      <w:r>
+        <w:rPr>
+          <w:rFonts w:ascii="Georgia" w:hAnsi="Georgia"/>
+          <w:i w:val="0"/>
+          <w:color w:val="1B365D"/>
+        </w:rPr>
+        <w:t>O</w:t>
       </w:r>
       <w:r>
         <w:rPr>
@@ -4835,10 +5531,10 @@
       <w:r>
         <w:rPr>
           <w:rFonts w:ascii="Georgia" w:hAnsi="Georgia"/>
-          <w:i/>
+          <w:i w:val="0"/>
           <w:color w:val="1B365D"/>
         </w:rPr>
-        <w:t>1.0\text{ g}</w:t>
+        <w:t>1.0 g</w:t>
       </w:r>
       <w:r>
         <w:rPr>
@@ -4849,10 +5545,10 @@
       <w:r>
         <w:rPr>
           <w:rFonts w:ascii="Georgia" w:hAnsi="Georgia"/>
-          <w:i/>
+          <w:i w:val="0"/>
           <w:color w:val="1B365D"/>
         </w:rPr>
-        <w:t>3000\text{ rpm}</w:t>
+        <w:t>3000 rpm</w:t>
       </w:r>
       <w:r>
         <w:rPr>
@@ -4953,10 +5649,26 @@
       <w:r>
         <w:rPr>
           <w:rFonts w:ascii="Georgia" w:hAnsi="Georgia"/>
-          <w:i/>
+          <w:i w:val="0"/>
           <w:color w:val="1B365D"/>
         </w:rPr>
-        <w:t>&gt;15^\circ\text{C}</w:t>
+        <w:t>&gt;15</w:t>
+      </w:r>
+      <w:r>
+        <w:rPr>
+          <w:rFonts w:ascii="Georgia" w:hAnsi="Georgia"/>
+          <w:color w:val="1B365D"/>
+          <w:vertAlign w:val="superscript"/>
+        </w:rPr>
+        <w:t>\</w:t>
+      </w:r>
+      <w:r>
+        <w:rPr>
+          <w:rFonts w:ascii="Georgia" w:hAnsi="Georgia"/>
+          <w:i w:val="0"/>
+          <w:color w:val="1B365D"/>
+        </w:rPr>
+        <w:t>circC</w:t>
       </w:r>
       <w:r>
         <w:rPr>
@@ -4967,10 +5679,18 @@
       <w:r>
         <w:rPr>
           <w:rFonts w:ascii="Georgia" w:hAnsi="Georgia"/>
-          <w:i/>
+          <w:i w:val="0"/>
           <w:color w:val="1B365D"/>
         </w:rPr>
-        <w:t>NH_3</w:t>
+        <w:t>NH</w:t>
+      </w:r>
+      <w:r>
+        <w:rPr>
+          <w:rFonts w:ascii="Georgia" w:hAnsi="Georgia"/>
+          <w:color w:val="1B365D"/>
+          <w:vertAlign w:val="subscript"/>
+        </w:rPr>
+        <w:t>3</w:t>
       </w:r>
       <w:r>
         <w:rPr>
@@ -5005,10 +5725,26 @@
       <w:r>
         <w:rPr>
           <w:rFonts w:ascii="Georgia" w:hAnsi="Georgia"/>
-          <w:i/>
+          <w:i w:val="0"/>
           <w:color w:val="1B365D"/>
         </w:rPr>
-        <w:t>2\theta \approx 11.6^\circ</w:t>
+        <w:t>2\theta ≈ 11.6</w:t>
+      </w:r>
+      <w:r>
+        <w:rPr>
+          <w:rFonts w:ascii="Georgia" w:hAnsi="Georgia"/>
+          <w:color w:val="1B365D"/>
+          <w:vertAlign w:val="superscript"/>
+        </w:rPr>
+        <w:t>\</w:t>
+      </w:r>
+      <w:r>
+        <w:rPr>
+          <w:rFonts w:ascii="Georgia" w:hAnsi="Georgia"/>
+          <w:i w:val="0"/>
+          <w:color w:val="1B365D"/>
+        </w:rPr>
+        <w:t>circ</w:t>
       </w:r>
       <w:r>
         <w:rPr>
@@ -5019,10 +5755,26 @@
       <w:r>
         <w:rPr>
           <w:rFonts w:ascii="Georgia" w:hAnsi="Georgia"/>
-          <w:i/>
+          <w:i w:val="0"/>
           <w:color w:val="1B365D"/>
         </w:rPr>
-        <w:t>20.5^\circ</w:t>
+        <w:t>20.5</w:t>
+      </w:r>
+      <w:r>
+        <w:rPr>
+          <w:rFonts w:ascii="Georgia" w:hAnsi="Georgia"/>
+          <w:color w:val="1B365D"/>
+          <w:vertAlign w:val="superscript"/>
+        </w:rPr>
+        <w:t>\</w:t>
+      </w:r>
+      <w:r>
+        <w:rPr>
+          <w:rFonts w:ascii="Georgia" w:hAnsi="Georgia"/>
+          <w:i w:val="0"/>
+          <w:color w:val="1B365D"/>
+        </w:rPr>
+        <w:t>circ</w:t>
       </w:r>
       <w:r>
         <w:rPr>
@@ -5033,10 +5785,26 @@
       <w:r>
         <w:rPr>
           <w:rFonts w:ascii="Georgia" w:hAnsi="Georgia"/>
-          <w:i/>
+          <w:i w:val="0"/>
           <w:color w:val="1B365D"/>
         </w:rPr>
-        <w:t>22.23^\circ</w:t>
+        <w:t>22.23</w:t>
+      </w:r>
+      <w:r>
+        <w:rPr>
+          <w:rFonts w:ascii="Georgia" w:hAnsi="Georgia"/>
+          <w:color w:val="1B365D"/>
+          <w:vertAlign w:val="superscript"/>
+        </w:rPr>
+        <w:t>\</w:t>
+      </w:r>
+      <w:r>
+        <w:rPr>
+          <w:rFonts w:ascii="Georgia" w:hAnsi="Georgia"/>
+          <w:i w:val="0"/>
+          <w:color w:val="1B365D"/>
+        </w:rPr>
+        <w:t>circ</w:t>
       </w:r>
       <w:r>
         <w:rPr>
@@ -5162,10 +5930,26 @@
       <w:r>
         <w:rPr>
           <w:rFonts w:ascii="Georgia" w:hAnsi="Georgia"/>
-          <w:i/>
+          <w:i w:val="0"/>
           <w:color w:val="1B365D"/>
         </w:rPr>
-        <w:t>NH_4OH</w:t>
+        <w:t>NH</w:t>
+      </w:r>
+      <w:r>
+        <w:rPr>
+          <w:rFonts w:ascii="Georgia" w:hAnsi="Georgia"/>
+          <w:color w:val="1B365D"/>
+          <w:vertAlign w:val="subscript"/>
+        </w:rPr>
+        <w:t>4</w:t>
+      </w:r>
+      <w:r>
+        <w:rPr>
+          <w:rFonts w:ascii="Georgia" w:hAnsi="Georgia"/>
+          <w:i w:val="0"/>
+          <w:color w:val="1B365D"/>
+        </w:rPr>
+        <w:t>OH</w:t>
       </w:r>
       <w:r>
         <w:rPr>
@@ -5201,7 +5985,7 @@
       <w:r>
         <w:rPr>
           <w:rFonts w:ascii="Georgia" w:hAnsi="Georgia"/>
-          <w:i/>
+          <w:i w:val="0"/>
           <w:color w:val="1B365D"/>
         </w:rPr>
         <w:t>NaOH</w:t>
@@ -5419,10 +6203,26 @@
       <w:r>
         <w:rPr>
           <w:rFonts w:ascii="Georgia" w:hAnsi="Georgia"/>
-          <w:i/>
+          <w:i w:val="0"/>
           <w:color w:val="1B365D"/>
         </w:rPr>
-        <w:t>4^\circ\text{C}</w:t>
+        <w:t>4</w:t>
+      </w:r>
+      <w:r>
+        <w:rPr>
+          <w:rFonts w:ascii="Georgia" w:hAnsi="Georgia"/>
+          <w:color w:val="1B365D"/>
+          <w:vertAlign w:val="superscript"/>
+        </w:rPr>
+        <w:t>\</w:t>
+      </w:r>
+      <w:r>
+        <w:rPr>
+          <w:rFonts w:ascii="Georgia" w:hAnsi="Georgia"/>
+          <w:i w:val="0"/>
+          <w:color w:val="1B365D"/>
+        </w:rPr>
+        <w:t>circC</w:t>
       </w:r>
       <w:r>
         <w:rPr>
@@ -5587,10 +6387,10 @@
       <w:r>
         <w:rPr>
           <w:rFonts w:ascii="Georgia" w:hAnsi="Georgia"/>
-          <w:i/>
+          <w:i w:val="0"/>
           <w:color w:val="1B365D"/>
         </w:rPr>
-        <w:t>1.0\text{ g}</w:t>
+        <w:t>1.0 g</w:t>
       </w:r>
       <w:r>
         <w:rPr>
@@ -5601,10 +6401,10 @@
       <w:r>
         <w:rPr>
           <w:rFonts w:ascii="Georgia" w:hAnsi="Georgia"/>
-          <w:i/>
+          <w:i w:val="0"/>
           <w:color w:val="1B365D"/>
         </w:rPr>
-        <w:t>30\text{ mL}</w:t>
+        <w:t>30 mL</w:t>
       </w:r>
       <w:r>
         <w:rPr>
@@ -5615,10 +6415,26 @@
       <w:r>
         <w:rPr>
           <w:rFonts w:ascii="Georgia" w:hAnsi="Georgia"/>
-          <w:i/>
+          <w:i w:val="0"/>
           <w:color w:val="1B365D"/>
         </w:rPr>
-        <w:t>0 - 5^\circ\text{C}</w:t>
+        <w:t>0 - 5</w:t>
+      </w:r>
+      <w:r>
+        <w:rPr>
+          <w:rFonts w:ascii="Georgia" w:hAnsi="Georgia"/>
+          <w:color w:val="1B365D"/>
+          <w:vertAlign w:val="superscript"/>
+        </w:rPr>
+        <w:t>\</w:t>
+      </w:r>
+      <w:r>
+        <w:rPr>
+          <w:rFonts w:ascii="Georgia" w:hAnsi="Georgia"/>
+          <w:i w:val="0"/>
+          <w:color w:val="1B365D"/>
+        </w:rPr>
+        <w:t>circC</w:t>
       </w:r>
       <w:r>
         <w:rPr>
@@ -5653,10 +6469,10 @@
       <w:r>
         <w:rPr>
           <w:rFonts w:ascii="Georgia" w:hAnsi="Georgia"/>
-          <w:i/>
+          <w:i w:val="0"/>
           <w:color w:val="1B365D"/>
         </w:rPr>
-        <w:t>30\text{ phút}</w:t>
+        <w:t>30 phút</w:t>
       </w:r>
       <w:r>
         <w:rPr>
@@ -5667,10 +6483,26 @@
       <w:r>
         <w:rPr>
           <w:rFonts w:ascii="Georgia" w:hAnsi="Georgia"/>
-          <w:i/>
+          <w:i w:val="0"/>
           <w:color w:val="1B365D"/>
         </w:rPr>
-        <w:t>4^\circ\text{C}</w:t>
+        <w:t>4</w:t>
+      </w:r>
+      <w:r>
+        <w:rPr>
+          <w:rFonts w:ascii="Georgia" w:hAnsi="Georgia"/>
+          <w:color w:val="1B365D"/>
+          <w:vertAlign w:val="superscript"/>
+        </w:rPr>
+        <w:t>\</w:t>
+      </w:r>
+      <w:r>
+        <w:rPr>
+          <w:rFonts w:ascii="Georgia" w:hAnsi="Georgia"/>
+          <w:i w:val="0"/>
+          <w:color w:val="1B365D"/>
+        </w:rPr>
+        <w:t>circC</w:t>
       </w:r>
       <w:r>
         <w:rPr>
@@ -5694,10 +6526,18 @@
       <w:r>
         <w:rPr>
           <w:rFonts w:ascii="Georgia" w:hAnsi="Georgia"/>
-          <w:i/>
+          <w:i w:val="0"/>
           <w:color w:val="1B365D"/>
         </w:rPr>
-        <w:t>Fe^{3+}</w:t>
+        <w:t>Fe</w:t>
+      </w:r>
+      <w:r>
+        <w:rPr>
+          <w:rFonts w:ascii="Georgia" w:hAnsi="Georgia"/>
+          <w:color w:val="1B365D"/>
+          <w:vertAlign w:val="superscript"/>
+        </w:rPr>
+        <w:t>3+</w:t>
       </w:r>
       <w:r>
         <w:rPr>
@@ -5762,7 +6602,7 @@
       <w:r>
         <w:rPr>
           <w:rFonts w:ascii="Georgia" w:hAnsi="Georgia"/>
-          <w:i/>
+          <w:i w:val="0"/>
           <w:color w:val="1B365D"/>
         </w:rPr>
         <w:t>Fe/N</w:t>
@@ -5892,10 +6732,18 @@
       <w:r>
         <w:rPr>
           <w:rFonts w:ascii="Georgia" w:hAnsi="Georgia"/>
-          <w:i/>
+          <w:i w:val="0"/>
           <w:color w:val="1B365D"/>
         </w:rPr>
-        <w:t>LN_2</w:t>
+        <w:t>LN</w:t>
+      </w:r>
+      <w:r>
+        <w:rPr>
+          <w:rFonts w:ascii="Georgia" w:hAnsi="Georgia"/>
+          <w:color w:val="1B365D"/>
+          <w:vertAlign w:val="subscript"/>
+        </w:rPr>
+        <w:t>2</w:t>
       </w:r>
       <w:r>
         <w:rPr>
@@ -5906,10 +6754,26 @@
       <w:r>
         <w:rPr>
           <w:rFonts w:ascii="Georgia" w:hAnsi="Georgia"/>
-          <w:i/>
+          <w:i w:val="0"/>
           <w:color w:val="1B365D"/>
         </w:rPr>
-        <w:t>-196^\circ\text{C}</w:t>
+        <w:t>-196</w:t>
+      </w:r>
+      <w:r>
+        <w:rPr>
+          <w:rFonts w:ascii="Georgia" w:hAnsi="Georgia"/>
+          <w:color w:val="1B365D"/>
+          <w:vertAlign w:val="superscript"/>
+        </w:rPr>
+        <w:t>\</w:t>
+      </w:r>
+      <w:r>
+        <w:rPr>
+          <w:rFonts w:ascii="Georgia" w:hAnsi="Georgia"/>
+          <w:i w:val="0"/>
+          <w:color w:val="1B365D"/>
+        </w:rPr>
+        <w:t>circC</w:t>
       </w:r>
       <w:r>
         <w:rPr>
@@ -5981,10 +6845,26 @@
       <w:r>
         <w:rPr>
           <w:rFonts w:ascii="Georgia" w:hAnsi="Georgia"/>
-          <w:i/>
+          <w:i w:val="0"/>
           <w:color w:val="1B365D"/>
         </w:rPr>
-        <w:t>-80^\circ\text{C}</w:t>
+        <w:t>-80</w:t>
+      </w:r>
+      <w:r>
+        <w:rPr>
+          <w:rFonts w:ascii="Georgia" w:hAnsi="Georgia"/>
+          <w:color w:val="1B365D"/>
+          <w:vertAlign w:val="superscript"/>
+        </w:rPr>
+        <w:t>\</w:t>
+      </w:r>
+      <w:r>
+        <w:rPr>
+          <w:rFonts w:ascii="Georgia" w:hAnsi="Georgia"/>
+          <w:i w:val="0"/>
+          <w:color w:val="1B365D"/>
+        </w:rPr>
+        <w:t>circC</w:t>
       </w:r>
       <w:r>
         <w:rPr>
@@ -6107,23 +6987,9 @@
       </w:r>
       <w:r>
         <w:rPr>
-          <w:rFonts w:ascii="Georgia" w:hAnsi="Georgia"/>
-          <w:i/>
-          <w:color w:val="1B365D"/>
-        </w:rPr>
-      </w:r>
-      <w:r>
-        <w:rPr>
           <w:rFonts w:ascii="Arial" w:hAnsi="Arial"/>
         </w:rPr>
         <w:t>\text{Shrinkage \%} = \frac{D_{\text{gel}} - D_{\text{aerogel}}}{D_{\text{gel}}} \times 100\%</w:t>
-      </w:r>
-      <w:r>
-        <w:rPr>
-          <w:rFonts w:ascii="Georgia" w:hAnsi="Georgia"/>
-          <w:i/>
-          <w:color w:val="1B365D"/>
-        </w:rPr>
       </w:r>
       <w:r>
         <w:rPr>
@@ -6158,7 +7024,7 @@
       <w:r>
         <w:rPr>
           <w:rFonts w:ascii="Georgia" w:hAnsi="Georgia"/>
-          <w:i/>
+          <w:i w:val="0"/>
           <w:color w:val="1B365D"/>
         </w:rPr>
         <w:t>&lt; 12\%</w:t>
@@ -6197,10 +7063,10 @@
       <w:r>
         <w:rPr>
           <w:rFonts w:ascii="Georgia" w:hAnsi="Georgia"/>
-          <w:i/>
+          <w:i w:val="0"/>
           <w:color w:val="1B365D"/>
         </w:rPr>
-        <w:t>\ge 20\%</w:t>
+        <w:t>≥ 20\%</w:t>
       </w:r>
       <w:r>
         <w:rPr>
@@ -6338,10 +7204,18 @@
       <w:r>
         <w:rPr>
           <w:rFonts w:ascii="Georgia" w:hAnsi="Georgia"/>
-          <w:i/>
+          <w:i w:val="0"/>
           <w:color w:val="1B365D"/>
         </w:rPr>
-        <w:t>N_2</w:t>
+        <w:t>N</w:t>
+      </w:r>
+      <w:r>
+        <w:rPr>
+          <w:rFonts w:ascii="Georgia" w:hAnsi="Georgia"/>
+          <w:color w:val="1B365D"/>
+          <w:vertAlign w:val="subscript"/>
+        </w:rPr>
+        <w:t>2</w:t>
       </w:r>
       <w:r>
         <w:rPr>
@@ -6352,7 +7226,7 @@
       <w:r>
         <w:rPr>
           <w:rFonts w:ascii="Georgia" w:hAnsi="Georgia"/>
-          <w:i/>
+          <w:i w:val="0"/>
           <w:color w:val="1B365D"/>
         </w:rPr>
         <w:t>99.99\%</w:t>
@@ -6379,10 +7253,18 @@
       <w:r>
         <w:rPr>
           <w:rFonts w:ascii="Georgia" w:hAnsi="Georgia"/>
-          <w:i/>
+          <w:i w:val="0"/>
           <w:color w:val="1B365D"/>
         </w:rPr>
-        <w:t>N_2</w:t>
+        <w:t>N</w:t>
+      </w:r>
+      <w:r>
+        <w:rPr>
+          <w:rFonts w:ascii="Georgia" w:hAnsi="Georgia"/>
+          <w:color w:val="1B365D"/>
+          <w:vertAlign w:val="subscript"/>
+        </w:rPr>
+        <w:t>2</w:t>
       </w:r>
       <w:r>
         <w:rPr>
@@ -6441,10 +7323,42 @@
       <w:r>
         <w:rPr>
           <w:rFonts w:ascii="Georgia" w:hAnsi="Georgia"/>
-          <w:i/>
+          <w:i w:val="0"/>
           <w:color w:val="1B365D"/>
         </w:rPr>
-        <w:t>25^\circ\text{C} \rightarrow 150^\circ\text{C}</w:t>
+        <w:t>25</w:t>
+      </w:r>
+      <w:r>
+        <w:rPr>
+          <w:rFonts w:ascii="Georgia" w:hAnsi="Georgia"/>
+          <w:color w:val="1B365D"/>
+          <w:vertAlign w:val="superscript"/>
+        </w:rPr>
+        <w:t>\</w:t>
+      </w:r>
+      <w:r>
+        <w:rPr>
+          <w:rFonts w:ascii="Georgia" w:hAnsi="Georgia"/>
+          <w:i w:val="0"/>
+          <w:color w:val="1B365D"/>
+        </w:rPr>
+        <w:t>circC \rightarrow 150</w:t>
+      </w:r>
+      <w:r>
+        <w:rPr>
+          <w:rFonts w:ascii="Georgia" w:hAnsi="Georgia"/>
+          <w:color w:val="1B365D"/>
+          <w:vertAlign w:val="superscript"/>
+        </w:rPr>
+        <w:t>\</w:t>
+      </w:r>
+      <w:r>
+        <w:rPr>
+          <w:rFonts w:ascii="Georgia" w:hAnsi="Georgia"/>
+          <w:i w:val="0"/>
+          <w:color w:val="1B365D"/>
+        </w:rPr>
+        <w:t>circC</w:t>
       </w:r>
       <w:r>
         <w:rPr>
@@ -6480,10 +7394,42 @@
       <w:r>
         <w:rPr>
           <w:rFonts w:ascii="Georgia" w:hAnsi="Georgia"/>
-          <w:i/>
+          <w:i w:val="0"/>
           <w:color w:val="1B365D"/>
         </w:rPr>
-        <w:t>150^\circ\text{C} \rightarrow 400^\circ\text{C}</w:t>
+        <w:t>150</w:t>
+      </w:r>
+      <w:r>
+        <w:rPr>
+          <w:rFonts w:ascii="Georgia" w:hAnsi="Georgia"/>
+          <w:color w:val="1B365D"/>
+          <w:vertAlign w:val="superscript"/>
+        </w:rPr>
+        <w:t>\</w:t>
+      </w:r>
+      <w:r>
+        <w:rPr>
+          <w:rFonts w:ascii="Georgia" w:hAnsi="Georgia"/>
+          <w:i w:val="0"/>
+          <w:color w:val="1B365D"/>
+        </w:rPr>
+        <w:t>circC \rightarrow 400</w:t>
+      </w:r>
+      <w:r>
+        <w:rPr>
+          <w:rFonts w:ascii="Georgia" w:hAnsi="Georgia"/>
+          <w:color w:val="1B365D"/>
+          <w:vertAlign w:val="superscript"/>
+        </w:rPr>
+        <w:t>\</w:t>
+      </w:r>
+      <w:r>
+        <w:rPr>
+          <w:rFonts w:ascii="Georgia" w:hAnsi="Georgia"/>
+          <w:i w:val="0"/>
+          <w:color w:val="1B365D"/>
+        </w:rPr>
+        <w:t>circC</w:t>
       </w:r>
       <w:r>
         <w:rPr>
@@ -6519,10 +7465,34 @@
       <w:r>
         <w:rPr>
           <w:rFonts w:ascii="Georgia" w:hAnsi="Georgia"/>
-          <w:i/>
+          <w:i w:val="0"/>
           <w:color w:val="1B365D"/>
         </w:rPr>
-        <w:t>400^\circ\text{C} \rightarrow T_{\text{target}}</w:t>
+        <w:t>400</w:t>
+      </w:r>
+      <w:r>
+        <w:rPr>
+          <w:rFonts w:ascii="Georgia" w:hAnsi="Georgia"/>
+          <w:color w:val="1B365D"/>
+          <w:vertAlign w:val="superscript"/>
+        </w:rPr>
+        <w:t>\</w:t>
+      </w:r>
+      <w:r>
+        <w:rPr>
+          <w:rFonts w:ascii="Georgia" w:hAnsi="Georgia"/>
+          <w:i w:val="0"/>
+          <w:color w:val="1B365D"/>
+        </w:rPr>
+        <w:t>circC \rightarrow T</w:t>
+      </w:r>
+      <w:r>
+        <w:rPr>
+          <w:rFonts w:ascii="Georgia" w:hAnsi="Georgia"/>
+          <w:color w:val="1B365D"/>
+          <w:vertAlign w:val="subscript"/>
+        </w:rPr>
+        <w:t>target</w:t>
       </w:r>
       <w:r>
         <w:rPr>
@@ -6558,10 +7528,18 @@
       <w:r>
         <w:rPr>
           <w:rFonts w:ascii="Georgia" w:hAnsi="Georgia"/>
-          <w:i/>
+          <w:i w:val="0"/>
           <w:color w:val="1B365D"/>
         </w:rPr>
-        <w:t>T_{\text{target}}</w:t>
+        <w:t>T</w:t>
+      </w:r>
+      <w:r>
+        <w:rPr>
+          <w:rFonts w:ascii="Georgia" w:hAnsi="Georgia"/>
+          <w:color w:val="1B365D"/>
+          <w:vertAlign w:val="subscript"/>
+        </w:rPr>
+        <w:t>target</w:t>
       </w:r>
       <w:r>
         <w:rPr>
@@ -6670,10 +7648,18 @@
       <w:r>
         <w:rPr>
           <w:rFonts w:ascii="Georgia" w:hAnsi="Georgia"/>
-          <w:i/>
+          <w:i w:val="0"/>
           <w:color w:val="1B365D"/>
         </w:rPr>
-        <w:t>N_2</w:t>
+        <w:t>N</w:t>
+      </w:r>
+      <w:r>
+        <w:rPr>
+          <w:rFonts w:ascii="Georgia" w:hAnsi="Georgia"/>
+          <w:color w:val="1B365D"/>
+          <w:vertAlign w:val="subscript"/>
+        </w:rPr>
+        <w:t>2</w:t>
       </w:r>
       <w:r>
         <w:rPr>
@@ -6928,7 +7914,7 @@
       <w:r>
         <w:rPr>
           <w:rFonts w:ascii="Georgia" w:hAnsi="Georgia"/>
-          <w:i/>
+          <w:i w:val="0"/>
           <w:color w:val="1B365D"/>
         </w:rPr>
         <w:t>Fe/N</w:t>
@@ -6942,7 +7928,7 @@
       <w:r>
         <w:rPr>
           <w:rFonts w:ascii="Georgia" w:hAnsi="Georgia"/>
-          <w:i/>
+          <w:i w:val="0"/>
           <w:color w:val="1B365D"/>
         </w:rPr>
         <w:t>HCl</w:t>
@@ -6956,10 +7942,10 @@
       <w:r>
         <w:rPr>
           <w:rFonts w:ascii="Georgia" w:hAnsi="Georgia"/>
-          <w:i/>
+          <w:i w:val="0"/>
           <w:color w:val="1B365D"/>
         </w:rPr>
-        <w:t>0.5\text{ M}</w:t>
+        <w:t>0.5 M</w:t>
       </w:r>
       <w:r>
         <w:rPr>
@@ -7008,10 +7994,10 @@
       <w:r>
         <w:rPr>
           <w:rFonts w:ascii="Georgia" w:hAnsi="Georgia"/>
-          <w:i/>
+          <w:i w:val="0"/>
           <w:color w:val="1B365D"/>
         </w:rPr>
-        <w:t>200\text{ rpm}</w:t>
+        <w:t>200 rpm</w:t>
       </w:r>
       <w:r>
         <w:rPr>
@@ -7046,10 +8032,26 @@
       <w:r>
         <w:rPr>
           <w:rFonts w:ascii="Georgia" w:hAnsi="Georgia"/>
-          <w:i/>
+          <w:i w:val="0"/>
           <w:color w:val="1B365D"/>
         </w:rPr>
-        <w:t>60^\circ\text{C}</w:t>
+        <w:t>60</w:t>
+      </w:r>
+      <w:r>
+        <w:rPr>
+          <w:rFonts w:ascii="Georgia" w:hAnsi="Georgia"/>
+          <w:color w:val="1B365D"/>
+          <w:vertAlign w:val="superscript"/>
+        </w:rPr>
+        <w:t>\</w:t>
+      </w:r>
+      <w:r>
+        <w:rPr>
+          <w:rFonts w:ascii="Georgia" w:hAnsi="Georgia"/>
+          <w:i w:val="0"/>
+          <w:color w:val="1B365D"/>
+        </w:rPr>
+        <w:t>circC</w:t>
       </w:r>
       <w:r>
         <w:rPr>
@@ -7060,10 +8062,10 @@
       <w:r>
         <w:rPr>
           <w:rFonts w:ascii="Georgia" w:hAnsi="Georgia"/>
-          <w:i/>
+          <w:i w:val="0"/>
           <w:color w:val="1B365D"/>
         </w:rPr>
-        <w:t>pH \approx 7.0</w:t>
+        <w:t>pH ≈ 7.0</w:t>
       </w:r>
       <w:r>
         <w:rPr>
@@ -7074,10 +8076,26 @@
       <w:r>
         <w:rPr>
           <w:rFonts w:ascii="Georgia" w:hAnsi="Georgia"/>
-          <w:i/>
+          <w:i w:val="0"/>
           <w:color w:val="1B365D"/>
         </w:rPr>
-        <w:t>80^\circ\text{C}</w:t>
+        <w:t>80</w:t>
+      </w:r>
+      <w:r>
+        <w:rPr>
+          <w:rFonts w:ascii="Georgia" w:hAnsi="Georgia"/>
+          <w:color w:val="1B365D"/>
+          <w:vertAlign w:val="superscript"/>
+        </w:rPr>
+        <w:t>\</w:t>
+      </w:r>
+      <w:r>
+        <w:rPr>
+          <w:rFonts w:ascii="Georgia" w:hAnsi="Georgia"/>
+          <w:i w:val="0"/>
+          <w:color w:val="1B365D"/>
+        </w:rPr>
+        <w:t>circC</w:t>
       </w:r>
       <w:r>
         <w:rPr>
@@ -7088,10 +8106,10 @@
       <w:r>
         <w:rPr>
           <w:rFonts w:ascii="Georgia" w:hAnsi="Georgia"/>
-          <w:i/>
+          <w:i w:val="0"/>
           <w:color w:val="1B365D"/>
         </w:rPr>
-        <w:t>12\text{ giờ}</w:t>
+        <w:t>12 giờ</w:t>
       </w:r>
       <w:r>
         <w:rPr>
@@ -7137,10 +8155,18 @@
       <w:r>
         <w:rPr>
           <w:rFonts w:ascii="Georgia" w:hAnsi="Georgia"/>
-          <w:i/>
+          <w:i w:val="0"/>
           <w:color w:val="1B365D"/>
         </w:rPr>
-        <w:t>N_2</w:t>
+        <w:t>N</w:t>
+      </w:r>
+      <w:r>
+        <w:rPr>
+          <w:rFonts w:ascii="Georgia" w:hAnsi="Georgia"/>
+          <w:color w:val="1B365D"/>
+          <w:vertAlign w:val="subscript"/>
+        </w:rPr>
+        <w:t>2</w:t>
       </w:r>
       <w:r>
         <w:rPr>
@@ -7163,10 +8189,26 @@
       <w:r>
         <w:rPr>
           <w:rFonts w:ascii="Georgia" w:hAnsi="Georgia"/>
-          <w:i/>
+          <w:i w:val="0"/>
           <w:color w:val="1B365D"/>
         </w:rPr>
-        <w:t>5^\circ\text{C/phút}</w:t>
+        <w:t>5</w:t>
+      </w:r>
+      <w:r>
+        <w:rPr>
+          <w:rFonts w:ascii="Georgia" w:hAnsi="Georgia"/>
+          <w:color w:val="1B365D"/>
+          <w:vertAlign w:val="superscript"/>
+        </w:rPr>
+        <w:t>\</w:t>
+      </w:r>
+      <w:r>
+        <w:rPr>
+          <w:rFonts w:ascii="Georgia" w:hAnsi="Georgia"/>
+          <w:i w:val="0"/>
+          <w:color w:val="1B365D"/>
+        </w:rPr>
+        <w:t>circC/phút</w:t>
       </w:r>
       <w:r>
         <w:rPr>
@@ -7190,10 +8232,18 @@
       <w:r>
         <w:rPr>
           <w:rFonts w:ascii="Georgia" w:hAnsi="Georgia"/>
-          <w:i/>
+          <w:i w:val="0"/>
           <w:color w:val="1B365D"/>
         </w:rPr>
-        <w:t>N_2</w:t>
+        <w:t>N</w:t>
+      </w:r>
+      <w:r>
+        <w:rPr>
+          <w:rFonts w:ascii="Georgia" w:hAnsi="Georgia"/>
+          <w:color w:val="1B365D"/>
+          <w:vertAlign w:val="subscript"/>
+        </w:rPr>
+        <w:t>2</w:t>
       </w:r>
       <w:r>
         <w:rPr>
@@ -7204,10 +8254,10 @@
       <w:r>
         <w:rPr>
           <w:rFonts w:ascii="Georgia" w:hAnsi="Georgia"/>
-          <w:i/>
+          <w:i w:val="0"/>
           <w:color w:val="1B365D"/>
         </w:rPr>
-        <w:t>100\text{ mL/phút}</w:t>
+        <w:t>100 mL/phút</w:t>
       </w:r>
       <w:r>
         <w:rPr>
@@ -7230,10 +8280,26 @@
       <w:r>
         <w:rPr>
           <w:rFonts w:ascii="Georgia" w:hAnsi="Georgia"/>
-          <w:i/>
+          <w:i w:val="0"/>
           <w:color w:val="1B365D"/>
         </w:rPr>
-        <w:t>&lt;50^\circ\text{C}</w:t>
+        <w:t>&lt;50</w:t>
+      </w:r>
+      <w:r>
+        <w:rPr>
+          <w:rFonts w:ascii="Georgia" w:hAnsi="Georgia"/>
+          <w:color w:val="1B365D"/>
+          <w:vertAlign w:val="superscript"/>
+        </w:rPr>
+        <w:t>\</w:t>
+      </w:r>
+      <w:r>
+        <w:rPr>
+          <w:rFonts w:ascii="Georgia" w:hAnsi="Georgia"/>
+          <w:i w:val="0"/>
+          <w:color w:val="1B365D"/>
+        </w:rPr>
+        <w:t>circC</w:t>
       </w:r>
       <w:r>
         <w:rPr>
@@ -7297,7 +8363,7 @@
       <w:r>
         <w:rPr>
           <w:rFonts w:ascii="Georgia" w:hAnsi="Georgia"/>
-          <w:i/>
+          <w:i w:val="0"/>
           <w:color w:val="1B365D"/>
         </w:rPr>
         <w:t>Fe/N</w:t>
@@ -7324,7 +8390,7 @@
       <w:r>
         <w:rPr>
           <w:rFonts w:ascii="Georgia" w:hAnsi="Georgia"/>
-          <w:i/>
+          <w:i w:val="0"/>
           <w:color w:val="1B365D"/>
         </w:rPr>
         <w:t>\alpha-Fe</w:t>
@@ -7338,10 +8404,26 @@
       <w:r>
         <w:rPr>
           <w:rFonts w:ascii="Georgia" w:hAnsi="Georgia"/>
-          <w:i/>
+          <w:i w:val="0"/>
           <w:color w:val="1B365D"/>
         </w:rPr>
-        <w:t>2\theta \approx 44.7^\circ</w:t>
+        <w:t>2\theta ≈ 44.7</w:t>
+      </w:r>
+      <w:r>
+        <w:rPr>
+          <w:rFonts w:ascii="Georgia" w:hAnsi="Georgia"/>
+          <w:color w:val="1B365D"/>
+          <w:vertAlign w:val="superscript"/>
+        </w:rPr>
+        <w:t>\</w:t>
+      </w:r>
+      <w:r>
+        <w:rPr>
+          <w:rFonts w:ascii="Georgia" w:hAnsi="Georgia"/>
+          <w:i w:val="0"/>
+          <w:color w:val="1B365D"/>
+        </w:rPr>
+        <w:t>circ</w:t>
       </w:r>
       <w:r>
         <w:rPr>
@@ -7352,10 +8434,26 @@
       <w:r>
         <w:rPr>
           <w:rFonts w:ascii="Georgia" w:hAnsi="Georgia"/>
-          <w:i/>
+          <w:i w:val="0"/>
           <w:color w:val="1B365D"/>
         </w:rPr>
-        <w:t>Fe_3C</w:t>
+        <w:t>Fe</w:t>
+      </w:r>
+      <w:r>
+        <w:rPr>
+          <w:rFonts w:ascii="Georgia" w:hAnsi="Georgia"/>
+          <w:color w:val="1B365D"/>
+          <w:vertAlign w:val="subscript"/>
+        </w:rPr>
+        <w:t>3</w:t>
+      </w:r>
+      <w:r>
+        <w:rPr>
+          <w:rFonts w:ascii="Georgia" w:hAnsi="Georgia"/>
+          <w:i w:val="0"/>
+          <w:color w:val="1B365D"/>
+        </w:rPr>
+        <w:t>C</w:t>
       </w:r>
       <w:r>
         <w:rPr>
@@ -7366,10 +8464,26 @@
       <w:r>
         <w:rPr>
           <w:rFonts w:ascii="Georgia" w:hAnsi="Georgia"/>
-          <w:i/>
+          <w:i w:val="0"/>
           <w:color w:val="1B365D"/>
         </w:rPr>
-        <w:t>2\theta \approx 43.9^\circ</w:t>
+        <w:t>2\theta ≈ 43.9</w:t>
+      </w:r>
+      <w:r>
+        <w:rPr>
+          <w:rFonts w:ascii="Georgia" w:hAnsi="Georgia"/>
+          <w:color w:val="1B365D"/>
+          <w:vertAlign w:val="superscript"/>
+        </w:rPr>
+        <w:t>\</w:t>
+      </w:r>
+      <w:r>
+        <w:rPr>
+          <w:rFonts w:ascii="Georgia" w:hAnsi="Georgia"/>
+          <w:i w:val="0"/>
+          <w:color w:val="1B365D"/>
+        </w:rPr>
+        <w:t>circ</w:t>
       </w:r>
       <w:r>
         <w:rPr>
@@ -7405,7 +8519,7 @@
       <w:r>
         <w:rPr>
           <w:rFonts w:ascii="Georgia" w:hAnsi="Georgia"/>
-          <w:i/>
+          <w:i w:val="0"/>
           <w:color w:val="1B365D"/>
         </w:rPr>
         <w:t>Fe</w:t>
@@ -7494,10 +8608,10 @@
       <w:r>
         <w:rPr>
           <w:rFonts w:ascii="Georgia" w:hAnsi="Georgia"/>
-          <w:i/>
+          <w:i w:val="0"/>
           <w:color w:val="1B365D"/>
         </w:rPr>
-        <w:t>N:Fe \ge 4:1</w:t>
+        <w:t>N:Fe ≥ 4:1</w:t>
       </w:r>
       <w:r>
         <w:rPr>
@@ -7573,10 +8687,34 @@
       <w:r>
         <w:rPr>
           <w:rFonts w:ascii="Georgia" w:hAnsi="Georgia"/>
-          <w:i/>
+          <w:i w:val="0"/>
           <w:color w:val="1B365D"/>
         </w:rPr>
-        <w:t>Al_2O_3</w:t>
+        <w:t>Al</w:t>
+      </w:r>
+      <w:r>
+        <w:rPr>
+          <w:rFonts w:ascii="Georgia" w:hAnsi="Georgia"/>
+          <w:color w:val="1B365D"/>
+          <w:vertAlign w:val="subscript"/>
+        </w:rPr>
+        <w:t>2</w:t>
+      </w:r>
+      <w:r>
+        <w:rPr>
+          <w:rFonts w:ascii="Georgia" w:hAnsi="Georgia"/>
+          <w:i w:val="0"/>
+          <w:color w:val="1B365D"/>
+        </w:rPr>
+        <w:t>O</w:t>
+      </w:r>
+      <w:r>
+        <w:rPr>
+          <w:rFonts w:ascii="Georgia" w:hAnsi="Georgia"/>
+          <w:color w:val="1B365D"/>
+          <w:vertAlign w:val="subscript"/>
+        </w:rPr>
+        <w:t>3</w:t>
       </w:r>
       <w:r>
         <w:rPr>
@@ -7587,10 +8725,10 @@
       <w:r>
         <w:rPr>
           <w:rFonts w:ascii="Georgia" w:hAnsi="Georgia"/>
-          <w:i/>
+          <w:i w:val="0"/>
           <w:color w:val="1B365D"/>
         </w:rPr>
-        <w:t>0.05\text{ }\mu\text{m}</w:t>
+        <w:t>0.05 \mum</w:t>
       </w:r>
       <w:r>
         <w:rPr>
@@ -7915,7 +9053,7 @@
       <w:r>
         <w:rPr>
           <w:rFonts w:ascii="Georgia" w:hAnsi="Georgia"/>
-          <w:i/>
+          <w:i w:val="0"/>
           <w:color w:val="1B365D"/>
         </w:rPr>
         <w:t>Fe/N</w:t>
@@ -7992,10 +9130,10 @@
       <w:r>
         <w:rPr>
           <w:rFonts w:ascii="Georgia" w:hAnsi="Georgia"/>
-          <w:i/>
+          <w:i w:val="0"/>
           <w:color w:val="1B365D"/>
         </w:rPr>
-        <w:t>1000\text{ }\mu\text{L}</w:t>
+        <w:t>1000 \muL</w:t>
       </w:r>
       <w:r>
         <w:rPr>
@@ -8066,10 +9204,10 @@
       <w:r>
         <w:rPr>
           <w:rFonts w:ascii="Georgia" w:hAnsi="Georgia"/>
-          <w:i/>
+          <w:i w:val="0"/>
           <w:color w:val="1B365D"/>
         </w:rPr>
-        <w:t>1\text{ vol}\%</w:t>
+        <w:t>1 vol\%</w:t>
       </w:r>
       <w:r>
         <w:rPr>
@@ -8251,10 +9389,26 @@
       <w:r>
         <w:rPr>
           <w:rFonts w:ascii="Georgia" w:hAnsi="Georgia"/>
-          <w:i/>
+          <w:i w:val="0"/>
           <w:color w:val="1B365D"/>
         </w:rPr>
-        <w:t>25^\circ\text{C}</w:t>
+        <w:t>25</w:t>
+      </w:r>
+      <w:r>
+        <w:rPr>
+          <w:rFonts w:ascii="Georgia" w:hAnsi="Georgia"/>
+          <w:color w:val="1B365D"/>
+          <w:vertAlign w:val="superscript"/>
+        </w:rPr>
+        <w:t>\</w:t>
+      </w:r>
+      <w:r>
+        <w:rPr>
+          <w:rFonts w:ascii="Georgia" w:hAnsi="Georgia"/>
+          <w:i w:val="0"/>
+          <w:color w:val="1B365D"/>
+        </w:rPr>
+        <w:t>circC</w:t>
       </w:r>
       <w:r>
         <w:rPr>
@@ -8388,7 +9542,7 @@
       <w:r>
         <w:rPr>
           <w:rFonts w:ascii="Georgia" w:hAnsi="Georgia"/>
-          <w:i/>
+          <w:i w:val="0"/>
           <w:color w:val="1B365D"/>
         </w:rPr>
         <w:t>Fe/N</w:t>
@@ -8426,10 +9580,10 @@
       <w:r>
         <w:rPr>
           <w:rFonts w:ascii="Georgia" w:hAnsi="Georgia"/>
-          <w:i/>
+          <w:i w:val="0"/>
           <w:color w:val="1B365D"/>
         </w:rPr>
-        <w:t>0.1\text{ M}</w:t>
+        <w:t>0.1 M</w:t>
       </w:r>
       <w:r>
         <w:rPr>
@@ -8440,7 +9594,7 @@
       <w:r>
         <w:rPr>
           <w:rFonts w:ascii="Georgia" w:hAnsi="Georgia"/>
-          <w:i/>
+          <w:i w:val="0"/>
           <w:color w:val="1B365D"/>
         </w:rPr>
         <w:t>pH = 4.5</w:t>
@@ -8634,7 +9788,7 @@
             <w:r>
               <w:rPr>
                 <w:rFonts w:ascii="Georgia" w:hAnsi="Georgia"/>
-                <w:i/>
+                <w:i w:val="0"/>
                 <w:color w:val="1B365D"/>
               </w:rPr>
               <w:t>Ag/AgCl</w:t>
@@ -8725,10 +9879,10 @@
             <w:r>
               <w:rPr>
                 <w:rFonts w:ascii="Georgia" w:hAnsi="Georgia"/>
-                <w:i/>
+                <w:i w:val="0"/>
                 <w:color w:val="1B365D"/>
               </w:rPr>
-              <w:t>400\text{ rpm}</w:t>
+              <w:t>400 rpm</w:t>
             </w:r>
             <w:r>
               <w:rPr>
@@ -8895,7 +10049,7 @@
             <w:r>
               <w:rPr>
                 <w:rFonts w:ascii="Georgia" w:hAnsi="Georgia"/>
-                <w:i/>
+                <w:i w:val="0"/>
                 <w:color w:val="1B365D"/>
               </w:rPr>
               <w:t>Ag/AgCl</w:t>
@@ -9217,7 +10371,7 @@
             <w:r>
               <w:rPr>
                 <w:rFonts w:ascii="Georgia" w:hAnsi="Georgia"/>
-                <w:i/>
+                <w:i w:val="0"/>
                 <w:color w:val="1B365D"/>
               </w:rPr>
               <w:t>Ag/AgCl</w:t>
@@ -9231,10 +10385,10 @@
             <w:r>
               <w:rPr>
                 <w:rFonts w:ascii="Georgia" w:hAnsi="Georgia"/>
-                <w:i/>
+                <w:i w:val="0"/>
                 <w:color w:val="1B365D"/>
               </w:rPr>
-              <w:t>30\text{ giây}</w:t>
+              <w:t>30 giây</w:t>
             </w:r>
             <w:r>
               <w:rPr>
@@ -9245,10 +10399,10 @@
             <w:r>
               <w:rPr>
                 <w:rFonts w:ascii="Georgia" w:hAnsi="Georgia"/>
-                <w:i/>
+                <w:i w:val="0"/>
                 <w:color w:val="1B365D"/>
               </w:rPr>
-              <w:t>600\text{ rpm}</w:t>
+              <w:t>600 rpm</w:t>
             </w:r>
             <w:r>
               <w:rPr>
@@ -9339,10 +10493,10 @@
       <w:r>
         <w:rPr>
           <w:rFonts w:ascii="Georgia" w:hAnsi="Georgia"/>
-          <w:i/>
+          <w:i w:val="0"/>
           <w:color w:val="1B365D"/>
         </w:rPr>
-        <w:t>0.1\text{ M}</w:t>
+        <w:t>0.1 M</w:t>
       </w:r>
       <w:r>
         <w:rPr>
@@ -9353,7 +10507,7 @@
       <w:r>
         <w:rPr>
           <w:rFonts w:ascii="Georgia" w:hAnsi="Georgia"/>
-          <w:i/>
+          <w:i w:val="0"/>
           <w:color w:val="1B365D"/>
         </w:rPr>
         <w:t>pH = 4.5</w:t>
@@ -9428,10 +10582,10 @@
       <w:r>
         <w:rPr>
           <w:rFonts w:ascii="Georgia" w:hAnsi="Georgia"/>
-          <w:i/>
+          <w:i w:val="0"/>
           <w:color w:val="1B365D"/>
         </w:rPr>
-        <w:t>400\text{ rpm}</w:t>
+        <w:t>400 rpm</w:t>
       </w:r>
       <w:r>
         <w:rPr>
@@ -9454,10 +10608,10 @@
       <w:r>
         <w:rPr>
           <w:rFonts w:ascii="Georgia" w:hAnsi="Georgia"/>
-          <w:i/>
+          <w:i w:val="0"/>
           <w:color w:val="1B365D"/>
         </w:rPr>
-        <w:t>10\text{ giây}</w:t>
+        <w:t>10 giây</w:t>
       </w:r>
       <w:r>
         <w:rPr>
@@ -9493,7 +10647,7 @@
       <w:r>
         <w:rPr>
           <w:rFonts w:ascii="Georgia" w:hAnsi="Georgia"/>
-          <w:i/>
+          <w:i w:val="0"/>
           <w:color w:val="1B365D"/>
         </w:rPr>
         <w:t>Ag/AgCl</w:t>
@@ -9960,10 +11114,10 @@
       <w:r>
         <w:rPr>
           <w:rFonts w:ascii="Georgia" w:hAnsi="Georgia"/>
-          <w:i/>
+          <w:i w:val="0"/>
           <w:color w:val="1B365D"/>
         </w:rPr>
-        <w:t>0.1\text{ M}</w:t>
+        <w:t>0.1 M</w:t>
       </w:r>
       <w:r>
         <w:rPr>
@@ -9974,7 +11128,7 @@
       <w:r>
         <w:rPr>
           <w:rFonts w:ascii="Georgia" w:hAnsi="Georgia"/>
-          <w:i/>
+          <w:i w:val="0"/>
           <w:color w:val="1B365D"/>
         </w:rPr>
         <w:t>pH = 4.5</w:t>
@@ -10049,7 +11203,7 @@
       <w:r>
         <w:rPr>
           <w:rFonts w:ascii="Georgia" w:hAnsi="Georgia"/>
-          <w:i/>
+          <w:i w:val="0"/>
           <w:color w:val="1B365D"/>
         </w:rPr>
         <w:t>HER</w:t>
@@ -10075,10 +11229,10 @@
       <w:r>
         <w:rPr>
           <w:rFonts w:ascii="Georgia" w:hAnsi="Georgia"/>
-          <w:i/>
+          <w:i w:val="0"/>
           <w:color w:val="1B365D"/>
         </w:rPr>
-        <w:t>10\text{ giây}</w:t>
+        <w:t>10 giây</w:t>
       </w:r>
       <w:r>
         <w:rPr>
@@ -10114,7 +11268,7 @@
       <w:r>
         <w:rPr>
           <w:rFonts w:ascii="Georgia" w:hAnsi="Georgia"/>
-          <w:i/>
+          <w:i w:val="0"/>
           <w:color w:val="1B365D"/>
         </w:rPr>
         <w:t>Ag/AgCl</w:t>
@@ -10219,10 +11373,10 @@
       <w:r>
         <w:rPr>
           <w:rFonts w:ascii="Georgia" w:hAnsi="Georgia"/>
-          <w:i/>
+          <w:i w:val="0"/>
           <w:color w:val="1B365D"/>
         </w:rPr>
-        <w:t>0.1\text{ M}</w:t>
+        <w:t>0.1 M</w:t>
       </w:r>
       <w:r>
         <w:rPr>
@@ -10233,7 +11387,7 @@
       <w:r>
         <w:rPr>
           <w:rFonts w:ascii="Georgia" w:hAnsi="Georgia"/>
-          <w:i/>
+          <w:i w:val="0"/>
           <w:color w:val="1B365D"/>
         </w:rPr>
         <w:t>pH = 7.0 - 7.4</w:t>
@@ -10504,7 +11658,7 @@
             <w:r>
               <w:rPr>
                 <w:rFonts w:ascii="Georgia" w:hAnsi="Georgia"/>
-                <w:i/>
+                <w:i w:val="0"/>
                 <w:color w:val="1B365D"/>
               </w:rPr>
               <w:t>Ag/AgCl</w:t>
@@ -10865,7 +12019,7 @@
       <w:r>
         <w:rPr>
           <w:rFonts w:ascii="Georgia" w:hAnsi="Georgia"/>
-          <w:i/>
+          <w:i w:val="0"/>
           <w:color w:val="1B365D"/>
         </w:rPr>
         <w:t>Ag/AgCl</w:t>
@@ -10945,7 +12099,7 @@
       <w:r>
         <w:rPr>
           <w:rFonts w:ascii="Georgia" w:hAnsi="Georgia"/>
-          <w:i/>
+          <w:i w:val="0"/>
           <w:color w:val="1B365D"/>
         </w:rPr>
         <w:t>Fe/N</w:t>
@@ -11031,10 +12185,18 @@
       <w:r>
         <w:rPr>
           <w:rFonts w:ascii="Georgia" w:hAnsi="Georgia"/>
-          <w:i/>
+          <w:i w:val="0"/>
           <w:color w:val="1B365D"/>
         </w:rPr>
-        <w:t>N_2</w:t>
+        <w:t>N</w:t>
+      </w:r>
+      <w:r>
+        <w:rPr>
+          <w:rFonts w:ascii="Georgia" w:hAnsi="Georgia"/>
+          <w:color w:val="1B365D"/>
+          <w:vertAlign w:val="subscript"/>
+        </w:rPr>
+        <w:t>2</w:t>
       </w:r>
       <w:r>
         <w:rPr>
@@ -11045,10 +12207,10 @@
       <w:r>
         <w:rPr>
           <w:rFonts w:ascii="Georgia" w:hAnsi="Georgia"/>
-          <w:i/>
+          <w:i w:val="0"/>
           <w:color w:val="1B365D"/>
         </w:rPr>
-        <w:t>30\text{ phút}</w:t>
+        <w:t>30 phút</w:t>
       </w:r>
       <w:r>
         <w:rPr>
@@ -11072,10 +12234,10 @@
       <w:r>
         <w:rPr>
           <w:rFonts w:ascii="Georgia" w:hAnsi="Georgia"/>
-          <w:i/>
+          <w:i w:val="0"/>
           <w:color w:val="1B365D"/>
         </w:rPr>
-        <w:t>50\text{ mV/s}</w:t>
+        <w:t>50 mV/s</w:t>
       </w:r>
       <w:r>
         <w:rPr>
@@ -11098,10 +12260,18 @@
       <w:r>
         <w:rPr>
           <w:rFonts w:ascii="Georgia" w:hAnsi="Georgia"/>
-          <w:i/>
+          <w:i w:val="0"/>
           <w:color w:val="1B365D"/>
         </w:rPr>
-        <w:t>O_2</w:t>
+        <w:t>O</w:t>
+      </w:r>
+      <w:r>
+        <w:rPr>
+          <w:rFonts w:ascii="Georgia" w:hAnsi="Georgia"/>
+          <w:color w:val="1B365D"/>
+          <w:vertAlign w:val="subscript"/>
+        </w:rPr>
+        <w:t>2</w:t>
       </w:r>
       <w:r>
         <w:rPr>
@@ -11112,10 +12282,10 @@
       <w:r>
         <w:rPr>
           <w:rFonts w:ascii="Georgia" w:hAnsi="Georgia"/>
-          <w:i/>
+          <w:i w:val="0"/>
           <w:color w:val="1B365D"/>
         </w:rPr>
-        <w:t>30\text{ phút}</w:t>
+        <w:t>30 phút</w:t>
       </w:r>
       <w:r>
         <w:rPr>
@@ -11164,10 +12334,10 @@
       <w:r>
         <w:rPr>
           <w:rFonts w:ascii="Georgia" w:hAnsi="Georgia"/>
-          <w:i/>
+          <w:i w:val="0"/>
           <w:color w:val="1B365D"/>
         </w:rPr>
-        <w:t>400\text{ rpm}</w:t>
+        <w:t>400 rpm</w:t>
       </w:r>
       <w:r>
         <w:rPr>
@@ -11178,10 +12348,10 @@
       <w:r>
         <w:rPr>
           <w:rFonts w:ascii="Georgia" w:hAnsi="Georgia"/>
-          <w:i/>
+          <w:i w:val="0"/>
           <w:color w:val="1B365D"/>
         </w:rPr>
-        <w:t>3600\text{ rpm}</w:t>
+        <w:t>3600 rpm</w:t>
       </w:r>
       <w:r>
         <w:rPr>
@@ -11192,10 +12362,10 @@
       <w:r>
         <w:rPr>
           <w:rFonts w:ascii="Georgia" w:hAnsi="Georgia"/>
-          <w:i/>
+          <w:i w:val="0"/>
           <w:color w:val="1B365D"/>
         </w:rPr>
-        <w:t>n \approx 3.14 - 3.69</w:t>
+        <w:t>n ≈ 3.14 - 3.69</w:t>
       </w:r>
       <w:r>
         <w:rPr>
@@ -11246,7 +12416,7 @@
       <w:r>
         <w:rPr>
           <w:rFonts w:ascii="Georgia" w:hAnsi="Georgia"/>
-          <w:i/>
+          <w:i w:val="0"/>
           <w:color w:val="1B365D"/>
         </w:rPr>
         <w:t>NaOH</w:t>
@@ -11332,7 +12502,7 @@
       <w:r>
         <w:rPr>
           <w:rFonts w:ascii="Georgia" w:hAnsi="Georgia"/>
-          <w:i/>
+          <w:i w:val="0"/>
           <w:color w:val="1B365D"/>
         </w:rPr>
         <w:t>KOH</w:t>
@@ -11346,10 +12516,10 @@
       <w:r>
         <w:rPr>
           <w:rFonts w:ascii="Georgia" w:hAnsi="Georgia"/>
-          <w:i/>
+          <w:i w:val="0"/>
           <w:color w:val="1B365D"/>
         </w:rPr>
-        <w:t>6.0\text{ M}</w:t>
+        <w:t>6.0 M</w:t>
       </w:r>
       <w:r>
         <w:rPr>
@@ -11360,10 +12530,10 @@
       <w:r>
         <w:rPr>
           <w:rFonts w:ascii="Georgia" w:hAnsi="Georgia"/>
-          <w:i/>
+          <w:i w:val="0"/>
           <w:color w:val="1B365D"/>
         </w:rPr>
-        <w:t>5 - 100\text{ mV/s}</w:t>
+        <w:t>5 - 100 mV/s</w:t>
       </w:r>
       <w:r>
         <w:rPr>
@@ -11374,10 +12544,10 @@
       <w:r>
         <w:rPr>
           <w:rFonts w:ascii="Georgia" w:hAnsi="Georgia"/>
-          <w:i/>
+          <w:i w:val="0"/>
           <w:color w:val="1B365D"/>
         </w:rPr>
-        <w:t>-1.0\text{ V} \rightarrow 0.0\text{ V}</w:t>
+        <w:t>-1.0 V \rightarrow 0.0 V</w:t>
       </w:r>
       <w:r>
         <w:rPr>
@@ -11388,7 +12558,7 @@
       <w:r>
         <w:rPr>
           <w:rFonts w:ascii="Georgia" w:hAnsi="Georgia"/>
-          <w:i/>
+          <w:i w:val="0"/>
           <w:color w:val="1B365D"/>
         </w:rPr>
         <w:t>Ag/AgCl</w:t>
@@ -11427,10 +12597,10 @@
       <w:r>
         <w:rPr>
           <w:rFonts w:ascii="Georgia" w:hAnsi="Georgia"/>
-          <w:i/>
+          <w:i w:val="0"/>
           <w:color w:val="1B365D"/>
         </w:rPr>
-        <w:t>0.5 - 10\text{ A/g}</w:t>
+        <w:t>0.5 - 10 A/g</w:t>
       </w:r>
       <w:r>
         <w:rPr>
@@ -11444,7 +12614,23 @@
           <w:i/>
           <w:color w:val="1B365D"/>
         </w:rPr>
-        <w:t>C_s\text{ F/g}</w:t>
+        <w:t>C</w:t>
+      </w:r>
+      <w:r>
+        <w:rPr>
+          <w:rFonts w:ascii="Georgia" w:hAnsi="Georgia"/>
+          <w:color w:val="1B365D"/>
+          <w:vertAlign w:val="subscript"/>
+        </w:rPr>
+        <w:t>s</w:t>
+      </w:r>
+      <w:r>
+        <w:rPr>
+          <w:rFonts w:ascii="Georgia" w:hAnsi="Georgia"/>
+          <w:i/>
+          <w:color w:val="1B365D"/>
+        </w:rPr>
+        <w:t xml:space="preserve"> F/g</w:t>
       </w:r>
       <w:r>
         <w:rPr>
@@ -11758,7 +12944,7 @@
             <w:r>
               <w:rPr>
                 <w:rFonts w:ascii="Georgia" w:hAnsi="Georgia"/>
-                <w:i/>
+                <w:i w:val="0"/>
                 <w:color w:val="1B365D"/>
               </w:rPr>
               <w:t>NaOH</w:t>
@@ -11838,7 +13024,7 @@
             <w:r>
               <w:rPr>
                 <w:rFonts w:ascii="Georgia" w:hAnsi="Georgia"/>
-                <w:i/>
+                <w:i w:val="0"/>
                 <w:color w:val="1B365D"/>
               </w:rPr>
               <w:t>Fe</w:t>
@@ -11889,10 +13075,26 @@
             <w:r>
               <w:rPr>
                 <w:rFonts w:ascii="Georgia" w:hAnsi="Georgia"/>
-                <w:i/>
+                <w:i w:val="0"/>
                 <w:color w:val="1B365D"/>
               </w:rPr>
-              <w:t>Fe_3C</w:t>
+              <w:t>Fe</w:t>
+            </w:r>
+            <w:r>
+              <w:rPr>
+                <w:rFonts w:ascii="Georgia" w:hAnsi="Georgia"/>
+                <w:color w:val="1B365D"/>
+                <w:vertAlign w:val="subscript"/>
+              </w:rPr>
+              <w:t>3</w:t>
+            </w:r>
+            <w:r>
+              <w:rPr>
+                <w:rFonts w:ascii="Georgia" w:hAnsi="Georgia"/>
+                <w:i w:val="0"/>
+                <w:color w:val="1B365D"/>
+              </w:rPr>
+              <w:t>C</w:t>
             </w:r>
             <w:r>
               <w:rPr>
@@ -11903,10 +13105,10 @@
             <w:r>
               <w:rPr>
                 <w:rFonts w:ascii="Georgia" w:hAnsi="Georgia"/>
-                <w:i/>
+                <w:i w:val="0"/>
                 <w:color w:val="1B365D"/>
               </w:rPr>
-              <w:t>&gt; 5\text{ nm}</w:t>
+              <w:t>&gt; 5 nm</w:t>
             </w:r>
             <w:r>
               <w:rPr>
@@ -11917,7 +13119,7 @@
             <w:r>
               <w:rPr>
                 <w:rFonts w:ascii="Georgia" w:hAnsi="Georgia"/>
-                <w:i/>
+                <w:i w:val="0"/>
                 <w:color w:val="1B365D"/>
               </w:rPr>
               <w:t>Fe</w:t>
@@ -12072,10 +13274,26 @@
             <w:r>
               <w:rPr>
                 <w:rFonts w:ascii="Georgia" w:hAnsi="Georgia"/>
-                <w:i/>
+                <w:i w:val="0"/>
                 <w:color w:val="1B365D"/>
               </w:rPr>
-              <w:t>P/P_0 = 0.4 - 0.9</w:t>
+              <w:t>P/P</w:t>
+            </w:r>
+            <w:r>
+              <w:rPr>
+                <w:rFonts w:ascii="Georgia" w:hAnsi="Georgia"/>
+                <w:color w:val="1B365D"/>
+                <w:vertAlign w:val="subscript"/>
+              </w:rPr>
+              <w:t>0</w:t>
+            </w:r>
+            <w:r>
+              <w:rPr>
+                <w:rFonts w:ascii="Georgia" w:hAnsi="Georgia"/>
+                <w:i w:val="0"/>
+                <w:color w:val="1B365D"/>
+              </w:rPr>
+              <w:t xml:space="preserve"> = 0.4 - 0.9</w:t>
             </w:r>
             <w:r>
               <w:rPr>
@@ -12240,13 +13458,15 @@
                 <w:i/>
                 <w:color w:val="1B365D"/>
               </w:rPr>
-              <w:t>S_{BET} &lt; 1000\text{ m}^2/\text{g}</w:t>
-            </w:r>
-            <w:r>
-              <w:rPr>
-                <w:rFonts w:ascii="Arial" w:hAnsi="Arial"/>
-              </w:rPr>
-              <w:t xml:space="preserve"> (tụt sâu về </w:t>
+              <w:t>S</w:t>
+            </w:r>
+            <w:r>
+              <w:rPr>
+                <w:rFonts w:ascii="Georgia" w:hAnsi="Georgia"/>
+                <w:color w:val="1B365D"/>
+                <w:vertAlign w:val="subscript"/>
+              </w:rPr>
+              <w:t>BET</w:t>
             </w:r>
             <w:r>
               <w:rPr>
@@ -12254,18 +13474,64 @@
                 <w:i/>
                 <w:color w:val="1B365D"/>
               </w:rPr>
-              <w:t>150\text{ m}^2/\text{g}</w:t>
-            </w:r>
-            <w:r>
-              <w:rPr>
-                <w:rFonts w:ascii="Arial" w:hAnsi="Arial"/>
-              </w:rPr>
-              <w:t xml:space="preserve"> đối với mẫu đối chứng </w:t>
+              <w:t xml:space="preserve"> &lt; 1000 m</w:t>
+            </w:r>
+            <w:r>
+              <w:rPr>
+                <w:rFonts w:ascii="Georgia" w:hAnsi="Georgia"/>
+                <w:color w:val="1B365D"/>
+                <w:vertAlign w:val="superscript"/>
+              </w:rPr>
+              <w:t>2</w:t>
             </w:r>
             <w:r>
               <w:rPr>
                 <w:rFonts w:ascii="Georgia" w:hAnsi="Georgia"/>
                 <w:i/>
+                <w:color w:val="1B365D"/>
+              </w:rPr>
+              <w:t>/g</w:t>
+            </w:r>
+            <w:r>
+              <w:rPr>
+                <w:rFonts w:ascii="Arial" w:hAnsi="Arial"/>
+              </w:rPr>
+              <w:t xml:space="preserve"> (tụt sâu về </w:t>
+            </w:r>
+            <w:r>
+              <w:rPr>
+                <w:rFonts w:ascii="Georgia" w:hAnsi="Georgia"/>
+                <w:i w:val="0"/>
+                <w:color w:val="1B365D"/>
+              </w:rPr>
+              <w:t>150 m</w:t>
+            </w:r>
+            <w:r>
+              <w:rPr>
+                <w:rFonts w:ascii="Georgia" w:hAnsi="Georgia"/>
+                <w:color w:val="1B365D"/>
+                <w:vertAlign w:val="superscript"/>
+              </w:rPr>
+              <w:t>2</w:t>
+            </w:r>
+            <w:r>
+              <w:rPr>
+                <w:rFonts w:ascii="Georgia" w:hAnsi="Georgia"/>
+                <w:i w:val="0"/>
+                <w:color w:val="1B365D"/>
+              </w:rPr>
+              <w:t>/g</w:t>
+            </w:r>
+            <w:r>
+              <w:rPr>
+                <w:rFonts w:ascii="Arial" w:hAnsi="Arial"/>
+              </w:rPr>
+              <w:t xml:space="preserve"> đối với mẫu đối chứng </w:t>
+            </w:r>
+            <w:r>
+              <w:rPr>
+                <w:rFonts w:ascii="Georgia" w:hAnsi="Georgia"/>
+                <w:i w:val="0"/>
                 <w:color w:val="1B365D"/>
               </w:rPr>
               <w:t>NaOH</w:t>
@@ -12408,7 +13674,39 @@
                 <w:i/>
                 <w:color w:val="1B365D"/>
               </w:rPr>
-              <w:t>V_{pore} &lt; 1.0\text{ cm}^3/\text{g}</w:t>
+              <w:t>V</w:t>
+            </w:r>
+            <w:r>
+              <w:rPr>
+                <w:rFonts w:ascii="Georgia" w:hAnsi="Georgia"/>
+                <w:color w:val="1B365D"/>
+                <w:vertAlign w:val="subscript"/>
+              </w:rPr>
+              <w:t>pore</w:t>
+            </w:r>
+            <w:r>
+              <w:rPr>
+                <w:rFonts w:ascii="Georgia" w:hAnsi="Georgia"/>
+                <w:i/>
+                <w:color w:val="1B365D"/>
+              </w:rPr>
+              <w:t xml:space="preserve"> &lt; 1.0 cm</w:t>
+            </w:r>
+            <w:r>
+              <w:rPr>
+                <w:rFonts w:ascii="Georgia" w:hAnsi="Georgia"/>
+                <w:color w:val="1B365D"/>
+                <w:vertAlign w:val="superscript"/>
+              </w:rPr>
+              <w:t>3</w:t>
+            </w:r>
+            <w:r>
+              <w:rPr>
+                <w:rFonts w:ascii="Georgia" w:hAnsi="Georgia"/>
+                <w:i/>
+                <w:color w:val="1B365D"/>
+              </w:rPr>
+              <w:t>/g</w:t>
             </w:r>
             <w:r>
               <w:rPr>
@@ -12548,10 +13846,10 @@
             <w:r>
               <w:rPr>
                 <w:rFonts w:ascii="Georgia" w:hAnsi="Georgia"/>
-                <w:i/>
+                <w:i w:val="0"/>
                 <w:color w:val="1B365D"/>
               </w:rPr>
-              <w:t>&gt; 100\text{ nm}</w:t>
+              <w:t>&gt; 100 nm</w:t>
             </w:r>
             <w:r>
               <w:rPr>
@@ -12692,18 +13990,50 @@
                 <w:i/>
                 <w:color w:val="1B365D"/>
               </w:rPr>
-              <w:t>I_D / I_G &lt; 0.6</w:t>
-            </w:r>
-            <w:r>
-              <w:rPr>
-                <w:rFonts w:ascii="Arial" w:hAnsi="Arial"/>
-              </w:rPr>
-              <w:t xml:space="preserve"> hoặc </w:t>
+              <w:t>I</w:t>
+            </w:r>
+            <w:r>
+              <w:rPr>
+                <w:rFonts w:ascii="Georgia" w:hAnsi="Georgia"/>
+                <w:color w:val="1B365D"/>
+                <w:vertAlign w:val="subscript"/>
+              </w:rPr>
+              <w:t>D</w:t>
             </w:r>
             <w:r>
               <w:rPr>
                 <w:rFonts w:ascii="Georgia" w:hAnsi="Georgia"/>
                 <w:i/>
+                <w:color w:val="1B365D"/>
+              </w:rPr>
+              <w:t xml:space="preserve"> / I</w:t>
+            </w:r>
+            <w:r>
+              <w:rPr>
+                <w:rFonts w:ascii="Georgia" w:hAnsi="Georgia"/>
+                <w:color w:val="1B365D"/>
+                <w:vertAlign w:val="subscript"/>
+              </w:rPr>
+              <w:t>G</w:t>
+            </w:r>
+            <w:r>
+              <w:rPr>
+                <w:rFonts w:ascii="Georgia" w:hAnsi="Georgia"/>
+                <w:i/>
+                <w:color w:val="1B365D"/>
+              </w:rPr>
+              <w:t xml:space="preserve"> &lt; 0.6</w:t>
+            </w:r>
+            <w:r>
+              <w:rPr>
+                <w:rFonts w:ascii="Arial" w:hAnsi="Arial"/>
+              </w:rPr>
+              <w:t xml:space="preserve"> hoặc </w:t>
+            </w:r>
+            <w:r>
+              <w:rPr>
+                <w:rFonts w:ascii="Georgia" w:hAnsi="Georgia"/>
+                <w:i w:val="0"/>
                 <w:color w:val="1B365D"/>
               </w:rPr>
               <w:t>&gt; 1.5</w:t>
@@ -12859,7 +14189,7 @@
             <w:r>
               <w:rPr>
                 <w:rFonts w:ascii="Georgia" w:hAnsi="Georgia"/>
-                <w:i/>
+                <w:i w:val="0"/>
                 <w:color w:val="1B365D"/>
               </w:rPr>
               <w:t>\alpha-Fe</w:t>
@@ -12873,10 +14203,26 @@
             <w:r>
               <w:rPr>
                 <w:rFonts w:ascii="Georgia" w:hAnsi="Georgia"/>
-                <w:i/>
+                <w:i w:val="0"/>
                 <w:color w:val="1B365D"/>
               </w:rPr>
-              <w:t>44.7^\circ</w:t>
+              <w:t>44.7</w:t>
+            </w:r>
+            <w:r>
+              <w:rPr>
+                <w:rFonts w:ascii="Georgia" w:hAnsi="Georgia"/>
+                <w:color w:val="1B365D"/>
+                <w:vertAlign w:val="superscript"/>
+              </w:rPr>
+              <w:t>\</w:t>
+            </w:r>
+            <w:r>
+              <w:rPr>
+                <w:rFonts w:ascii="Georgia" w:hAnsi="Georgia"/>
+                <w:i w:val="0"/>
+                <w:color w:val="1B365D"/>
+              </w:rPr>
+              <w:t>circ</w:t>
             </w:r>
             <w:r>
               <w:rPr>
@@ -12887,10 +14233,26 @@
             <w:r>
               <w:rPr>
                 <w:rFonts w:ascii="Georgia" w:hAnsi="Georgia"/>
-                <w:i/>
+                <w:i w:val="0"/>
                 <w:color w:val="1B365D"/>
               </w:rPr>
-              <w:t>Fe_3C</w:t>
+              <w:t>Fe</w:t>
+            </w:r>
+            <w:r>
+              <w:rPr>
+                <w:rFonts w:ascii="Georgia" w:hAnsi="Georgia"/>
+                <w:color w:val="1B365D"/>
+                <w:vertAlign w:val="subscript"/>
+              </w:rPr>
+              <w:t>3</w:t>
+            </w:r>
+            <w:r>
+              <w:rPr>
+                <w:rFonts w:ascii="Georgia" w:hAnsi="Georgia"/>
+                <w:i w:val="0"/>
+                <w:color w:val="1B365D"/>
+              </w:rPr>
+              <w:t>C</w:t>
             </w:r>
             <w:r>
               <w:rPr>
@@ -12901,10 +14263,26 @@
             <w:r>
               <w:rPr>
                 <w:rFonts w:ascii="Georgia" w:hAnsi="Georgia"/>
-                <w:i/>
+                <w:i w:val="0"/>
                 <w:color w:val="1B365D"/>
               </w:rPr>
-              <w:t>43.9^\circ</w:t>
+              <w:t>43.9</w:t>
+            </w:r>
+            <w:r>
+              <w:rPr>
+                <w:rFonts w:ascii="Georgia" w:hAnsi="Georgia"/>
+                <w:color w:val="1B365D"/>
+                <w:vertAlign w:val="superscript"/>
+              </w:rPr>
+              <w:t>\</w:t>
+            </w:r>
+            <w:r>
+              <w:rPr>
+                <w:rFonts w:ascii="Georgia" w:hAnsi="Georgia"/>
+                <w:i w:val="0"/>
+                <w:color w:val="1B365D"/>
+              </w:rPr>
+              <w:t>circ</w:t>
             </w:r>
             <w:r>
               <w:rPr>
@@ -13056,10 +14434,10 @@
             <w:r>
               <w:rPr>
                 <w:rFonts w:ascii="Georgia" w:hAnsi="Georgia"/>
-                <w:i/>
+                <w:i w:val="0"/>
                 <w:color w:val="1B365D"/>
               </w:rPr>
-              <w:t>&lt; 2.0\text{ at}\%</w:t>
+              <w:t>&lt; 2.0 at\%</w:t>
             </w:r>
             <w:r>
               <w:rPr>
@@ -13070,10 +14448,10 @@
             <w:r>
               <w:rPr>
                 <w:rFonts w:ascii="Georgia" w:hAnsi="Georgia"/>
-                <w:i/>
+                <w:i w:val="0"/>
                 <w:color w:val="1B365D"/>
               </w:rPr>
-              <w:t>&gt; 2.0\text{ at}\%</w:t>
+              <w:t>&gt; 2.0 at\%</w:t>
             </w:r>
             <w:r>
               <w:rPr>
@@ -13212,7 +14590,7 @@
             <w:r>
               <w:rPr>
                 <w:rFonts w:ascii="Georgia" w:hAnsi="Georgia"/>
-                <w:i/>
+                <w:i w:val="0"/>
                 <w:color w:val="1B365D"/>
               </w:rPr>
               <w:t>N : Fe &lt; 3 : 1</w:t>
@@ -13381,7 +14759,7 @@
             <w:r>
               <w:rPr>
                 <w:rFonts w:ascii="Georgia" w:hAnsi="Georgia"/>
-                <w:i/>
+                <w:i w:val="0"/>
                 <w:color w:val="1B365D"/>
               </w:rPr>
               <w:t>&lt; 25\%</w:t>
@@ -13537,10 +14915,18 @@
             <w:r>
               <w:rPr>
                 <w:rFonts w:ascii="Georgia" w:hAnsi="Georgia"/>
-                <w:i/>
+                <w:i w:val="0"/>
                 <w:color w:val="1B365D"/>
               </w:rPr>
-              <w:t>Fe-N_x</w:t>
+              <w:t>Fe-N</w:t>
+            </w:r>
+            <w:r>
+              <w:rPr>
+                <w:rFonts w:ascii="Georgia" w:hAnsi="Georgia"/>
+                <w:color w:val="1B365D"/>
+                <w:vertAlign w:val="subscript"/>
+              </w:rPr>
+              <w:t>x</w:t>
             </w:r>
             <w:r>
               <w:rPr>
@@ -13551,7 +14937,7 @@
             <w:r>
               <w:rPr>
                 <w:rFonts w:ascii="Georgia" w:hAnsi="Georgia"/>
-                <w:i/>
+                <w:i w:val="0"/>
                 <w:color w:val="1B365D"/>
               </w:rPr>
               <w:t>Fe</w:t>
@@ -13565,10 +14951,10 @@
             <w:r>
               <w:rPr>
                 <w:rFonts w:ascii="Georgia" w:hAnsi="Georgia"/>
-                <w:i/>
+                <w:i w:val="0"/>
                 <w:color w:val="1B365D"/>
               </w:rPr>
-              <w:t>707.0\text{ eV}</w:t>
+              <w:t>707.0 eV</w:t>
             </w:r>
             <w:r>
               <w:rPr>
@@ -13647,10 +15033,26 @@
       <w:r>
         <w:rPr>
           <w:rFonts w:ascii="Georgia" w:hAnsi="Georgia"/>
-          <w:i/>
+          <w:i w:val="0"/>
           <w:color w:val="1B365D"/>
         </w:rPr>
-        <w:t>NH_4OH</w:t>
+        <w:t>NH</w:t>
+      </w:r>
+      <w:r>
+        <w:rPr>
+          <w:rFonts w:ascii="Georgia" w:hAnsi="Georgia"/>
+          <w:color w:val="1B365D"/>
+          <w:vertAlign w:val="subscript"/>
+        </w:rPr>
+        <w:t>4</w:t>
+      </w:r>
+      <w:r>
+        <w:rPr>
+          <w:rFonts w:ascii="Georgia" w:hAnsi="Georgia"/>
+          <w:i w:val="0"/>
+          <w:color w:val="1B365D"/>
+        </w:rPr>
+        <w:t>OH</w:t>
       </w:r>
       <w:r>
         <w:rPr>
@@ -13661,7 +15063,7 @@
       <w:r>
         <w:rPr>
           <w:rFonts w:ascii="Georgia" w:hAnsi="Georgia"/>
-          <w:i/>
+          <w:i w:val="0"/>
           <w:color w:val="1B365D"/>
         </w:rPr>
         <w:t>NaOH</w:t>
@@ -13699,10 +15101,18 @@
       <w:r>
         <w:rPr>
           <w:rFonts w:ascii="Georgia" w:hAnsi="Georgia"/>
-          <w:i/>
+          <w:i w:val="0"/>
           <w:color w:val="1B365D"/>
         </w:rPr>
-        <w:t>Pb^{2+}</w:t>
+        <w:t>Pb</w:t>
+      </w:r>
+      <w:r>
+        <w:rPr>
+          <w:rFonts w:ascii="Georgia" w:hAnsi="Georgia"/>
+          <w:color w:val="1B365D"/>
+          <w:vertAlign w:val="superscript"/>
+        </w:rPr>
+        <w:t>2+</w:t>
       </w:r>
       <w:r>
         <w:rPr>
@@ -13713,7 +15123,7 @@
       <w:r>
         <w:rPr>
           <w:rFonts w:ascii="Georgia" w:hAnsi="Georgia"/>
-          <w:i/>
+          <w:i w:val="0"/>
           <w:color w:val="1B365D"/>
         </w:rPr>
         <w:t>HCl</w:t>
@@ -13727,10 +15137,10 @@
       <w:r>
         <w:rPr>
           <w:rFonts w:ascii="Georgia" w:hAnsi="Georgia"/>
-          <w:i/>
+          <w:i w:val="0"/>
           <w:color w:val="1B365D"/>
         </w:rPr>
-        <w:t>0.5\text{ M}</w:t>
+        <w:t>0.5 M</w:t>
       </w:r>
       <w:r>
         <w:rPr>
@@ -13741,10 +15151,26 @@
       <w:r>
         <w:rPr>
           <w:rFonts w:ascii="Georgia" w:hAnsi="Georgia"/>
-          <w:i/>
+          <w:i w:val="0"/>
           <w:color w:val="1B365D"/>
         </w:rPr>
-        <w:t>80^\circ\text{C}</w:t>
+        <w:t>80</w:t>
+      </w:r>
+      <w:r>
+        <w:rPr>
+          <w:rFonts w:ascii="Georgia" w:hAnsi="Georgia"/>
+          <w:color w:val="1B365D"/>
+          <w:vertAlign w:val="superscript"/>
+        </w:rPr>
+        <w:t>\</w:t>
+      </w:r>
+      <w:r>
+        <w:rPr>
+          <w:rFonts w:ascii="Georgia" w:hAnsi="Georgia"/>
+          <w:i w:val="0"/>
+          <w:color w:val="1B365D"/>
+        </w:rPr>
+        <w:t>circC</w:t>
       </w:r>
       <w:r>
         <w:rPr>
@@ -13755,10 +15181,10 @@
       <w:r>
         <w:rPr>
           <w:rFonts w:ascii="Georgia" w:hAnsi="Georgia"/>
-          <w:i/>
+          <w:i w:val="0"/>
           <w:color w:val="1B365D"/>
         </w:rPr>
-        <w:t>8\text{ giờ}</w:t>
+        <w:t>8 giờ</w:t>
       </w:r>
       <w:r>
         <w:rPr>
@@ -13769,10 +15195,26 @@
       <w:r>
         <w:rPr>
           <w:rFonts w:ascii="Georgia" w:hAnsi="Georgia"/>
-          <w:i/>
+          <w:i w:val="0"/>
           <w:color w:val="1B365D"/>
         </w:rPr>
-        <w:t>800^\circ\text{C}</w:t>
+        <w:t>800</w:t>
+      </w:r>
+      <w:r>
+        <w:rPr>
+          <w:rFonts w:ascii="Georgia" w:hAnsi="Georgia"/>
+          <w:color w:val="1B365D"/>
+          <w:vertAlign w:val="superscript"/>
+        </w:rPr>
+        <w:t>\</w:t>
+      </w:r>
+      <w:r>
+        <w:rPr>
+          <w:rFonts w:ascii="Georgia" w:hAnsi="Georgia"/>
+          <w:i w:val="0"/>
+          <w:color w:val="1B365D"/>
+        </w:rPr>
+        <w:t>circC</w:t>
       </w:r>
       <w:r>
         <w:rPr>
@@ -13783,10 +15225,10 @@
       <w:r>
         <w:rPr>
           <w:rFonts w:ascii="Georgia" w:hAnsi="Georgia"/>
-          <w:i/>
+          <w:i w:val="0"/>
           <w:color w:val="1B365D"/>
         </w:rPr>
-        <w:t>1\text{ giờ}</w:t>
+        <w:t>1 giờ</w:t>
       </w:r>
       <w:r>
         <w:rPr>
@@ -13797,10 +15239,18 @@
       <w:r>
         <w:rPr>
           <w:rFonts w:ascii="Georgia" w:hAnsi="Georgia"/>
-          <w:i/>
+          <w:i w:val="0"/>
           <w:color w:val="1B365D"/>
         </w:rPr>
-        <w:t>Fe-N_4</w:t>
+        <w:t>Fe-N</w:t>
+      </w:r>
+      <w:r>
+        <w:rPr>
+          <w:rFonts w:ascii="Georgia" w:hAnsi="Georgia"/>
+          <w:color w:val="1B365D"/>
+          <w:vertAlign w:val="subscript"/>
+        </w:rPr>
+        <w:t>4</w:t>
       </w:r>
       <w:r>
         <w:rPr>
@@ -13835,7 +15285,7 @@
       <w:r>
         <w:rPr>
           <w:rFonts w:ascii="Georgia" w:hAnsi="Georgia"/>
-          <w:i/>
+          <w:i w:val="0"/>
           <w:color w:val="1B365D"/>
         </w:rPr>
         <w:t>NaOH</w:t>
@@ -13849,10 +15299,10 @@
       <w:r>
         <w:rPr>
           <w:rFonts w:ascii="Georgia" w:hAnsi="Georgia"/>
-          <w:i/>
+          <w:i w:val="0"/>
           <w:color w:val="1B365D"/>
         </w:rPr>
-        <w:t>0.1\text{ M}</w:t>
+        <w:t>0.1 M</w:t>
       </w:r>
       <w:r>
         <w:rPr>
@@ -13863,10 +15313,10 @@
       <w:r>
         <w:rPr>
           <w:rFonts w:ascii="Georgia" w:hAnsi="Georgia"/>
-          <w:i/>
+          <w:i w:val="0"/>
           <w:color w:val="1B365D"/>
         </w:rPr>
-        <w:t>+1.8\text{ V}</w:t>
+        <w:t>+1.8 V</w:t>
       </w:r>
       <w:r>
         <w:rPr>
@@ -13877,7 +15327,7 @@
       <w:r>
         <w:rPr>
           <w:rFonts w:ascii="Georgia" w:hAnsi="Georgia"/>
-          <w:i/>
+          <w:i w:val="0"/>
           <w:color w:val="1B365D"/>
         </w:rPr>
         <w:t>Ag/AgCl</w:t>
@@ -13891,10 +15341,10 @@
       <w:r>
         <w:rPr>
           <w:rFonts w:ascii="Georgia" w:hAnsi="Georgia"/>
-          <w:i/>
+          <w:i w:val="0"/>
           <w:color w:val="1B365D"/>
         </w:rPr>
-        <w:t>10\text{ giây}</w:t>
+        <w:t>10 giây</w:t>
       </w:r>
       <w:r>
         <w:rPr>
@@ -13927,7 +15377,35 @@
         <w:rPr>
           <w:rFonts w:ascii="Arial" w:hAnsi="Arial"/>
         </w:rPr>
-        <w:t>[TOM_TAT_NTXPhuong.md](file:///D:/1%20Master's%20Ana%20Chem%20/%201%20Master's%20thesis%20/%20Carbon%20Aerogel/1%20Ref%20materials/08_Review_va_Tong_quan/TOM_TAT_NTXPhuong.md)</w:t>
+        <w:t xml:space="preserve">Tài liệu </w:t>
+      </w:r>
+      <w:r>
+        <w:rPr>
+          <w:rFonts w:ascii="Courier New" w:hAnsi="Courier New"/>
+          <w:color w:val="A31515"/>
+          <w:sz w:val="19"/>
+        </w:rPr>
+        <w:t>TOM_TAT_NTXPhuong.md</w:t>
+      </w:r>
+      <w:r>
+        <w:rPr>
+          <w:rFonts w:ascii="Arial" w:hAnsi="Arial"/>
+        </w:rPr>
+        <w:t xml:space="preserve"> trong thư mục </w:t>
+      </w:r>
+      <w:r>
+        <w:rPr>
+          <w:rFonts w:ascii="Courier New" w:hAnsi="Courier New"/>
+          <w:color w:val="A31515"/>
+          <w:sz w:val="19"/>
+        </w:rPr>
+        <w:t>08_Review_va_Tong_quan</w:t>
+      </w:r>
+      <w:r>
+        <w:rPr>
+          <w:rFonts w:ascii="Arial" w:hAnsi="Arial"/>
+        </w:rPr>
+        <w:t>.</w:t>
       </w:r>
     </w:p>
     <w:p>
@@ -13939,7 +15417,35 @@
         <w:rPr>
           <w:rFonts w:ascii="Arial" w:hAnsi="Arial"/>
         </w:rPr>
-        <w:t>[2 Nitrogen-Doped Carbon Aerogels Prepared by Direct Pyrolysis of.md](file:///D:/1%20Master's%20Ana%20Chem%20/%201%20Master's%20thesis%20/%20Carbon%20Aerogel/1%20Ref%20materials/02_Doping_va_Gel_hoa/2%20Nitrogen-Doped%20Carbon%20Aerogels%20Prepared%20by%20Direct%20Pyrolysis%20of.md)</w:t>
+        <w:t xml:space="preserve">Tài liệu </w:t>
+      </w:r>
+      <w:r>
+        <w:rPr>
+          <w:rFonts w:ascii="Courier New" w:hAnsi="Courier New"/>
+          <w:color w:val="A31515"/>
+          <w:sz w:val="19"/>
+        </w:rPr>
+        <w:t>2 Nitrogen-Doped Carbon Aerogels Prepared by Direct Pyrolysis of.md</w:t>
+      </w:r>
+      <w:r>
+        <w:rPr>
+          <w:rFonts w:ascii="Arial" w:hAnsi="Arial"/>
+        </w:rPr>
+        <w:t xml:space="preserve"> trong thư mục </w:t>
+      </w:r>
+      <w:r>
+        <w:rPr>
+          <w:rFonts w:ascii="Courier New" w:hAnsi="Courier New"/>
+          <w:color w:val="A31515"/>
+          <w:sz w:val="19"/>
+        </w:rPr>
+        <w:t>02_Doping_va_Gel_hoa</w:t>
+      </w:r>
+      <w:r>
+        <w:rPr>
+          <w:rFonts w:ascii="Arial" w:hAnsi="Arial"/>
+        </w:rPr>
+        <w:t>.</w:t>
       </w:r>
     </w:p>
     <w:p>
@@ -13951,7 +15457,35 @@
         <w:rPr>
           <w:rFonts w:ascii="Arial" w:hAnsi="Arial"/>
         </w:rPr>
-        <w:t>[1 Facile Synthesis of Fe-Doped Algae Residue-Derived Carbon Aerogels for.md](file:///D:/1%20Master's%20Ana%20Chem%20/%201%20Master's%20thesis%20/%20Carbon%20Aerogel/1%20Ref%20materials/02_Doping_va_Gel_hoa/1%20Facile%20Synthesis%20of%20Fe-Doped%20Algae%20Residue-Derived%20Carbon%20Aerogels%20for.md)</w:t>
+        <w:t xml:space="preserve">Tài liệu </w:t>
+      </w:r>
+      <w:r>
+        <w:rPr>
+          <w:rFonts w:ascii="Courier New" w:hAnsi="Courier New"/>
+          <w:color w:val="A31515"/>
+          <w:sz w:val="19"/>
+        </w:rPr>
+        <w:t>1 Facile Synthesis of Fe-Doped Algae Residue-Derived Carbon Aerogels for.md</w:t>
+      </w:r>
+      <w:r>
+        <w:rPr>
+          <w:rFonts w:ascii="Arial" w:hAnsi="Arial"/>
+        </w:rPr>
+        <w:t xml:space="preserve"> trong thư mục </w:t>
+      </w:r>
+      <w:r>
+        <w:rPr>
+          <w:rFonts w:ascii="Courier New" w:hAnsi="Courier New"/>
+          <w:color w:val="A31515"/>
+          <w:sz w:val="19"/>
+        </w:rPr>
+        <w:t>02_Doping_va_Gel_hoa</w:t>
+      </w:r>
+      <w:r>
+        <w:rPr>
+          <w:rFonts w:ascii="Arial" w:hAnsi="Arial"/>
+        </w:rPr>
+        <w:t>.</w:t>
       </w:r>
     </w:p>
     <w:sectPr>

</xml_diff>

<commit_message>
Sua loi symbol hoa hoc degree alpha theta va typo trong Final_SOPs_CA.md
</commit_message>
<xml_diff>
--- a/1 SOPs/Final_SOPs_CA.docx
+++ b/1 SOPs/Final_SOPs_CA.docx
@@ -528,23 +528,7 @@
                 <w:i w:val="0"/>
                 <w:color w:val="1B365D"/>
               </w:rPr>
-              <w:t>80 ± 2</w:t>
-            </w:r>
-            <w:r>
-              <w:rPr>
-                <w:rFonts w:ascii="Georgia" w:hAnsi="Georgia"/>
-                <w:color w:val="1B365D"/>
-                <w:vertAlign w:val="superscript"/>
-              </w:rPr>
-              <w:t>\</w:t>
-            </w:r>
-            <w:r>
-              <w:rPr>
-                <w:rFonts w:ascii="Georgia" w:hAnsi="Georgia"/>
-                <w:i w:val="0"/>
-                <w:color w:val="1B365D"/>
-              </w:rPr>
-              <w:t>circC</w:t>
+              <w:t>80 ± 2°C</w:t>
             </w:r>
             <w:r>
               <w:rPr>
@@ -618,7 +602,7 @@
                 <w:i w:val="0"/>
                 <w:color w:val="1B365D"/>
               </w:rPr>
-              <w:t>6 wt\% NaOH</w:t>
+              <w:t>6 wt% NaOH</w:t>
             </w:r>
             <w:r>
               <w:rPr>
@@ -758,23 +742,7 @@
                 <w:i w:val="0"/>
                 <w:color w:val="1B365D"/>
               </w:rPr>
-              <w:t>60</w:t>
-            </w:r>
-            <w:r>
-              <w:rPr>
-                <w:rFonts w:ascii="Georgia" w:hAnsi="Georgia"/>
-                <w:color w:val="1B365D"/>
-                <w:vertAlign w:val="superscript"/>
-              </w:rPr>
-              <w:t>\</w:t>
-            </w:r>
-            <w:r>
-              <w:rPr>
-                <w:rFonts w:ascii="Georgia" w:hAnsi="Georgia"/>
-                <w:i w:val="0"/>
-                <w:color w:val="1B365D"/>
-              </w:rPr>
-              <w:t>circC</w:t>
+              <w:t>60°C</w:t>
             </w:r>
             <w:r>
               <w:rPr>
@@ -848,7 +816,7 @@
                 <w:i w:val="0"/>
                 <w:color w:val="1B365D"/>
               </w:rPr>
-              <w:t>10 wt\% H</w:t>
+              <w:t>10 wt% H</w:t>
             </w:r>
             <w:r>
               <w:rPr>
@@ -1027,23 +995,7 @@
                 <w:i w:val="0"/>
                 <w:color w:val="1B365D"/>
               </w:rPr>
-              <w:t>60</w:t>
-            </w:r>
-            <w:r>
-              <w:rPr>
-                <w:rFonts w:ascii="Georgia" w:hAnsi="Georgia"/>
-                <w:color w:val="1B365D"/>
-                <w:vertAlign w:val="superscript"/>
-              </w:rPr>
-              <w:t>\</w:t>
-            </w:r>
-            <w:r>
-              <w:rPr>
-                <w:rFonts w:ascii="Georgia" w:hAnsi="Georgia"/>
-                <w:i w:val="0"/>
-                <w:color w:val="1B365D"/>
-              </w:rPr>
-              <w:t>circC</w:t>
+              <w:t>60°C</w:t>
             </w:r>
             <w:r>
               <w:rPr>
@@ -1287,23 +1239,7 @@
                 <w:i w:val="0"/>
                 <w:color w:val="1B365D"/>
               </w:rPr>
-              <w:t>≤ 10</w:t>
-            </w:r>
-            <w:r>
-              <w:rPr>
-                <w:rFonts w:ascii="Georgia" w:hAnsi="Georgia"/>
-                <w:color w:val="1B365D"/>
-                <w:vertAlign w:val="superscript"/>
-              </w:rPr>
-              <w:t>\</w:t>
-            </w:r>
-            <w:r>
-              <w:rPr>
-                <w:rFonts w:ascii="Georgia" w:hAnsi="Georgia"/>
-                <w:i w:val="0"/>
-                <w:color w:val="1B365D"/>
-              </w:rPr>
-              <w:t>circC</w:t>
+              <w:t>≤ 10°C</w:t>
             </w:r>
             <w:r>
               <w:rPr>
@@ -1377,7 +1313,7 @@
                 <w:i w:val="0"/>
                 <w:color w:val="1B365D"/>
               </w:rPr>
-              <w:t>25 wt\% NH</w:t>
+              <w:t>25 wt% NH</w:t>
             </w:r>
             <w:r>
               <w:rPr>
@@ -1579,39 +1515,7 @@
                 <w:i w:val="0"/>
                 <w:color w:val="1B365D"/>
               </w:rPr>
-              <w:t>-10</w:t>
-            </w:r>
-            <w:r>
-              <w:rPr>
-                <w:rFonts w:ascii="Georgia" w:hAnsi="Georgia"/>
-                <w:color w:val="1B365D"/>
-                <w:vertAlign w:val="superscript"/>
-              </w:rPr>
-              <w:t>\</w:t>
-            </w:r>
-            <w:r>
-              <w:rPr>
-                <w:rFonts w:ascii="Georgia" w:hAnsi="Georgia"/>
-                <w:i w:val="0"/>
-                <w:color w:val="1B365D"/>
-              </w:rPr>
-              <w:t>circC  đến  -12</w:t>
-            </w:r>
-            <w:r>
-              <w:rPr>
-                <w:rFonts w:ascii="Georgia" w:hAnsi="Georgia"/>
-                <w:color w:val="1B365D"/>
-                <w:vertAlign w:val="superscript"/>
-              </w:rPr>
-              <w:t>\</w:t>
-            </w:r>
-            <w:r>
-              <w:rPr>
-                <w:rFonts w:ascii="Georgia" w:hAnsi="Georgia"/>
-                <w:i w:val="0"/>
-                <w:color w:val="1B365D"/>
-              </w:rPr>
-              <w:t>circC</w:t>
+              <w:t>-10°C  đến  -12°C</w:t>
             </w:r>
             <w:r>
               <w:rPr>
@@ -1685,7 +1589,7 @@
                 <w:i w:val="0"/>
                 <w:color w:val="1B365D"/>
               </w:rPr>
-              <w:t>7\%/12\%/81\%</w:t>
+              <w:t>7%/12%/81%</w:t>
             </w:r>
             <w:r>
               <w:rPr>
@@ -1722,7 +1626,7 @@
                 <w:i w:val="0"/>
                 <w:color w:val="1B365D"/>
               </w:rPr>
-              <w:t>7 wt\% NaOH : 12 wt\% Urea : 81 wt\% H</w:t>
+              <w:t>7 wt% NaOH : 12 wt% Urea : 81 wt% H</w:t>
             </w:r>
             <w:r>
               <w:rPr>
@@ -1871,23 +1775,7 @@
                 <w:i w:val="0"/>
                 <w:color w:val="1B365D"/>
               </w:rPr>
-              <w:t>80</w:t>
-            </w:r>
-            <w:r>
-              <w:rPr>
-                <w:rFonts w:ascii="Georgia" w:hAnsi="Georgia"/>
-                <w:color w:val="1B365D"/>
-                <w:vertAlign w:val="superscript"/>
-              </w:rPr>
-              <w:t>\</w:t>
-            </w:r>
-            <w:r>
-              <w:rPr>
-                <w:rFonts w:ascii="Georgia" w:hAnsi="Georgia"/>
-                <w:i w:val="0"/>
-                <w:color w:val="1B365D"/>
-              </w:rPr>
-              <w:t>circC</w:t>
+              <w:t>80°C</w:t>
             </w:r>
             <w:r>
               <w:rPr>
@@ -2091,23 +1979,7 @@
                 <w:i w:val="0"/>
                 <w:color w:val="1B365D"/>
               </w:rPr>
-              <w:t>50 - 55</w:t>
-            </w:r>
-            <w:r>
-              <w:rPr>
-                <w:rFonts w:ascii="Georgia" w:hAnsi="Georgia"/>
-                <w:color w:val="1B365D"/>
-                <w:vertAlign w:val="superscript"/>
-              </w:rPr>
-              <w:t>\</w:t>
-            </w:r>
-            <w:r>
-              <w:rPr>
-                <w:rFonts w:ascii="Georgia" w:hAnsi="Georgia"/>
-                <w:i w:val="0"/>
-                <w:color w:val="1B365D"/>
-              </w:rPr>
-              <w:t>circC</w:t>
+              <w:t>50 - 55°C</w:t>
             </w:r>
             <w:r>
               <w:rPr>
@@ -2297,23 +2169,7 @@
                 <w:i w:val="0"/>
                 <w:color w:val="1B365D"/>
               </w:rPr>
-              <w:t>0 - 5</w:t>
-            </w:r>
-            <w:r>
-              <w:rPr>
-                <w:rFonts w:ascii="Georgia" w:hAnsi="Georgia"/>
-                <w:color w:val="1B365D"/>
-                <w:vertAlign w:val="superscript"/>
-              </w:rPr>
-              <w:t>\</w:t>
-            </w:r>
-            <w:r>
-              <w:rPr>
-                <w:rFonts w:ascii="Georgia" w:hAnsi="Georgia"/>
-                <w:i w:val="0"/>
-                <w:color w:val="1B365D"/>
-              </w:rPr>
-              <w:t>circC</w:t>
+              <w:t>0 - 5°C</w:t>
             </w:r>
             <w:r>
               <w:rPr>
@@ -2387,7 +2243,7 @@
                 <w:i w:val="0"/>
                 <w:color w:val="1B365D"/>
               </w:rPr>
-              <w:t>98 vol\% Ethanol</w:t>
+              <w:t>98 vol% Ethanol</w:t>
             </w:r>
             <w:r>
               <w:rPr>
@@ -2542,23 +2398,7 @@
                 <w:i w:val="0"/>
                 <w:color w:val="1B365D"/>
               </w:rPr>
-              <w:t>0 - 5</w:t>
-            </w:r>
-            <w:r>
-              <w:rPr>
-                <w:rFonts w:ascii="Georgia" w:hAnsi="Georgia"/>
-                <w:color w:val="1B365D"/>
-                <w:vertAlign w:val="superscript"/>
-              </w:rPr>
-              <w:t>\</w:t>
-            </w:r>
-            <w:r>
-              <w:rPr>
-                <w:rFonts w:ascii="Georgia" w:hAnsi="Georgia"/>
-                <w:i w:val="0"/>
-                <w:color w:val="1B365D"/>
-              </w:rPr>
-              <w:t>circC</w:t>
+              <w:t>0 - 5°C</w:t>
             </w:r>
             <w:r>
               <w:rPr>
@@ -2632,7 +2472,7 @@
                 <w:i w:val="0"/>
                 <w:color w:val="1B365D"/>
               </w:rPr>
-              <w:t>10 wt\% Fe</w:t>
+              <w:t>10 wt% Fe</w:t>
             </w:r>
             <w:r>
               <w:rPr>
@@ -2804,15 +2644,13 @@
                 <w:i w:val="0"/>
                 <w:color w:val="1B365D"/>
               </w:rPr>
-              <w:t>-80</w:t>
-            </w:r>
-            <w:r>
-              <w:rPr>
-                <w:rFonts w:ascii="Georgia" w:hAnsi="Georgia"/>
-                <w:color w:val="1B365D"/>
-                <w:vertAlign w:val="superscript"/>
-              </w:rPr>
-              <w:t>\</w:t>
+              <w:t>-80°C</w:t>
+            </w:r>
+            <w:r>
+              <w:rPr>
+                <w:rFonts w:ascii="Arial" w:hAnsi="Arial"/>
+              </w:rPr>
+              <w:t xml:space="preserve"> (đông) / </w:t>
             </w:r>
             <w:r>
               <w:rPr>
@@ -2820,37 +2658,7 @@
                 <w:i w:val="0"/>
                 <w:color w:val="1B365D"/>
               </w:rPr>
-              <w:t>circC</w:t>
-            </w:r>
-            <w:r>
-              <w:rPr>
-                <w:rFonts w:ascii="Arial" w:hAnsi="Arial"/>
-              </w:rPr>
-              <w:t xml:space="preserve"> (đông) / </w:t>
-            </w:r>
-            <w:r>
-              <w:rPr>
-                <w:rFonts w:ascii="Georgia" w:hAnsi="Georgia"/>
-                <w:i w:val="0"/>
-                <w:color w:val="1B365D"/>
-              </w:rPr>
-              <w:t>≤ -50</w:t>
-            </w:r>
-            <w:r>
-              <w:rPr>
-                <w:rFonts w:ascii="Georgia" w:hAnsi="Georgia"/>
-                <w:color w:val="1B365D"/>
-                <w:vertAlign w:val="superscript"/>
-              </w:rPr>
-              <w:t>\</w:t>
-            </w:r>
-            <w:r>
-              <w:rPr>
-                <w:rFonts w:ascii="Georgia" w:hAnsi="Georgia"/>
-                <w:i w:val="0"/>
-                <w:color w:val="1B365D"/>
-              </w:rPr>
-              <w:t>circC</w:t>
+              <w:t>≤ -50°C</w:t>
             </w:r>
             <w:r>
               <w:rPr>
@@ -3067,23 +2875,7 @@
                 <w:i w:val="0"/>
                 <w:color w:val="1B365D"/>
               </w:rPr>
-              <w:t>700</w:t>
-            </w:r>
-            <w:r>
-              <w:rPr>
-                <w:rFonts w:ascii="Georgia" w:hAnsi="Georgia"/>
-                <w:color w:val="1B365D"/>
-                <w:vertAlign w:val="superscript"/>
-              </w:rPr>
-              <w:t>\</w:t>
-            </w:r>
-            <w:r>
-              <w:rPr>
-                <w:rFonts w:ascii="Georgia" w:hAnsi="Georgia"/>
-                <w:i w:val="0"/>
-                <w:color w:val="1B365D"/>
-              </w:rPr>
-              <w:t>circC</w:t>
+              <w:t>700°C</w:t>
             </w:r>
             <w:r>
               <w:rPr>
@@ -3157,23 +2949,7 @@
                 <w:i w:val="0"/>
                 <w:color w:val="1B365D"/>
               </w:rPr>
-              <w:t>5</w:t>
-            </w:r>
-            <w:r>
-              <w:rPr>
-                <w:rFonts w:ascii="Georgia" w:hAnsi="Georgia"/>
-                <w:color w:val="1B365D"/>
-                <w:vertAlign w:val="superscript"/>
-              </w:rPr>
-              <w:t>\</w:t>
-            </w:r>
-            <w:r>
-              <w:rPr>
-                <w:rFonts w:ascii="Georgia" w:hAnsi="Georgia"/>
-                <w:i w:val="0"/>
-                <w:color w:val="1B365D"/>
-              </w:rPr>
-              <w:t>circC/phút</w:t>
+              <w:t>5°C/phút</w:t>
             </w:r>
             <w:r>
               <w:rPr>
@@ -3344,23 +3120,7 @@
                 <w:i w:val="0"/>
                 <w:color w:val="1B365D"/>
               </w:rPr>
-              <w:t>800</w:t>
-            </w:r>
-            <w:r>
-              <w:rPr>
-                <w:rFonts w:ascii="Georgia" w:hAnsi="Georgia"/>
-                <w:color w:val="1B365D"/>
-                <w:vertAlign w:val="superscript"/>
-              </w:rPr>
-              <w:t>\</w:t>
-            </w:r>
-            <w:r>
-              <w:rPr>
-                <w:rFonts w:ascii="Georgia" w:hAnsi="Georgia"/>
-                <w:i w:val="0"/>
-                <w:color w:val="1B365D"/>
-              </w:rPr>
-              <w:t>circC</w:t>
+              <w:t>800°C</w:t>
             </w:r>
             <w:r>
               <w:rPr>
@@ -3434,23 +3194,7 @@
                 <w:i w:val="0"/>
                 <w:color w:val="1B365D"/>
               </w:rPr>
-              <w:t>5</w:t>
-            </w:r>
-            <w:r>
-              <w:rPr>
-                <w:rFonts w:ascii="Georgia" w:hAnsi="Georgia"/>
-                <w:color w:val="1B365D"/>
-                <w:vertAlign w:val="superscript"/>
-              </w:rPr>
-              <w:t>\</w:t>
-            </w:r>
-            <w:r>
-              <w:rPr>
-                <w:rFonts w:ascii="Georgia" w:hAnsi="Georgia"/>
-                <w:i w:val="0"/>
-                <w:color w:val="1B365D"/>
-              </w:rPr>
-              <w:t>circC/phút</w:t>
+              <w:t>5°C/phút</w:t>
             </w:r>
             <w:r>
               <w:rPr>
@@ -3607,23 +3351,7 @@
                 <w:i w:val="0"/>
                 <w:color w:val="1B365D"/>
               </w:rPr>
-              <w:t>80 ± 2</w:t>
-            </w:r>
-            <w:r>
-              <w:rPr>
-                <w:rFonts w:ascii="Georgia" w:hAnsi="Georgia"/>
-                <w:color w:val="1B365D"/>
-                <w:vertAlign w:val="superscript"/>
-              </w:rPr>
-              <w:t>\</w:t>
-            </w:r>
-            <w:r>
-              <w:rPr>
-                <w:rFonts w:ascii="Georgia" w:hAnsi="Georgia"/>
-                <w:i w:val="0"/>
-                <w:color w:val="1B365D"/>
-              </w:rPr>
-              <w:t>circC</w:t>
+              <w:t>80 ± 2°C</w:t>
             </w:r>
             <w:r>
               <w:rPr>
@@ -3838,23 +3566,7 @@
                 <w:i w:val="0"/>
                 <w:color w:val="1B365D"/>
               </w:rPr>
-              <w:t>800</w:t>
-            </w:r>
-            <w:r>
-              <w:rPr>
-                <w:rFonts w:ascii="Georgia" w:hAnsi="Georgia"/>
-                <w:color w:val="1B365D"/>
-                <w:vertAlign w:val="superscript"/>
-              </w:rPr>
-              <w:t>\</w:t>
-            </w:r>
-            <w:r>
-              <w:rPr>
-                <w:rFonts w:ascii="Georgia" w:hAnsi="Georgia"/>
-                <w:i w:val="0"/>
-                <w:color w:val="1B365D"/>
-              </w:rPr>
-              <w:t>circC</w:t>
+              <w:t>800°C</w:t>
             </w:r>
             <w:r>
               <w:rPr>
@@ -3928,23 +3640,7 @@
                 <w:i w:val="0"/>
                 <w:color w:val="1B365D"/>
               </w:rPr>
-              <w:t>5</w:t>
-            </w:r>
-            <w:r>
-              <w:rPr>
-                <w:rFonts w:ascii="Georgia" w:hAnsi="Georgia"/>
-                <w:color w:val="1B365D"/>
-                <w:vertAlign w:val="superscript"/>
-              </w:rPr>
-              <w:t>\</w:t>
-            </w:r>
-            <w:r>
-              <w:rPr>
-                <w:rFonts w:ascii="Georgia" w:hAnsi="Georgia"/>
-                <w:i w:val="0"/>
-                <w:color w:val="1B365D"/>
-              </w:rPr>
-              <w:t>circC/phút</w:t>
+              <w:t>5°C/phút</w:t>
             </w:r>
             <w:r>
               <w:rPr>
@@ -4148,23 +3844,7 @@
           <w:i w:val="0"/>
           <w:color w:val="1B365D"/>
         </w:rPr>
-        <w:t>80</w:t>
-      </w:r>
-      <w:r>
-        <w:rPr>
-          <w:rFonts w:ascii="Georgia" w:hAnsi="Georgia"/>
-          <w:color w:val="1B365D"/>
-          <w:vertAlign w:val="superscript"/>
-        </w:rPr>
-        <w:t>\</w:t>
-      </w:r>
-      <w:r>
-        <w:rPr>
-          <w:rFonts w:ascii="Georgia" w:hAnsi="Georgia"/>
-          <w:i w:val="0"/>
-          <w:color w:val="1B365D"/>
-        </w:rPr>
-        <w:t>circC</w:t>
+        <w:t>80°C</w:t>
       </w:r>
       <w:r>
         <w:rPr>
@@ -4232,7 +3912,7 @@
           <w:i w:val="0"/>
           <w:color w:val="1B365D"/>
         </w:rPr>
-        <w:t>6 wt\%</w:t>
+        <w:t>6 wt%</w:t>
       </w:r>
       <w:r>
         <w:rPr>
@@ -4272,23 +3952,7 @@
           <w:i w:val="0"/>
           <w:color w:val="1B365D"/>
         </w:rPr>
-        <w:t>80 ± 2</w:t>
-      </w:r>
-      <w:r>
-        <w:rPr>
-          <w:rFonts w:ascii="Georgia" w:hAnsi="Georgia"/>
-          <w:color w:val="1B365D"/>
-          <w:vertAlign w:val="superscript"/>
-        </w:rPr>
-        <w:t>\</w:t>
-      </w:r>
-      <w:r>
-        <w:rPr>
-          <w:rFonts w:ascii="Georgia" w:hAnsi="Georgia"/>
-          <w:i w:val="0"/>
-          <w:color w:val="1B365D"/>
-        </w:rPr>
-        <w:t>circC</w:t>
+        <w:t>80 ± 2°C</w:t>
       </w:r>
       <w:r>
         <w:rPr>
@@ -4356,23 +4020,7 @@
           <w:i w:val="0"/>
           <w:color w:val="1B365D"/>
         </w:rPr>
-        <w:t>80</w:t>
-      </w:r>
-      <w:r>
-        <w:rPr>
-          <w:rFonts w:ascii="Georgia" w:hAnsi="Georgia"/>
-          <w:color w:val="1B365D"/>
-          <w:vertAlign w:val="superscript"/>
-        </w:rPr>
-        <w:t>\</w:t>
-      </w:r>
-      <w:r>
-        <w:rPr>
-          <w:rFonts w:ascii="Georgia" w:hAnsi="Georgia"/>
-          <w:i w:val="0"/>
-          <w:color w:val="1B365D"/>
-        </w:rPr>
-        <w:t>circC</w:t>
+        <w:t>80°C</w:t>
       </w:r>
       <w:r>
         <w:rPr>
@@ -4501,7 +4149,7 @@
           <w:i w:val="0"/>
           <w:color w:val="1B365D"/>
         </w:rPr>
-        <w:t>10 wt\%</w:t>
+        <w:t>10 wt%</w:t>
       </w:r>
       <w:r>
         <w:rPr>
@@ -4581,23 +4229,7 @@
           <w:i w:val="0"/>
           <w:color w:val="1B365D"/>
         </w:rPr>
-        <w:t>60</w:t>
-      </w:r>
-      <w:r>
-        <w:rPr>
-          <w:rFonts w:ascii="Georgia" w:hAnsi="Georgia"/>
-          <w:color w:val="1B365D"/>
-          <w:vertAlign w:val="superscript"/>
-        </w:rPr>
-        <w:t>\</w:t>
-      </w:r>
-      <w:r>
-        <w:rPr>
-          <w:rFonts w:ascii="Georgia" w:hAnsi="Georgia"/>
-          <w:i w:val="0"/>
-          <w:color w:val="1B365D"/>
-        </w:rPr>
-        <w:t>circC</w:t>
+        <w:t>60°C</w:t>
       </w:r>
       <w:r>
         <w:rPr>
@@ -4768,23 +4400,7 @@
           <w:i w:val="0"/>
           <w:color w:val="1B365D"/>
         </w:rPr>
-        <w:t>60</w:t>
-      </w:r>
-      <w:r>
-        <w:rPr>
-          <w:rFonts w:ascii="Georgia" w:hAnsi="Georgia"/>
-          <w:color w:val="1B365D"/>
-          <w:vertAlign w:val="superscript"/>
-        </w:rPr>
-        <w:t>\</w:t>
-      </w:r>
-      <w:r>
-        <w:rPr>
-          <w:rFonts w:ascii="Georgia" w:hAnsi="Georgia"/>
-          <w:i w:val="0"/>
-          <w:color w:val="1B365D"/>
-        </w:rPr>
-        <w:t>circC</w:t>
+        <w:t>60°C</w:t>
       </w:r>
       <w:r>
         <w:rPr>
@@ -4864,23 +4480,7 @@
           <w:i w:val="0"/>
           <w:color w:val="1B365D"/>
         </w:rPr>
-        <w:t>80</w:t>
-      </w:r>
-      <w:r>
-        <w:rPr>
-          <w:rFonts w:ascii="Georgia" w:hAnsi="Georgia"/>
-          <w:color w:val="1B365D"/>
-          <w:vertAlign w:val="superscript"/>
-        </w:rPr>
-        <w:t>\</w:t>
-      </w:r>
-      <w:r>
-        <w:rPr>
-          <w:rFonts w:ascii="Georgia" w:hAnsi="Georgia"/>
-          <w:i w:val="0"/>
-          <w:color w:val="1B365D"/>
-        </w:rPr>
-        <w:t>circC</w:t>
+        <w:t>80°C</w:t>
       </w:r>
       <w:r>
         <w:rPr>
@@ -5049,15 +4649,13 @@
           <w:i w:val="0"/>
           <w:color w:val="1B365D"/>
         </w:rPr>
-        <w:t>2\theta ≈ 16.08</w:t>
-      </w:r>
-      <w:r>
-        <w:rPr>
-          <w:rFonts w:ascii="Georgia" w:hAnsi="Georgia"/>
-          <w:color w:val="1B365D"/>
-          <w:vertAlign w:val="superscript"/>
-        </w:rPr>
-        <w:t>\</w:t>
+        <w:t>2θ ≈ 16.08°</w:t>
+      </w:r>
+      <w:r>
+        <w:rPr>
+          <w:rFonts w:ascii="Arial" w:hAnsi="Arial"/>
+        </w:rPr>
+        <w:t xml:space="preserve"> (110) và </w:t>
       </w:r>
       <w:r>
         <w:rPr>
@@ -5065,37 +4663,7 @@
           <w:i w:val="0"/>
           <w:color w:val="1B365D"/>
         </w:rPr>
-        <w:t>circ</w:t>
-      </w:r>
-      <w:r>
-        <w:rPr>
-          <w:rFonts w:ascii="Arial" w:hAnsi="Arial"/>
-        </w:rPr>
-        <w:t xml:space="preserve"> (110) và </w:t>
-      </w:r>
-      <w:r>
-        <w:rPr>
-          <w:rFonts w:ascii="Georgia" w:hAnsi="Georgia"/>
-          <w:i w:val="0"/>
-          <w:color w:val="1B365D"/>
-        </w:rPr>
-        <w:t>22.23</w:t>
-      </w:r>
-      <w:r>
-        <w:rPr>
-          <w:rFonts w:ascii="Georgia" w:hAnsi="Georgia"/>
-          <w:color w:val="1B365D"/>
-          <w:vertAlign w:val="superscript"/>
-        </w:rPr>
-        <w:t>\</w:t>
-      </w:r>
-      <w:r>
-        <w:rPr>
-          <w:rFonts w:ascii="Georgia" w:hAnsi="Georgia"/>
-          <w:i w:val="0"/>
-          <w:color w:val="1B365D"/>
-        </w:rPr>
-        <w:t>circ</w:t>
+        <w:t>22.23°</w:t>
       </w:r>
       <w:r>
         <w:rPr>
@@ -5303,7 +4871,7 @@
           <w:i w:val="0"/>
           <w:color w:val="1B365D"/>
         </w:rPr>
-        <w:t>25 wt\%</w:t>
+        <w:t>25 wt%</w:t>
       </w:r>
       <w:r>
         <w:rPr>
@@ -5467,7 +5035,7 @@
           <w:i w:val="0"/>
           <w:color w:val="1B365D"/>
         </w:rPr>
-        <w:t>7 wt\% NaOH : 12 wt\% Urea : 81 wt\% H</w:t>
+        <w:t>7 wt% NaOH : 12 wt% Urea : 81 wt% H</w:t>
       </w:r>
       <w:r>
         <w:rPr>
@@ -5652,23 +5220,7 @@
           <w:i w:val="0"/>
           <w:color w:val="1B365D"/>
         </w:rPr>
-        <w:t>&gt;15</w:t>
-      </w:r>
-      <w:r>
-        <w:rPr>
-          <w:rFonts w:ascii="Georgia" w:hAnsi="Georgia"/>
-          <w:color w:val="1B365D"/>
-          <w:vertAlign w:val="superscript"/>
-        </w:rPr>
-        <w:t>\</w:t>
-      </w:r>
-      <w:r>
-        <w:rPr>
-          <w:rFonts w:ascii="Georgia" w:hAnsi="Georgia"/>
-          <w:i w:val="0"/>
-          <w:color w:val="1B365D"/>
-        </w:rPr>
-        <w:t>circC</w:t>
+        <w:t>&gt;15°C</w:t>
       </w:r>
       <w:r>
         <w:rPr>
@@ -5728,15 +5280,13 @@
           <w:i w:val="0"/>
           <w:color w:val="1B365D"/>
         </w:rPr>
-        <w:t>2\theta ≈ 11.6</w:t>
-      </w:r>
-      <w:r>
-        <w:rPr>
-          <w:rFonts w:ascii="Georgia" w:hAnsi="Georgia"/>
-          <w:color w:val="1B365D"/>
-          <w:vertAlign w:val="superscript"/>
-        </w:rPr>
-        <w:t>\</w:t>
+        <w:t>2θ ≈ 11.6°</w:t>
+      </w:r>
+      <w:r>
+        <w:rPr>
+          <w:rFonts w:ascii="Arial" w:hAnsi="Arial"/>
+        </w:rPr>
+        <w:t xml:space="preserve"> (110) và </w:t>
       </w:r>
       <w:r>
         <w:rPr>
@@ -5744,13 +5294,13 @@
           <w:i w:val="0"/>
           <w:color w:val="1B365D"/>
         </w:rPr>
-        <w:t>circ</w:t>
-      </w:r>
-      <w:r>
-        <w:rPr>
-          <w:rFonts w:ascii="Arial" w:hAnsi="Arial"/>
-        </w:rPr>
-        <w:t xml:space="preserve"> (110) và </w:t>
+        <w:t>20.5°</w:t>
+      </w:r>
+      <w:r>
+        <w:rPr>
+          <w:rFonts w:ascii="Arial" w:hAnsi="Arial"/>
+        </w:rPr>
+        <w:t xml:space="preserve"> (002). Đỉnh Cellulose I (</w:t>
       </w:r>
       <w:r>
         <w:rPr>
@@ -5758,53 +5308,7 @@
           <w:i w:val="0"/>
           <w:color w:val="1B365D"/>
         </w:rPr>
-        <w:t>20.5</w:t>
-      </w:r>
-      <w:r>
-        <w:rPr>
-          <w:rFonts w:ascii="Georgia" w:hAnsi="Georgia"/>
-          <w:color w:val="1B365D"/>
-          <w:vertAlign w:val="superscript"/>
-        </w:rPr>
-        <w:t>\</w:t>
-      </w:r>
-      <w:r>
-        <w:rPr>
-          <w:rFonts w:ascii="Georgia" w:hAnsi="Georgia"/>
-          <w:i w:val="0"/>
-          <w:color w:val="1B365D"/>
-        </w:rPr>
-        <w:t>circ</w:t>
-      </w:r>
-      <w:r>
-        <w:rPr>
-          <w:rFonts w:ascii="Arial" w:hAnsi="Arial"/>
-        </w:rPr>
-        <w:t xml:space="preserve"> (002). Đỉnh Cellulose I (</w:t>
-      </w:r>
-      <w:r>
-        <w:rPr>
-          <w:rFonts w:ascii="Georgia" w:hAnsi="Georgia"/>
-          <w:i w:val="0"/>
-          <w:color w:val="1B365D"/>
-        </w:rPr>
-        <w:t>22.23</w:t>
-      </w:r>
-      <w:r>
-        <w:rPr>
-          <w:rFonts w:ascii="Georgia" w:hAnsi="Georgia"/>
-          <w:color w:val="1B365D"/>
-          <w:vertAlign w:val="superscript"/>
-        </w:rPr>
-        <w:t>\</w:t>
-      </w:r>
-      <w:r>
-        <w:rPr>
-          <w:rFonts w:ascii="Georgia" w:hAnsi="Georgia"/>
-          <w:i w:val="0"/>
-          <w:color w:val="1B365D"/>
-        </w:rPr>
-        <w:t>circ</w:t>
+        <w:t>22.23°</w:t>
       </w:r>
       <w:r>
         <w:rPr>
@@ -6206,23 +5710,7 @@
           <w:i w:val="0"/>
           <w:color w:val="1B365D"/>
         </w:rPr>
-        <w:t>4</w:t>
-      </w:r>
-      <w:r>
-        <w:rPr>
-          <w:rFonts w:ascii="Georgia" w:hAnsi="Georgia"/>
-          <w:color w:val="1B365D"/>
-          <w:vertAlign w:val="superscript"/>
-        </w:rPr>
-        <w:t>\</w:t>
-      </w:r>
-      <w:r>
-        <w:rPr>
-          <w:rFonts w:ascii="Georgia" w:hAnsi="Georgia"/>
-          <w:i w:val="0"/>
-          <w:color w:val="1B365D"/>
-        </w:rPr>
-        <w:t>circC</w:t>
+        <w:t>4°C</w:t>
       </w:r>
       <w:r>
         <w:rPr>
@@ -6418,23 +5906,7 @@
           <w:i w:val="0"/>
           <w:color w:val="1B365D"/>
         </w:rPr>
-        <w:t>0 - 5</w:t>
-      </w:r>
-      <w:r>
-        <w:rPr>
-          <w:rFonts w:ascii="Georgia" w:hAnsi="Georgia"/>
-          <w:color w:val="1B365D"/>
-          <w:vertAlign w:val="superscript"/>
-        </w:rPr>
-        <w:t>\</w:t>
-      </w:r>
-      <w:r>
-        <w:rPr>
-          <w:rFonts w:ascii="Georgia" w:hAnsi="Georgia"/>
-          <w:i w:val="0"/>
-          <w:color w:val="1B365D"/>
-        </w:rPr>
-        <w:t>circC</w:t>
+        <w:t>0 - 5°C</w:t>
       </w:r>
       <w:r>
         <w:rPr>
@@ -6486,23 +5958,7 @@
           <w:i w:val="0"/>
           <w:color w:val="1B365D"/>
         </w:rPr>
-        <w:t>4</w:t>
-      </w:r>
-      <w:r>
-        <w:rPr>
-          <w:rFonts w:ascii="Georgia" w:hAnsi="Georgia"/>
-          <w:color w:val="1B365D"/>
-          <w:vertAlign w:val="superscript"/>
-        </w:rPr>
-        <w:t>\</w:t>
-      </w:r>
-      <w:r>
-        <w:rPr>
-          <w:rFonts w:ascii="Georgia" w:hAnsi="Georgia"/>
-          <w:i w:val="0"/>
-          <w:color w:val="1B365D"/>
-        </w:rPr>
-        <w:t>circC</w:t>
+        <w:t>4°C</w:t>
       </w:r>
       <w:r>
         <w:rPr>
@@ -6757,23 +6213,7 @@
           <w:i w:val="0"/>
           <w:color w:val="1B365D"/>
         </w:rPr>
-        <w:t>-196</w:t>
-      </w:r>
-      <w:r>
-        <w:rPr>
-          <w:rFonts w:ascii="Georgia" w:hAnsi="Georgia"/>
-          <w:color w:val="1B365D"/>
-          <w:vertAlign w:val="superscript"/>
-        </w:rPr>
-        <w:t>\</w:t>
-      </w:r>
-      <w:r>
-        <w:rPr>
-          <w:rFonts w:ascii="Georgia" w:hAnsi="Georgia"/>
-          <w:i w:val="0"/>
-          <w:color w:val="1B365D"/>
-        </w:rPr>
-        <w:t>circC</w:t>
+        <w:t>-196°C</w:t>
       </w:r>
       <w:r>
         <w:rPr>
@@ -6848,23 +6288,7 @@
           <w:i w:val="0"/>
           <w:color w:val="1B365D"/>
         </w:rPr>
-        <w:t>-80</w:t>
-      </w:r>
-      <w:r>
-        <w:rPr>
-          <w:rFonts w:ascii="Georgia" w:hAnsi="Georgia"/>
-          <w:color w:val="1B365D"/>
-          <w:vertAlign w:val="superscript"/>
-        </w:rPr>
-        <w:t>\</w:t>
-      </w:r>
-      <w:r>
-        <w:rPr>
-          <w:rFonts w:ascii="Georgia" w:hAnsi="Georgia"/>
-          <w:i w:val="0"/>
-          <w:color w:val="1B365D"/>
-        </w:rPr>
-        <w:t>circC</w:t>
+        <w:t>-80°C</w:t>
       </w:r>
       <w:r>
         <w:rPr>
@@ -7027,7 +6451,7 @@
           <w:i w:val="0"/>
           <w:color w:val="1B365D"/>
         </w:rPr>
-        <w:t>&lt; 12\%</w:t>
+        <w:t>&lt; 12%</w:t>
       </w:r>
       <w:r>
         <w:rPr>
@@ -7066,7 +6490,7 @@
           <w:i w:val="0"/>
           <w:color w:val="1B365D"/>
         </w:rPr>
-        <w:t>≥ 20\%</w:t>
+        <w:t>≥ 20%</w:t>
       </w:r>
       <w:r>
         <w:rPr>
@@ -7229,7 +6653,7 @@
           <w:i w:val="0"/>
           <w:color w:val="1B365D"/>
         </w:rPr>
-        <w:t>99.99\%</w:t>
+        <w:t>99.99%</w:t>
       </w:r>
       <w:r>
         <w:rPr>
@@ -7326,39 +6750,7 @@
           <w:i w:val="0"/>
           <w:color w:val="1B365D"/>
         </w:rPr>
-        <w:t>25</w:t>
-      </w:r>
-      <w:r>
-        <w:rPr>
-          <w:rFonts w:ascii="Georgia" w:hAnsi="Georgia"/>
-          <w:color w:val="1B365D"/>
-          <w:vertAlign w:val="superscript"/>
-        </w:rPr>
-        <w:t>\</w:t>
-      </w:r>
-      <w:r>
-        <w:rPr>
-          <w:rFonts w:ascii="Georgia" w:hAnsi="Georgia"/>
-          <w:i w:val="0"/>
-          <w:color w:val="1B365D"/>
-        </w:rPr>
-        <w:t>circC \rightarrow 150</w:t>
-      </w:r>
-      <w:r>
-        <w:rPr>
-          <w:rFonts w:ascii="Georgia" w:hAnsi="Georgia"/>
-          <w:color w:val="1B365D"/>
-          <w:vertAlign w:val="superscript"/>
-        </w:rPr>
-        <w:t>\</w:t>
-      </w:r>
-      <w:r>
-        <w:rPr>
-          <w:rFonts w:ascii="Georgia" w:hAnsi="Georgia"/>
-          <w:i w:val="0"/>
-          <w:color w:val="1B365D"/>
-        </w:rPr>
-        <w:t>circC</w:t>
+        <w:t>25°C → 150°C</w:t>
       </w:r>
       <w:r>
         <w:rPr>
@@ -7397,39 +6789,7 @@
           <w:i w:val="0"/>
           <w:color w:val="1B365D"/>
         </w:rPr>
-        <w:t>150</w:t>
-      </w:r>
-      <w:r>
-        <w:rPr>
-          <w:rFonts w:ascii="Georgia" w:hAnsi="Georgia"/>
-          <w:color w:val="1B365D"/>
-          <w:vertAlign w:val="superscript"/>
-        </w:rPr>
-        <w:t>\</w:t>
-      </w:r>
-      <w:r>
-        <w:rPr>
-          <w:rFonts w:ascii="Georgia" w:hAnsi="Georgia"/>
-          <w:i w:val="0"/>
-          <w:color w:val="1B365D"/>
-        </w:rPr>
-        <w:t>circC \rightarrow 400</w:t>
-      </w:r>
-      <w:r>
-        <w:rPr>
-          <w:rFonts w:ascii="Georgia" w:hAnsi="Georgia"/>
-          <w:color w:val="1B365D"/>
-          <w:vertAlign w:val="superscript"/>
-        </w:rPr>
-        <w:t>\</w:t>
-      </w:r>
-      <w:r>
-        <w:rPr>
-          <w:rFonts w:ascii="Georgia" w:hAnsi="Georgia"/>
-          <w:i w:val="0"/>
-          <w:color w:val="1B365D"/>
-        </w:rPr>
-        <w:t>circC</w:t>
+        <w:t>150°C → 400°C</w:t>
       </w:r>
       <w:r>
         <w:rPr>
@@ -7468,23 +6828,7 @@
           <w:i w:val="0"/>
           <w:color w:val="1B365D"/>
         </w:rPr>
-        <w:t>400</w:t>
-      </w:r>
-      <w:r>
-        <w:rPr>
-          <w:rFonts w:ascii="Georgia" w:hAnsi="Georgia"/>
-          <w:color w:val="1B365D"/>
-          <w:vertAlign w:val="superscript"/>
-        </w:rPr>
-        <w:t>\</w:t>
-      </w:r>
-      <w:r>
-        <w:rPr>
-          <w:rFonts w:ascii="Georgia" w:hAnsi="Georgia"/>
-          <w:i w:val="0"/>
-          <w:color w:val="1B365D"/>
-        </w:rPr>
-        <w:t>circC \rightarrow T</w:t>
+        <w:t>400°C → T</w:t>
       </w:r>
       <w:r>
         <w:rPr>
@@ -8035,15 +7379,13 @@
           <w:i w:val="0"/>
           <w:color w:val="1B365D"/>
         </w:rPr>
-        <w:t>60</w:t>
-      </w:r>
-      <w:r>
-        <w:rPr>
-          <w:rFonts w:ascii="Georgia" w:hAnsi="Georgia"/>
-          <w:color w:val="1B365D"/>
-          <w:vertAlign w:val="superscript"/>
-        </w:rPr>
-        <w:t>\</w:t>
+        <w:t>60°C</w:t>
+      </w:r>
+      <w:r>
+        <w:rPr>
+          <w:rFonts w:ascii="Arial" w:hAnsi="Arial"/>
+        </w:rPr>
+        <w:t xml:space="preserve">) cho đến khi nước rửa đạt </w:t>
       </w:r>
       <w:r>
         <w:rPr>
@@ -8051,13 +7393,13 @@
           <w:i w:val="0"/>
           <w:color w:val="1B365D"/>
         </w:rPr>
-        <w:t>circC</w:t>
-      </w:r>
-      <w:r>
-        <w:rPr>
-          <w:rFonts w:ascii="Arial" w:hAnsi="Arial"/>
-        </w:rPr>
-        <w:t xml:space="preserve">) cho đến khi nước rửa đạt </w:t>
+        <w:t>pH ≈ 7.0</w:t>
+      </w:r>
+      <w:r>
+        <w:rPr>
+          <w:rFonts w:ascii="Arial" w:hAnsi="Arial"/>
+        </w:rPr>
+        <w:t xml:space="preserve">. Sấy khô bột ở </w:t>
       </w:r>
       <w:r>
         <w:rPr>
@@ -8065,37 +7407,7 @@
           <w:i w:val="0"/>
           <w:color w:val="1B365D"/>
         </w:rPr>
-        <w:t>pH ≈ 7.0</w:t>
-      </w:r>
-      <w:r>
-        <w:rPr>
-          <w:rFonts w:ascii="Arial" w:hAnsi="Arial"/>
-        </w:rPr>
-        <w:t xml:space="preserve">. Sấy khô bột ở </w:t>
-      </w:r>
-      <w:r>
-        <w:rPr>
-          <w:rFonts w:ascii="Georgia" w:hAnsi="Georgia"/>
-          <w:i w:val="0"/>
-          <w:color w:val="1B365D"/>
-        </w:rPr>
-        <w:t>80</w:t>
-      </w:r>
-      <w:r>
-        <w:rPr>
-          <w:rFonts w:ascii="Georgia" w:hAnsi="Georgia"/>
-          <w:color w:val="1B365D"/>
-          <w:vertAlign w:val="superscript"/>
-        </w:rPr>
-        <w:t>\</w:t>
-      </w:r>
-      <w:r>
-        <w:rPr>
-          <w:rFonts w:ascii="Georgia" w:hAnsi="Georgia"/>
-          <w:i w:val="0"/>
-          <w:color w:val="1B365D"/>
-        </w:rPr>
-        <w:t>circC</w:t>
+        <w:t>80°C</w:t>
       </w:r>
       <w:r>
         <w:rPr>
@@ -8192,23 +7504,7 @@
           <w:i w:val="0"/>
           <w:color w:val="1B365D"/>
         </w:rPr>
-        <w:t>5</w:t>
-      </w:r>
-      <w:r>
-        <w:rPr>
-          <w:rFonts w:ascii="Georgia" w:hAnsi="Georgia"/>
-          <w:color w:val="1B365D"/>
-          <w:vertAlign w:val="superscript"/>
-        </w:rPr>
-        <w:t>\</w:t>
-      </w:r>
-      <w:r>
-        <w:rPr>
-          <w:rFonts w:ascii="Georgia" w:hAnsi="Georgia"/>
-          <w:i w:val="0"/>
-          <w:color w:val="1B365D"/>
-        </w:rPr>
-        <w:t>circC/phút</w:t>
+        <w:t>5°C/phút</w:t>
       </w:r>
       <w:r>
         <w:rPr>
@@ -8283,23 +7579,7 @@
           <w:i w:val="0"/>
           <w:color w:val="1B365D"/>
         </w:rPr>
-        <w:t>&lt;50</w:t>
-      </w:r>
-      <w:r>
-        <w:rPr>
-          <w:rFonts w:ascii="Georgia" w:hAnsi="Georgia"/>
-          <w:color w:val="1B365D"/>
-          <w:vertAlign w:val="superscript"/>
-        </w:rPr>
-        <w:t>\</w:t>
-      </w:r>
-      <w:r>
-        <w:rPr>
-          <w:rFonts w:ascii="Georgia" w:hAnsi="Georgia"/>
-          <w:i w:val="0"/>
-          <w:color w:val="1B365D"/>
-        </w:rPr>
-        <w:t>circC</w:t>
+        <w:t>&lt;50°C</w:t>
       </w:r>
       <w:r>
         <w:rPr>
@@ -8393,7 +7673,7 @@
           <w:i w:val="0"/>
           <w:color w:val="1B365D"/>
         </w:rPr>
-        <w:t>\alpha-Fe</w:t>
+        <w:t>α-Fe</w:t>
       </w:r>
       <w:r>
         <w:rPr>
@@ -8407,15 +7687,13 @@
           <w:i w:val="0"/>
           <w:color w:val="1B365D"/>
         </w:rPr>
-        <w:t>2\theta ≈ 44.7</w:t>
-      </w:r>
-      <w:r>
-        <w:rPr>
-          <w:rFonts w:ascii="Georgia" w:hAnsi="Georgia"/>
-          <w:color w:val="1B365D"/>
-          <w:vertAlign w:val="superscript"/>
-        </w:rPr>
-        <w:t>\</w:t>
+        <w:t>2θ ≈ 44.7°</w:t>
+      </w:r>
+      <w:r>
+        <w:rPr>
+          <w:rFonts w:ascii="Arial" w:hAnsi="Arial"/>
+        </w:rPr>
+        <w:t xml:space="preserve">) và sắt carbide </w:t>
       </w:r>
       <w:r>
         <w:rPr>
@@ -8423,13 +7701,15 @@
           <w:i w:val="0"/>
           <w:color w:val="1B365D"/>
         </w:rPr>
-        <w:t>circ</w:t>
-      </w:r>
-      <w:r>
-        <w:rPr>
-          <w:rFonts w:ascii="Arial" w:hAnsi="Arial"/>
-        </w:rPr>
-        <w:t xml:space="preserve">) và sắt carbide </w:t>
+        <w:t>Fe</w:t>
+      </w:r>
+      <w:r>
+        <w:rPr>
+          <w:rFonts w:ascii="Georgia" w:hAnsi="Georgia"/>
+          <w:color w:val="1B365D"/>
+          <w:vertAlign w:val="subscript"/>
+        </w:rPr>
+        <w:t>3</w:t>
       </w:r>
       <w:r>
         <w:rPr>
@@ -8437,15 +7717,13 @@
           <w:i w:val="0"/>
           <w:color w:val="1B365D"/>
         </w:rPr>
-        <w:t>Fe</w:t>
-      </w:r>
-      <w:r>
-        <w:rPr>
-          <w:rFonts w:ascii="Georgia" w:hAnsi="Georgia"/>
-          <w:color w:val="1B365D"/>
-          <w:vertAlign w:val="subscript"/>
-        </w:rPr>
-        <w:t>3</w:t>
+        <w:t>C</w:t>
+      </w:r>
+      <w:r>
+        <w:rPr>
+          <w:rFonts w:ascii="Arial" w:hAnsi="Arial"/>
+        </w:rPr>
+        <w:t xml:space="preserve"> (</w:t>
       </w:r>
       <w:r>
         <w:rPr>
@@ -8453,37 +7731,7 @@
           <w:i w:val="0"/>
           <w:color w:val="1B365D"/>
         </w:rPr>
-        <w:t>C</w:t>
-      </w:r>
-      <w:r>
-        <w:rPr>
-          <w:rFonts w:ascii="Arial" w:hAnsi="Arial"/>
-        </w:rPr>
-        <w:t xml:space="preserve"> (</w:t>
-      </w:r>
-      <w:r>
-        <w:rPr>
-          <w:rFonts w:ascii="Georgia" w:hAnsi="Georgia"/>
-          <w:i w:val="0"/>
-          <w:color w:val="1B365D"/>
-        </w:rPr>
-        <w:t>2\theta ≈ 43.9</w:t>
-      </w:r>
-      <w:r>
-        <w:rPr>
-          <w:rFonts w:ascii="Georgia" w:hAnsi="Georgia"/>
-          <w:color w:val="1B365D"/>
-          <w:vertAlign w:val="superscript"/>
-        </w:rPr>
-        <w:t>\</w:t>
-      </w:r>
-      <w:r>
-        <w:rPr>
-          <w:rFonts w:ascii="Georgia" w:hAnsi="Georgia"/>
-          <w:i w:val="0"/>
-          <w:color w:val="1B365D"/>
-        </w:rPr>
-        <w:t>circ</w:t>
+        <w:t>2θ ≈ 43.9°</w:t>
       </w:r>
       <w:r>
         <w:rPr>
@@ -9207,7 +8455,7 @@
           <w:i w:val="0"/>
           <w:color w:val="1B365D"/>
         </w:rPr>
-        <w:t>1 vol\%</w:t>
+        <w:t>1 vol%</w:t>
       </w:r>
       <w:r>
         <w:rPr>
@@ -9392,23 +8640,7 @@
           <w:i w:val="0"/>
           <w:color w:val="1B365D"/>
         </w:rPr>
-        <w:t>25</w:t>
-      </w:r>
-      <w:r>
-        <w:rPr>
-          <w:rFonts w:ascii="Georgia" w:hAnsi="Georgia"/>
-          <w:color w:val="1B365D"/>
-          <w:vertAlign w:val="superscript"/>
-        </w:rPr>
-        <w:t>\</w:t>
-      </w:r>
-      <w:r>
-        <w:rPr>
-          <w:rFonts w:ascii="Georgia" w:hAnsi="Georgia"/>
-          <w:i w:val="0"/>
-          <w:color w:val="1B365D"/>
-        </w:rPr>
-        <w:t>circC</w:t>
+        <w:t>25°C</w:t>
       </w:r>
       <w:r>
         <w:rPr>
@@ -11969,7 +11201,7 @@
                 <w:rFonts w:ascii="Arial" w:hAnsi="Arial"/>
                 <w:b/>
               </w:rPr>
-              <w:t>$5\text{ mV$</w:t>
+              <w:t>$5\text{ mV}$</w:t>
             </w:r>
             <w:r>
               <w:rPr>
@@ -12547,7 +11779,7 @@
           <w:i w:val="0"/>
           <w:color w:val="1B365D"/>
         </w:rPr>
-        <w:t>-1.0 V \rightarrow 0.0 V</w:t>
+        <w:t>-1.0 V → 0.0 V</w:t>
       </w:r>
       <w:r>
         <w:rPr>
@@ -14192,7 +13424,7 @@
                 <w:i w:val="0"/>
                 <w:color w:val="1B365D"/>
               </w:rPr>
-              <w:t>\alpha-Fe</w:t>
+              <w:t>α-Fe</w:t>
             </w:r>
             <w:r>
               <w:rPr>
@@ -14206,15 +13438,13 @@
                 <w:i w:val="0"/>
                 <w:color w:val="1B365D"/>
               </w:rPr>
-              <w:t>44.7</w:t>
-            </w:r>
-            <w:r>
-              <w:rPr>
-                <w:rFonts w:ascii="Georgia" w:hAnsi="Georgia"/>
-                <w:color w:val="1B365D"/>
-                <w:vertAlign w:val="superscript"/>
-              </w:rPr>
-              <w:t>\</w:t>
+              <w:t>44.7°</w:t>
+            </w:r>
+            <w:r>
+              <w:rPr>
+                <w:rFonts w:ascii="Arial" w:hAnsi="Arial"/>
+              </w:rPr>
+              <w:t xml:space="preserve">) hoặc </w:t>
             </w:r>
             <w:r>
               <w:rPr>
@@ -14222,13 +13452,15 @@
                 <w:i w:val="0"/>
                 <w:color w:val="1B365D"/>
               </w:rPr>
-              <w:t>circ</w:t>
-            </w:r>
-            <w:r>
-              <w:rPr>
-                <w:rFonts w:ascii="Arial" w:hAnsi="Arial"/>
-              </w:rPr>
-              <w:t xml:space="preserve">) hoặc </w:t>
+              <w:t>Fe</w:t>
+            </w:r>
+            <w:r>
+              <w:rPr>
+                <w:rFonts w:ascii="Georgia" w:hAnsi="Georgia"/>
+                <w:color w:val="1B365D"/>
+                <w:vertAlign w:val="subscript"/>
+              </w:rPr>
+              <w:t>3</w:t>
             </w:r>
             <w:r>
               <w:rPr>
@@ -14236,15 +13468,13 @@
                 <w:i w:val="0"/>
                 <w:color w:val="1B365D"/>
               </w:rPr>
-              <w:t>Fe</w:t>
-            </w:r>
-            <w:r>
-              <w:rPr>
-                <w:rFonts w:ascii="Georgia" w:hAnsi="Georgia"/>
-                <w:color w:val="1B365D"/>
-                <w:vertAlign w:val="subscript"/>
-              </w:rPr>
-              <w:t>3</w:t>
+              <w:t>C</w:t>
+            </w:r>
+            <w:r>
+              <w:rPr>
+                <w:rFonts w:ascii="Arial" w:hAnsi="Arial"/>
+              </w:rPr>
+              <w:t xml:space="preserve"> (</w:t>
             </w:r>
             <w:r>
               <w:rPr>
@@ -14252,37 +13482,7 @@
                 <w:i w:val="0"/>
                 <w:color w:val="1B365D"/>
               </w:rPr>
-              <w:t>C</w:t>
-            </w:r>
-            <w:r>
-              <w:rPr>
-                <w:rFonts w:ascii="Arial" w:hAnsi="Arial"/>
-              </w:rPr>
-              <w:t xml:space="preserve"> (</w:t>
-            </w:r>
-            <w:r>
-              <w:rPr>
-                <w:rFonts w:ascii="Georgia" w:hAnsi="Georgia"/>
-                <w:i w:val="0"/>
-                <w:color w:val="1B365D"/>
-              </w:rPr>
-              <w:t>43.9</w:t>
-            </w:r>
-            <w:r>
-              <w:rPr>
-                <w:rFonts w:ascii="Georgia" w:hAnsi="Georgia"/>
-                <w:color w:val="1B365D"/>
-                <w:vertAlign w:val="superscript"/>
-              </w:rPr>
-              <w:t>\</w:t>
-            </w:r>
-            <w:r>
-              <w:rPr>
-                <w:rFonts w:ascii="Georgia" w:hAnsi="Georgia"/>
-                <w:i w:val="0"/>
-                <w:color w:val="1B365D"/>
-              </w:rPr>
-              <w:t>circ</w:t>
+              <w:t>43.9°</w:t>
             </w:r>
             <w:r>
               <w:rPr>
@@ -14437,7 +13637,7 @@
                 <w:i w:val="0"/>
                 <w:color w:val="1B365D"/>
               </w:rPr>
-              <w:t>&lt; 2.0 at\%</w:t>
+              <w:t>&lt; 2.0 at%</w:t>
             </w:r>
             <w:r>
               <w:rPr>
@@ -14451,7 +13651,7 @@
                 <w:i w:val="0"/>
                 <w:color w:val="1B365D"/>
               </w:rPr>
-              <w:t>&gt; 2.0 at\%</w:t>
+              <w:t>&gt; 2.0 at%</w:t>
             </w:r>
             <w:r>
               <w:rPr>
@@ -14762,7 +13962,7 @@
                 <w:i w:val="0"/>
                 <w:color w:val="1B365D"/>
               </w:rPr>
-              <w:t>&lt; 25\%</w:t>
+              <w:t>&lt; 25%</w:t>
             </w:r>
             <w:r>
               <w:rPr>
@@ -15154,15 +14354,13 @@
           <w:i w:val="0"/>
           <w:color w:val="1B365D"/>
         </w:rPr>
-        <w:t>80</w:t>
-      </w:r>
-      <w:r>
-        <w:rPr>
-          <w:rFonts w:ascii="Georgia" w:hAnsi="Georgia"/>
-          <w:color w:val="1B365D"/>
-          <w:vertAlign w:val="superscript"/>
-        </w:rPr>
-        <w:t>\</w:t>
+        <w:t>80°C</w:t>
+      </w:r>
+      <w:r>
+        <w:rPr>
+          <w:rFonts w:ascii="Arial" w:hAnsi="Arial"/>
+        </w:rPr>
+        <w:t xml:space="preserve"> trong </w:t>
       </w:r>
       <w:r>
         <w:rPr>
@@ -15170,13 +14368,13 @@
           <w:i w:val="0"/>
           <w:color w:val="1B365D"/>
         </w:rPr>
-        <w:t>circC</w:t>
-      </w:r>
-      <w:r>
-        <w:rPr>
-          <w:rFonts w:ascii="Arial" w:hAnsi="Arial"/>
-        </w:rPr>
-        <w:t xml:space="preserve"> trong </w:t>
+        <w:t>8 giờ</w:t>
+      </w:r>
+      <w:r>
+        <w:rPr>
+          <w:rFonts w:ascii="Arial" w:hAnsi="Arial"/>
+        </w:rPr>
+        <w:t xml:space="preserve"> và nung annealing lần 2 ở </w:t>
       </w:r>
       <w:r>
         <w:rPr>
@@ -15184,37 +14382,7 @@
           <w:i w:val="0"/>
           <w:color w:val="1B365D"/>
         </w:rPr>
-        <w:t>8 giờ</w:t>
-      </w:r>
-      <w:r>
-        <w:rPr>
-          <w:rFonts w:ascii="Arial" w:hAnsi="Arial"/>
-        </w:rPr>
-        <w:t xml:space="preserve"> và nung annealing lần 2 ở </w:t>
-      </w:r>
-      <w:r>
-        <w:rPr>
-          <w:rFonts w:ascii="Georgia" w:hAnsi="Georgia"/>
-          <w:i w:val="0"/>
-          <w:color w:val="1B365D"/>
-        </w:rPr>
-        <w:t>800</w:t>
-      </w:r>
-      <w:r>
-        <w:rPr>
-          <w:rFonts w:ascii="Georgia" w:hAnsi="Georgia"/>
-          <w:color w:val="1B365D"/>
-          <w:vertAlign w:val="superscript"/>
-        </w:rPr>
-        <w:t>\</w:t>
-      </w:r>
-      <w:r>
-        <w:rPr>
-          <w:rFonts w:ascii="Georgia" w:hAnsi="Georgia"/>
-          <w:i w:val="0"/>
-          <w:color w:val="1B365D"/>
-        </w:rPr>
-        <w:t>circC</w:t>
+        <w:t>800°C</w:t>
       </w:r>
       <w:r>
         <w:rPr>

</xml_diff>

<commit_message>
feat: add SOP documents and update reference materials dashboard statistics
</commit_message>
<xml_diff>
--- a/1 SOPs/Final_SOPs_CA.docx
+++ b/1 SOPs/Final_SOPs_CA.docx
@@ -5427,7 +5427,7 @@
           <w:i/>
           <w:sz w:val="24"/>
         </w:rPr>
-        <w:t>3. Thiết lập quy trình đo riêng lẻ Thủy ngân (Hg²⁺)</w:t>
+        <w:t>3. Thiết lập quy trình đo riêng lẻ Thủy ngân (Hg²⁺) và Thạch tín (As³⁺)</w:t>
       </w:r>
     </w:p>
     <w:p>
@@ -5443,7 +5443,7 @@
         <w:t>Dung dịch điện ly nền:</w:t>
       </w:r>
       <w:r>
-        <w:t xml:space="preserve"> Đệm Acetate 0.1 M, pH = 4.5.</w:t>
+        <w:t xml:space="preserve"> Đệm Acetate 0.1 M, pH = 4.5 (cho Hg²⁺) hoặc đệm H₂SO₄ loãng (cho As³⁺).</w:t>
       </w:r>
     </w:p>
     <w:p>
@@ -5456,7 +5456,7 @@
         <w:rPr>
           <w:b/>
         </w:rPr>
-        <w:t>Quy trình đo đơn Hg²⁺:</w:t>
+        <w:t>Quy trình đo đơn Hg²⁺ / As³⁺:</w:t>
       </w:r>
     </w:p>
     <w:p>
@@ -5472,7 +5472,7 @@
         <w:rPr>
           <w:b/>
         </w:rPr>
-        <w:t>E_dep = -0.20V vs. Ag/AgCl</w:t>
+        <w:t>E_dep = -0.20V đến -0.40V vs. Ag/AgCl</w:t>
       </w:r>
       <w:r>
         <w:t xml:space="preserve"> trong thời gian </w:t>
@@ -5481,7 +5481,7 @@
         <w:rPr>
           <w:b/>
         </w:rPr>
-        <w:t>120 giây</w:t>
+        <w:t>120 - 180 giây</w:t>
       </w:r>
       <w:r>
         <w:t xml:space="preserve"> (tránh phản ứng phụ giải phóng hydro HER phá hỏng màng).</w:t>
@@ -5513,13 +5513,67 @@
         <w:t>0.0V đến +0.6V</w:t>
       </w:r>
       <w:r>
-        <w:t xml:space="preserve"> vs. Ag/AgCl. Peak hòa tan xuất hiện tại </w:t>
-      </w:r>
+        <w:t xml:space="preserve"> vs. Ag/AgCl.</w:t>
+      </w:r>
+    </w:p>
+    <w:p>
+      <w:pPr>
+        <w:pStyle w:val="ListBullet"/>
+        <w:spacing w:after="60"/>
+        <w:ind w:left="360"/>
+      </w:pPr>
       <w:r>
         <w:rPr>
           <w:b/>
         </w:rPr>
-        <w:t>≈ +0.25V</w:t>
+        <w:t>Thế hiệu đỉnh hòa tan đặc trưng:</w:t>
+      </w:r>
+    </w:p>
+    <w:p>
+      <w:pPr>
+        <w:pStyle w:val="ListBullet"/>
+        <w:spacing w:after="60"/>
+        <w:ind w:left="360"/>
+      </w:pPr>
+      <w:r>
+        <w:rPr>
+          <w:b/>
+        </w:rPr>
+        <w:t>Thạch tín (As³⁺):</w:t>
+      </w:r>
+      <w:r>
+        <w:t xml:space="preserve"> Xuất hiện tại </w:t>
+      </w:r>
+      <w:r>
+        <w:rPr>
+          <w:b/>
+        </w:rPr>
+        <w:t>≈ +0.15V đến +0.20V</w:t>
+      </w:r>
+      <w:r>
+        <w:t>.</w:t>
+      </w:r>
+    </w:p>
+    <w:p>
+      <w:pPr>
+        <w:pStyle w:val="ListBullet"/>
+        <w:spacing w:after="60"/>
+        <w:ind w:left="360"/>
+      </w:pPr>
+      <w:r>
+        <w:rPr>
+          <w:b/>
+        </w:rPr>
+        <w:t>Thủy ngân (Hg²⁺):</w:t>
+      </w:r>
+      <w:r>
+        <w:t xml:space="preserve"> Xuất hiện tại </w:t>
+      </w:r>
+      <w:r>
+        <w:rPr>
+          <w:b/>
+        </w:rPr>
+        <w:t>≈ +0.25V đến +0.30V</w:t>
       </w:r>
       <w:r>
         <w:t>.</w:t>

</xml_diff>